<commit_message>
Artigo: data de acesso da lista, definição de empresa; relatório registra o que veio do licc.gov
Co-Authored-By: Claude Opus 5.5 <noreply@anthropic.com>
Claude-Session: https://claude.ai/code/session_01XEaG1GvUXhdfnXot6AtJxa
</commit_message>
<xml_diff>
--- a/artigo/rascunho-artigo.docx
+++ b/artigo/rascunho-artigo.docx
@@ -41,7 +41,7 @@
         <w:t xml:space="preserve"> </w:t>
       </w:r>
       <w:r>
-        <w:t xml:space="preserve">A Lei de Incentivo à Cultura Capixaba (LICC) permite que contribuintes do ICMS destinem a projetos culturais habilitados pela Secretaria da Cultura (SECULT) valores que recuperam integralmente como crédito presumido do imposto. Este artigo avalia o desenho da política como ela está e propõe uma avaliação de impacto. Com os anexos oficiais de 463 projetos habilitados entre 2022 e 2026 e da captação de 2025, mostramos que a política não declara problema, metas nem indicadores; que a demanda habilitada supera o teto anual de renúncia e o racionamento é feito pelas empresas patrocinadoras; que a captação favorece projetos que pedem o teto por projeto, proponentes recorrentes e a Região Metropolitana da Grande Vitória, onde fica 67% do valor atribuível a um município; e que duas empresas respondem por metade da renúncia de 2025. Propomos um desenho de diferenças em diferenças com adoção escalonada, no nível do proponente, que compara projetos habilitados em 2022-2024 que captaram com os que não captaram, e mostramos que o universo disponível detecta efeitos a partir de 0,25 a 0,45 desvio-padrão.</w:t>
+        <w:t xml:space="preserve">A Lei de Incentivo à Cultura Capixaba (LICC) permite que contribuintes do ICMS destinem a projetos culturais habilitados pela Secretaria da Cultura (SECULT) valores que recuperam integralmente como crédito presumido do imposto. Este artigo avalia o desenho da política como ela está e propõe uma avaliação de impacto. Com os anexos oficiais de 463 projetos habilitados entre 2022 e 2026 e da captação de 2025, mostramos que a política não declara problema, metas nem indicadores; que a demanda habilitada supera o teto anual de renúncia e o racionamento é feito pelas empresas patrocinadoras; que a captação favorece projetos que pedem o teto por projeto e proponentes recorrentes; que o valor habilitado se concentra na Região Metropolitana da Grande Vitória, onde fica 67% do valor atribuível a um município; e que duas empresas respondem por metade da renúncia de 2025. Propomos um desenho de diferenças em diferenças com adoção escalonada, no nível do proponente, que compara projetos habilitados em 2022-2024 que captaram com os que não captaram, e mostramos que o universo disponível detecta efeitos a partir de 0,25 a 0,45 desvio-padrão.</w:t>
       </w:r>
     </w:p>
     <w:p>
@@ -76,7 +76,7 @@
         <w:pStyle w:val="FirstParagraph"/>
       </w:pPr>
       <w:r>
-        <w:t xml:space="preserve">Em 2021, o Espírito Santo criou um mecanismo estadual de incentivo fiscal à cultura, descrito pela própria Secretaria da Cultura como iniciativa inédita no estado. A Lei estadual nº 11.246/2021 incluiu na lei do ICMS um crédito presumido igual ao valor que o contribuinte destina a projetos culturais credenciados pela SECULT, com efeitos a partir de 2022 (ESPÍRITO SANTO, 2021a). A Lei de Incentivo à Cultura Capixaba, como o mecanismo passou a ser chamado no regulamento (ESPÍRITO SANTO, 2021b), cresceu depressa: o teto anual de renúncia passou de R$ 10 milhões em 2022 para R$ 31 milhões em 2026, e 463 projetos foram habilitados a captar R$ 184 milhões nos cinco ciclos. Em 2025, 63 projetos captaram exatamente R$ 25.000.000,00, o teto do ano.</w:t>
+        <w:t xml:space="preserve">Em 2021, o Espírito Santo criou um mecanismo estadual de incentivo fiscal à cultura, descrito pela própria Secretaria da Cultura como iniciativa inédita no estado (SECULT, [202-]). A Lei estadual nº 11.246/2021 incluiu na lei do ICMS um crédito presumido igual ao valor que o contribuinte destina a projetos culturais credenciados pela SECULT, com efeitos a partir de 2022 (ESPÍRITO SANTO, 2021a). A Lei de Incentivo à Cultura Capixaba, como o mecanismo passou a ser chamado no regulamento (ESPÍRITO SANTO, 2021b), cresceu depressa: o teto anual de renúncia passou de R$ 10 milhões em 2022 para R$ 31 milhões em 2026, e 463 projetos foram habilitados a captar R$ 184 milhões nos cinco ciclos (459 com valor publicado). Em 2025, 63 projetos captaram exatamente R$ 25.000.000,00, o teto do ano.</w:t>
       </w:r>
       <w:r>
         <w:rPr>
@@ -90,7 +90,7 @@
         <w:pStyle w:val="BodyText"/>
       </w:pPr>
       <w:r>
-        <w:t xml:space="preserve">Nenhuma das normas da LICC diz qual problema ela enfrenta. O diagnóstico precisa ser reconstruído. O setor cultural capixaba é pequeno para o tamanho da economia do estado: em 2024, ocupava 4,2% dos trabalhadores do ES, contra 5,8% no país, a 18ª participação entre as 27 unidades da federação (IBGE, 2023). A desigualdade relevante, porém, é interna. Em 2021, 95% da população da Região Metropolitana da Grande Vitória (RMGV) vivia em município com cinema, contra 34% da população do interior; metade dos municípios do interior não tinha fundo municipal de cultura e só 16% tinham plano municipal (IBGE, 2022). Propomos, por isso, formular o problema como uma carência:</w:t>
+        <w:t xml:space="preserve">Nenhuma das normas da LICC diz qual problema ela enfrenta. O diagnóstico precisa ser reconstruído. O setor cultural capixaba é pequeno para o tamanho da economia do estado: em 2024, ocupava 4,2% dos trabalhadores do ES, contra 5,8% no país, a 18ª participação entre as 27 unidades da federação (IBGE, 2025). A desigualdade relevante, porém, é interna. Em 2021, 95% da população da Região Metropolitana da Grande Vitória (RMGV) vivia em município com cinema, contra 34% da população do interior; metade dos municípios do interior não tinha fundo municipal de cultura e só 16% tinham plano municipal (IBGE, 2022). Propomos, por isso, formular o problema como uma carência:</w:t>
       </w:r>
       <w:r>
         <w:t xml:space="preserve"> </w:t>
@@ -111,7 +111,7 @@
         <w:pStyle w:val="BodyText"/>
       </w:pPr>
       <w:r>
-        <w:t xml:space="preserve">Avaliar a LICC se justifica por três razões. Primeiro, é gasto público sem passar pelo orçamento: a renúncia equivale a 14% a 21% do gasto estadual direto na função cultura (Tabela 1). Segundo, quem decide o destino do recurso é a empresa patrocinadora, e não o Estado, o que torna a política exposta às críticas de concentração e de lógica de marketing feitas à Lei Rouanet (SILVA, 2017; DEKKER; RODRIGUES, 2019). Terceiro, a política é nova, muda de regra a cada ano e nunca foi avaliada: não localizamos nenhum estudo sobre ela.</w:t>
+        <w:t xml:space="preserve">Avaliar a LICC se justifica por três razões. Primeiro, é gasto público sem passar pelo orçamento: o teto de renúncia equivale a 14% a 21% do gasto estadual direto na função cultura em 2022-2025 (Tabela 1). Segundo, quem decide o destino do recurso é a empresa patrocinadora, e não o Estado, o que torna a política exposta às críticas de concentração e de lógica de marketing feitas à Lei Rouanet (SILVA, 2017; DEKKER; RODRIGUES, 2019). Terceiro, a política é nova, muda de regra a cada ano e nunca foi avaliada: não localizamos nenhum estudo sobre ela.</w:t>
       </w:r>
     </w:p>
     <w:p>
@@ -750,7 +750,7 @@
         <w:t xml:space="preserve">instabilidade</w:t>
       </w:r>
       <w:r>
-        <w:t xml:space="preserve">: a SECULT edita uma instrução normativa por ano e, alegando esgotamento do teto, fechou as inscrições no meio de 2024 e alterou o fluxo de habilitação no meio de 2025. Até maio de 2025, o parecer favorável gerava um certificado de aptidão e o proponente saía à procura de patrocinador. Desde então, o projeto só chega à comissão com uma carta de intenção de patrocínio (SECULT, 2025b). A terceira é a</w:t>
+        <w:t xml:space="preserve">: a SECULT edita uma instrução normativa por ano e, alegando esgotamento do teto, fechou as inscrições no meio de 2024 e alterou o fluxo de habilitação no meio de 2025 (SECULT, 2024; 2025b). Na instrução de 2025, o parecer favorável gerava um certificado de aptidão à captação, válido por um ano, com o qual o proponente procurava patrocinador; ao reunir termos de compromisso de ao menos 35% do valor, o projeto ia à comissão e seguia captando até o fim do prazo do certificado (SECULT, 2025a, arts. 41-45). Desde maio de 2025, o proponente tem 120 dias para apresentar uma carta de intenção de patrocínio, contados da comunicação da SECULT, sob pena de arquivamento (SECULT, 2025b). A terceira é a</w:t>
       </w:r>
       <w:r>
         <w:t xml:space="preserve"> </w:t>
@@ -818,7 +818,7 @@
         <w:t xml:space="preserve"> </w:t>
       </w:r>
       <w:r>
-        <w:t xml:space="preserve">A LICC reproduz o núcleo do mecenato federal, que acumula três décadas de crítica. Os estudos documentam concentração regional em São Paulo e no Rio de Janeiro, maior que a do PIB (SILVA, 2017; GUIMARÃES, 2020; TEIXEIRA; XAVIER; FARIA, 2024), concentração persistente de patrocinadores e proponentes (COSTA; MEDEIROS; BUCCO, 2017) e a formação de um</w:t>
+        <w:t xml:space="preserve">A LICC reproduz o núcleo do mecenato federal, que acumula três décadas de crítica. Os estudos documentam concentração regional no Sudeste, sobretudo em São Paulo e no Rio de Janeiro (SILVA, 2017; TEIXEIRA; XAVIER; FARIA, 2024), maior que a do PIB (GUIMARÃES, 2020), concentração persistente de patrocinadores e proponentes (COSTA; MEDEIROS; BUCCO, 2017) e a formação de um</w:t>
       </w:r>
       <w:r>
         <w:t xml:space="preserve"> </w:t>
@@ -830,7 +830,7 @@
         <w:t xml:space="preserve"> </w:t>
       </w:r>
       <w:r>
-        <w:t xml:space="preserve">com intermediários e departamentos de marketing (BELEM; DONADONE, 2013). Dekker e Rodrigues (2019) concluem que a lei beneficiou sobretudo projetos já bem-sucedidos e que não fica claro qual falha de mercado ela corrige. O Tribunal de Contas da União recomendou que as renúncias tenham objetivos, indicadores e metas (BRASIL, 2014) e que não financiem projetos capazes de atrair investimento privado sem incentivo (BRASIL, 2016). Silva (2017) oferece o contraponto: a concentração convive com uma cauda longa de projetos pequenos, e faltam estudos sobre o efeito no acesso da população. Os motivos das empresas vão além do mérito cultural: imagem, relações com a cadeia de fornecedores,</w:t>
+        <w:t xml:space="preserve">com intermediários e departamentos de marketing (BELEM; DONADONE, 2013). Dekker e Rodrigues (2019) concluem que a lei beneficiou sobretudo projetos já bem-sucedidos e que não fica claro qual falha de mercado ela corrige. O Tribunal de Contas da União recomendou que as ações financiadas por renúncias tenham objetivos, indicadores e metas (BRASIL, 2014) e determinou ao Ministério da Cultura que não autorizasse a captação por projetos com forte potencial lucrativo ou capacidade de atrair investimento privado suficiente (BRASIL, 2016). Silva (2017) oferece o contraponto: a concentração convive com uma cauda longa de projetos pequenos, e faltam estudos sobre o efeito no acesso da população. Os motivos das empresas vão além do mérito cultural: imagem, relações com a cadeia de fornecedores,</w:t>
       </w:r>
       <w:r>
         <w:t xml:space="preserve"> </w:t>
@@ -864,7 +864,7 @@
         <w:t xml:space="preserve"> </w:t>
       </w:r>
       <w:r>
-        <w:t xml:space="preserve">Não localizamos avaliação causal de incentivo cultural no Brasil, nem avaliação acadêmica de leis estaduais de incentivo via ICMS. O análogo internacional mais próximo em instrumento são os créditos estaduais à produção audiovisual nos Estados Unidos. As avaliações com adoção escalonada, variáveis instrumentais e controle sintético encontram efeitos pequenos e concentrados na atividade incentivada — mais filmagens de séries, pouco ou nenhum emprego adicional — e nenhum efeito macroeconômico (THOM, 2018; BUTTON, 2019; BRADBURY, 2020). Grandes eventos culturais têm efeitos agregados modestos ou transitórios (GOMES; LIBRERO-CANO, 2018; BRONZINI; MOCETTI; MONGARDINI, 2020). Sobre a interação entre recurso público e privado, os resultados variam de leve</w:t>
+        <w:t xml:space="preserve">Não localizamos avaliação causal de incentivo cultural no Brasil, nem avaliação acadêmica de leis estaduais de incentivo via ICMS. O análogo internacional mais próximo em instrumento são os créditos estaduais à produção audiovisual nos Estados Unidos. As avaliações com adoção escalonada e variáveis instrumentais encontram efeitos pequenos e concentrados na atividade incentivada — mais filmagens de séries, pouco ou nenhum emprego adicional — e nenhum efeito macroeconômico (THOM, 2018; BUTTON, 2019; BRADBURY, 2020). Com grandes eventos, os resultados variam: a Capital Europeia da Cultura elevou em 4,5% o PIB per capita das regiões das cidades-sede, com efeito que persiste por mais de cinco anos (GOMES; LIBRERO-CANO, 2018), enquanto o Jubileu de 2000 elevou só no curto prazo o valor adicionado de Roma, embora tenha aumentado a taxa de emprego (BRONZINI; MOCETTI; MONGARDINI, 2020). Sobre a interação entre recurso público e privado, os resultados variam de leve</w:t>
       </w:r>
       <w:r>
         <w:t xml:space="preserve"> </w:t>
@@ -880,7 +880,7 @@
         <w:t xml:space="preserve"> </w:t>
       </w:r>
       <w:r>
-        <w:t xml:space="preserve">a independência (SMITH, 2007; BORGONOVI; O’HARE, 2004). Duas lições servem à LICC. Os efeitos plausíveis são proximais e pequenos. E os desenhos críveis exploram candidatos não escolhidos como grupo de comparação: Gomes e Librero-Cano (2018) comparam cidades que sediaram a Capital Europeia da Cultura com cidades candidatas.</w:t>
+        <w:t xml:space="preserve">a independência (SMITH, 2007; BORGONOVI; O’HARE, 2004). Duas lições servem à LICC. Para instrumentos que financiam produções dispersas, e não um grande evento, os efeitos plausíveis são proximais e pequenos. E os desenhos críveis exploram candidatos não escolhidos como grupo de comparação: Gomes e Librero-Cano (2018) comparam cidades que sediaram a Capital Europeia da Cultura com cidades candidatas.</w:t>
       </w:r>
     </w:p>
     <w:bookmarkEnd w:id="13"/>
@@ -2510,7 +2510,7 @@
         <w:t xml:space="preserve"> </w:t>
       </w:r>
       <w:r>
-        <w:t xml:space="preserve">A lei não tem artigo de objetivos. O decreto declara um objetivo de produto,</w:t>
+        <w:t xml:space="preserve">A lei não tem artigo de objetivos. O decreto declara na ementa um objetivo de produto,</w:t>
       </w:r>
       <w:r>
         <w:t xml:space="preserve"> </w:t>
@@ -2519,7 +2519,7 @@
         <w:t xml:space="preserve">“estimular a realização de projetos culturais”</w:t>
       </w:r>
       <w:r>
-        <w:t xml:space="preserve">, e lista onze finalidades de</w:t>
+        <w:t xml:space="preserve">, e lista no art. 3º onze finalidades de</w:t>
       </w:r>
       <w:r>
         <w:t xml:space="preserve"> </w:t>
@@ -2580,7 +2580,7 @@
         <w:t xml:space="preserve"> </w:t>
       </w:r>
       <w:r>
-        <w:t xml:space="preserve">Os dados sustentam mal a premissa de que as empresas financiariam projetos fora do circuito consolidado. Primeiro, a captação favorece projetos maiores: dentro de cada ciclo, projetos que pediram exatamente o teto de R$ 500 mil foram executados com mais frequência que os de até R$ 400 mil — 78% contra 27% no ciclo 2024 (Figura 1a). A parcela de pedidos no teto exato triplicou entre 2022 e 2026, sinal de que o valor pedido responde à regra e não só ao custo do projeto. Segundo, a carteira se renova pouco: nos ciclos 2025 e 2026, mais da metade dos proponentes já tinha sido habilitada antes, e os 17% que aparecem em três ou mais ciclos ficam com 47% do valor. Terceiro, o financiamento vem de poucas empresas: em 2025, 26 patrocinadores, dos quais a distribuidora de energia respondeu por 44% da renúncia, e empresas de energia e gás, serviços regulados, por 52%. O limite por patrocinador, proporcional ao ICMS devido, dá aos grandes contribuintes mais espaço de patrocínio em valor absoluto.</w:t>
+        <w:t xml:space="preserve">Os dados sustentam mal a premissa de que as empresas financiariam projetos fora do circuito consolidado. Primeiro, a captação favorece projetos maiores: dentro de cada ciclo, projetos que pediram exatamente o teto de R$ 500 mil foram executados com mais frequência que os de até R$ 400 mil — 78% contra 27% no ciclo 2024 (Figura 1a). A parcela de pedidos no teto exato triplicou entre 2022 e 2026, sinal de que o valor pedido responde à regra e não só ao custo do projeto. Segundo, a captação favorece quem já passou pela política, e a carteira se renova pouco: nos ciclos 2023 e 2024, 71% dos projetos de proponentes já habilitados antes foram executados, contra 57% dos de estreantes; nos ciclos 2025 e 2026, mais da metade dos proponentes já tinha sido habilitada antes, e os 17% que aparecem em três ou mais ciclos ficam com 47% do valor autorizado. Terceiro, o financiamento vem de poucas empresas: em 2025, 26 patrocinadores, dos quais a distribuidora de energia respondeu por 44% da renúncia, e empresas de energia e gás, serviços regulados, por 52%. O limite por patrocinador, proporcional ao ICMS devido, dá aos grandes contribuintes mais espaço de patrocínio em valor absoluto.</w:t>
       </w:r>
     </w:p>
     <w:p>
@@ -2598,7 +2598,7 @@
         <w:t xml:space="preserve"> </w:t>
       </w:r>
       <w:r>
-        <w:t xml:space="preserve">A RMGV tem 49% da população e fica com 67% do valor atribuível a um município; Vitória, com 8% da população, fica com 48% (Figura 1b). O Gini do valor entre os 78 municípios é 0,88, acima do Gini da população (0,64) e do PIB (0,75), e 14 municípios do interior não tiveram nenhum projeto habilitado em cinco ciclos. A reserva de 10% do teto para projetos fora da RMGV age sobre a menor parte dessa desigualdade: na decomposição de Theil, a diferença entre RMGV e interior explica só 7% do total, e o restante está dentro dos grupos. O padrão é o inverso do gasto municipal direto com cultura, maior por habitante no interior (R$ 93) que na RMGV (R$ 59) em 2025. A LICC não compensa essa distribuição; ela a concentra de novo na capital.</w:t>
+        <w:t xml:space="preserve">A RMGV tem 49% da população e fica com 67% do valor atribuível a um município; Vitória, com 8% da população, fica com 48% (Figura 1b). A concentração nasce sobretudo em quem é habilitado: nos ciclos 2022-2024, a taxa de execução pouco difere entre RMGV e interior (68% e 63%), mas, entre os projetos que captaram em 2025 com um único município identificado (42 de 63), 61% do valor captado ficou na RMGV. O Gini do valor entre os 78 municípios é 0,88, acima do Gini da população (0,64) e do PIB (0,75), e 14 municípios do interior não tiveram nenhum projeto habilitado em cinco ciclos. A reserva de 10% do teto para projetos fora da RMGV age sobre a menor parte dessa desigualdade: na decomposição de Theil, a diferença entre RMGV e interior explica só 7% do total, e o restante está dentro dos grupos. O padrão é o inverso do gasto municipal direto com cultura, maior por habitante no interior (R$ 93) que na RMGV (R$ 59) em 2025 (69 dos 71 municípios do interior com dado no SICONFI). A LICC não compensa essa distribuição; ela a concentra de novo na capital.</w:t>
       </w:r>
     </w:p>
     <w:p>
@@ -2634,7 +2634,7 @@
         <w:t xml:space="preserve"> </w:t>
       </w:r>
       <w:r>
-        <w:t xml:space="preserve">O que a SECULT publica cobre insumos e produtos (valores autorizados, status, cota a partir de 2024, local de execução, captação de 2025). Não cobre resultados. As contrapartidas de acesso são escolhidas pelo proponente, conferidas projeto a projeto e nunca agregadas. A estimativa de público é autodeclarada. Não há chave que ligue proponentes a bases de emprego ou de outras fontes de fomento, e as regras mudaram três vezes em quatro anos. Pelas normas publicadas, também não é possível apurar se as cotas foram cumpridas.</w:t>
+        <w:t xml:space="preserve">O que a SECULT publica cobre insumos e produtos (valores autorizados, status, cota a partir de 2024, local de execução, captação de 2025). Não cobre resultados. As contrapartidas de acesso são escolhidas pelo proponente, conferidas projeto a projeto e nunca agregadas. A estimativa de público é autodeclarada. Não há chave que ligue proponentes a bases de emprego ou de outras fontes de fomento, e as regras de acesso mudaram no meio do exercício em 2024 e em 2025. Pelas normas publicadas, também não é possível apurar se as cotas foram cumpridas.</w:t>
       </w:r>
     </w:p>
     <w:p>
@@ -2729,7 +2729,7 @@
         <w:t xml:space="preserve">et al.</w:t>
       </w:r>
       <w:r>
-        <w:t xml:space="preserve">, 2018). A seleção aleatória está fora de questão: a SECULT não aloca o benefício entre habilitados, e sortear seria redesenhar o mecanismo. A regressão descontínua não se aplica, porque a habilitação não usa pontuação nem nota de corte, e o único limiar numérico (35% de patrocínio comprometido) é escolhido pelos próprios interessados. O pareamento isolado supõe seleção só em observáveis, o contrário do que se espera quando a empresa escolhe por visibilidade e rede.</w:t>
+        <w:t xml:space="preserve">, 2018). A seleção aleatória está fora de questão: a SECULT não aloca o benefício entre habilitados, e sortear seria redesenhar o mecanismo. A regressão descontínua não se aplica, porque a habilitação não usa pontuação nem nota de corte, e o único limiar numérico, os 35% do valor em termos de compromisso de patrocínio da instrução de 2025, depende dos próprios interessados. O pareamento isolado supõe seleção só em observáveis, o contrário do que se espera quando a empresa escolhe por visibilidade e rede.</w:t>
       </w:r>
     </w:p>
     <w:p>
@@ -2780,7 +2780,7 @@
         <w:t xml:space="preserve">“ainda não tratados”</w:t>
       </w:r>
       <w:r>
-        <w:t xml:space="preserve">, os habilitados de ciclos posteriores antes de captar. A lógica é a dos candidatos não escolhidos de Gomes e Librero-Cano (2018): todos passaram pelo mesmo filtro de mérito. A janela se restringe a 2022-2024 porque, desde maio de 2025, a habilitação exige carta de intenção de patrocínio, e</w:t>
+        <w:t xml:space="preserve">, os habilitados de ciclos posteriores antes de captar. A lógica é a dos candidatos não escolhidos de Gomes e Librero-Cano (2018): todos passaram pelo mesmo filtro de mérito. A janela se restringe a 2022-2024 porque, nesses ciclos, a lista de habilitados reúne projetos que captaram e que não captaram, enquanto, com a carta de intenção exigida desde maio de 2025,</w:t>
       </w:r>
       <w:r>
         <w:t xml:space="preserve"> </w:t>
@@ -2804,7 +2804,7 @@
         <w:t xml:space="preserve"> </w:t>
       </w:r>
       <w:r>
-        <w:t xml:space="preserve">quase se confundem.</w:t>
+        <w:t xml:space="preserve">quase se confundem (3 expirados em 56 resolvidos no ciclo 2025). Há duas ressalvas. As instruções normativas de 2022 a 2024 não foram lidas, e não se sabe se a lista inclui projetos que só tinham o certificado ou apenas os aprovados pela comissão, que já tinham compromisso de parte do patrocínio. Isso muda o que o grupo de comparação representa, projetos sem patrocinador ou com patrocínio parcial que não se concretizou, e precisa ser confirmado com a SECULT antes da coleta.</w:t>
       </w:r>
     </w:p>
     <w:p>
@@ -3615,37 +3615,74 @@
                 </m:rPr>
                 <m:t>+</m:t>
               </m:r>
-              <m:r>
-                <m:rPr>
-                  <m:sty m:val="p"/>
-                </m:rPr>
-                <m:t>(</m:t>
-              </m:r>
-              <m:acc>
-                <m:accPr>
-                  <m:chr m:val="‾"/>
-                </m:accPr>
+              <m:d>
+                <m:dPr>
+                  <m:begChr m:val="["/>
+                  <m:sepChr m:val=""/>
+                  <m:endChr m:val="]"/>
+                  <m:grow/>
+                </m:dPr>
                 <m:e>
                   <m:r>
-                    <m:t>m</m:t>
+                    <m:rPr>
+                      <m:sty m:val="p"/>
+                    </m:rPr>
+                    <m:t>(</m:t>
+                  </m:r>
+                  <m:r>
+                    <m:t>c</m:t>
+                  </m:r>
+                  <m:sSup>
+                    <m:e>
+                      <m:r>
+                        <m:t>v</m:t>
+                      </m:r>
+                    </m:e>
+                    <m:sup>
+                      <m:r>
+                        <m:t>2</m:t>
+                      </m:r>
+                    </m:sup>
+                  </m:sSup>
+                  <m:r>
+                    <m:rPr>
+                      <m:sty m:val="p"/>
+                    </m:rPr>
+                    <m:t>+</m:t>
+                  </m:r>
+                  <m:r>
+                    <m:t>1</m:t>
+                  </m:r>
+                  <m:r>
+                    <m:rPr>
+                      <m:sty m:val="p"/>
+                    </m:rPr>
+                    <m:t>)</m:t>
+                  </m:r>
+                  <m:r>
+                    <m:t> </m:t>
+                  </m:r>
+                  <m:acc>
+                    <m:accPr>
+                      <m:chr m:val="‾"/>
+                    </m:accPr>
+                    <m:e>
+                      <m:r>
+                        <m:t>m</m:t>
+                      </m:r>
+                    </m:e>
+                  </m:acc>
+                  <m:r>
+                    <m:rPr>
+                      <m:sty m:val="p"/>
+                    </m:rPr>
+                    <m:t>−</m:t>
+                  </m:r>
+                  <m:r>
+                    <m:t>1</m:t>
                   </m:r>
                 </m:e>
-              </m:acc>
-              <m:r>
-                <m:rPr>
-                  <m:sty m:val="p"/>
-                </m:rPr>
-                <m:t>−</m:t>
-              </m:r>
-              <m:r>
-                <m:t>1</m:t>
-              </m:r>
-              <m:r>
-                <m:rPr>
-                  <m:sty m:val="p"/>
-                </m:rPr>
-                <m:t>)</m:t>
-              </m:r>
+              </m:d>
               <m:r>
                 <m:t>ρ</m:t>
               </m:r>
@@ -3737,7 +3774,24 @@
         <w:t xml:space="preserve"> </w:t>
       </w:r>
       <w:r>
-        <w:t xml:space="preserve">= 1,47 projeto por proponente com correlação intraproponente</w:t>
+        <w:t xml:space="preserve">= 1,47 projeto por proponente, com coeficiente de variação</w:t>
+      </w:r>
+      <w:r>
+        <w:t xml:space="preserve"> </w:t>
+      </w:r>
+      <m:oMath>
+        <m:r>
+          <m:t>c</m:t>
+        </m:r>
+        <m:r>
+          <m:t>v</m:t>
+        </m:r>
+      </m:oMath>
+      <w:r>
+        <w:t xml:space="preserve"> </w:t>
+      </w:r>
+      <w:r>
+        <w:t xml:space="preserve">= 0,73 do tamanho das carteiras e correlação intraproponente</w:t>
       </w:r>
       <w:r>
         <w:t xml:space="preserve"> </w:t>
@@ -3751,7 +3805,7 @@
         <w:t xml:space="preserve"> </w:t>
       </w:r>
       <w:r>
-        <w:t xml:space="preserve">(ajustado pela dispersão do tamanho das carteiras). A Tabela 2 reporta cenários;</w:t>
+        <w:t xml:space="preserve">(ELDRIDGE; ASHBY; KERRY, 2006). A Tabela 2 reporta cenários;</w:t>
       </w:r>
       <w:r>
         <w:t xml:space="preserve"> </w:t>
@@ -4330,7 +4384,7 @@
         <w:pStyle w:val="BodyText"/>
       </w:pPr>
       <w:r>
-        <w:t xml:space="preserve">O universo disponível detecta, portanto, efeitos a partir de 0,25 a 0,45 desvio-padrão, que a literatura trata como moderados. Três implicações seguem. Primeiro, empilhar os três ciclos e usar a linha de base é indispensável: um ciclo isolado só detecta efeitos grandes. Segundo, como a evidência internacional aponta efeitos pequenos, um resultado nulo não pode ser lido como ausência de efeito, e um resultado</w:t>
+        <w:t xml:space="preserve">O universo disponível detecta, portanto, efeitos a partir de 0,25 a 0,45 desvio-padrão, conforme o cenário. Três implicações seguem. Primeiro, empilhar os três ciclos e usar a linha de base é indispensável: um ciclo isolado só detecta efeitos grandes. Segundo, como a evidência internacional aponta efeitos pequenos, um resultado nulo não pode ser lido como ausência de efeito, e um resultado</w:t>
       </w:r>
       <w:r>
         <w:t xml:space="preserve"> </w:t>
@@ -4379,7 +4433,7 @@
         <w:pStyle w:val="FirstParagraph"/>
       </w:pPr>
       <w:r>
-        <w:t xml:space="preserve">A LICC é um gasto tributário de crescimento rápido, sem problema declarado, sem objetivos mensuráveis e sem previsão de avaliação, em que o Estado define quem pode receber e as empresas decidem quem recebe. A avaliação do desenho, feita com os dados oficiais, indica que a premissa central, a de que as empresas escolheriam projetos alinhados aos objetivos públicos, se sustenta mal. A captação favorece projetos que pedem o teto, proponentes recorrentes e a capital, e concentra-se em poucos patrocinadores de serviços regulados. As reservas do art. 18 atuam sobre a menor parte da desigualdade territorial, e o cumprimento delas não é apurável com o que se publica.</w:t>
+        <w:t xml:space="preserve">A LICC é um gasto tributário de crescimento rápido, sem problema declarado, sem objetivos mensuráveis e sem previsão de avaliação, em que o Estado define quem pode receber e as empresas decidem quem recebe. A avaliação do desenho, feita com os dados oficiais, indica que a premissa central, a de que as empresas escolheriam projetos alinhados aos objetivos públicos, se sustenta mal. A captação favorece projetos que pedem o teto e proponentes recorrentes, o valor habilitado concentra-se na capital, e o financiamento vem de poucos patrocinadores de serviços regulados. As reservas do art. 18 atuam sobre a menor parte da desigualdade territorial, e o cumprimento delas não é apurável com o que se publica.</w:t>
       </w:r>
     </w:p>
     <w:p>
@@ -4395,7 +4449,7 @@
         <w:pStyle w:val="BodyText"/>
       </w:pPr>
       <w:r>
-        <w:t xml:space="preserve">A proposta de avaliação de impacto aproveita a janela de 2022-2024, em que a habilitação precedia a busca por patrocinador, para comparar quem captou com quem não captou dentro do mesmo filtro de mérito. O poder é suficiente para efeitos moderados, e o desenho depende de uma única decisão administrativa: dar acesso ao CNPJ dos proponentes. As limitações deste artigo são as dos dados. A conversão habilitado-captou usa a situação publicada como aproximação, a natureza dos proponentes foi inferida do nome, e o retrato territorial cobre 74% do valor.</w:t>
+        <w:t xml:space="preserve">A proposta de avaliação de impacto aproveita a janela de 2022-2024, em que a lista de habilitados reúne projetos que captaram e que não captaram, para comparar os dois grupos dentro do mesmo filtro de mérito. O poder alcança efeitos a partir de 0,25 a 0,45 desvio-padrão, e o desenho depende de uma única decisão administrativa: dar acesso ao CNPJ dos proponentes. As limitações deste artigo são as dos dados. A conversão habilitado-captou usa a situação publicada como aproximação, a natureza dos proponentes foi inferida do nome, e o retrato territorial cobre 74% do valor.</w:t>
       </w:r>
     </w:p>
     <w:bookmarkEnd w:id="26"/>
@@ -4931,7 +4985,7 @@
         <w:t xml:space="preserve">Sistema de Informações e Indicadores Culturais</w:t>
       </w:r>
       <w:r>
-        <w:t xml:space="preserve">: 2011-2022. Rio de Janeiro: IBGE, 2023. Dados consultados pela API de pesquisas do IBGE em 23 set. 2026.</w:t>
+        <w:t xml:space="preserve">. Rio de Janeiro: IBGE, 2025. Base de dados; períodos 2023 e 2024 publicados em 12 dez. 2025. Disponível em: https://servicodados.ibge.gov.br/api/v1/pesquisas/10092. Acesso em: 23 set. 2026.</w:t>
       </w:r>
     </w:p>
     <w:p>
@@ -5070,7 +5124,15 @@
         <w:t xml:space="preserve">Handbook of the economics of art and culture</w:t>
       </w:r>
       <w:r>
-        <w:t xml:space="preserve">. Amsterdam: Elsevier, 2006. v. 1, p. 1253-1298.</w:t>
+        <w:t xml:space="preserve">. Amsterdam: Elsevier, 2006. v. 1, p. 1253-1298. DOI: 10.1016/S1574-0676(06)01036-2.</w:t>
+      </w:r>
+    </w:p>
+    <w:p>
+      <w:pPr>
+        <w:pStyle w:val="BodyText"/>
+      </w:pPr>
+      <w:r>
+        <w:t xml:space="preserve">SECULT – SECRETARIA DE ESTADO DA CULTURA DO ESPÍRITO SANTO. Portaria nº 078, de 31 de julho de 2024. Introduz alterações no artigo 12 da Instrução Normativa nº 001 de 31 de janeiro de 2024 e traz outras diretrizes. Vitória: SECULT, 2024. Disponível em: https://secult.es.gov.br/media/2024/PORTARIA_SECULT_N%C2%BA_078%2C_DE_31_DE_JULHO_DE_2024.pdf. Acesso em: 23 set. 2026.</w:t>
       </w:r>
     </w:p>
     <w:p>
@@ -5134,6 +5196,27 @@
       </w:r>
       <w:r>
         <w:t xml:space="preserve">. Vitória: SECULT, 2026a.</w:t>
+      </w:r>
+    </w:p>
+    <w:p>
+      <w:pPr>
+        <w:pStyle w:val="BodyText"/>
+      </w:pPr>
+      <w:r>
+        <w:t xml:space="preserve">SECULT – SECRETARIA DE ESTADO DA CULTURA DO ESPÍRITO SANTO.</w:t>
+      </w:r>
+      <w:r>
+        <w:t xml:space="preserve"> </w:t>
+      </w:r>
+      <w:r>
+        <w:rPr>
+          <w:b/>
+          <w:bCs/>
+        </w:rPr>
+        <w:t xml:space="preserve">Sobre a LICC</w:t>
+      </w:r>
+      <w:r>
+        <w:t xml:space="preserve">. Vitória: SECULT, [202-]. Disponível em: https://secult.es.gov.br/sobre-a-licc. Acesso em: 24 set. 2026.</w:t>
       </w:r>
     </w:p>
     <w:p>

</xml_diff>

<commit_message>
H2a auditada: o modelo de parecer não atribui nota (atende ou não por critério)
- O relé leu o 'Parecer Técnico Cultural LICC - modelo padrão' (2022 e 2026): para cada
  um dos nove critérios, o parecerista indica se o projeto atende ou não e, ao final,
  sugere habilitação, inabilitação ou diligência. Não há nota, peso ou corte para projetos.
  A pontuação existente é a dos pareceristas (edital de credenciamento 2025, mínimo de 20
  pontos; ordem classificatória distribui os projetos).
- Artigo: parágrafo da habilitação e Quadro 2 com o fato verificado; H2a deixa de ser
  candidata a regressão descontínua e fica descritiva; referência ao modelo de parecer
  (SECULT, 2026f); DOI de Williams (2020) corrigido para 10.1093/wbro/lky010.
- Notas 03 (§ 8) e desenho legal atualizadas. PDF de conferência: 15 páginas; 40/40 checagens.

Co-Authored-By: Claude Opus 5.5 <noreply@anthropic.com>
Claude-Session: https://claude.ai/code/session_01XEaG1GvUXhdfnXot6AtJxa
</commit_message>
<xml_diff>
--- a/artigo/rascunho-artigo.docx
+++ b/artigo/rascunho-artigo.docx
@@ -1979,7 +1979,7 @@
               <w:rPr>
                 <w:sz w:val="20"/>
               </w:rPr>
-              <w:t xml:space="preserve">Parecer e CAP decidem só habilitar ou não, em fluxo contínuo; nenhuma norma prevê nota ou ordem de prioridade. Em 2022-2024, 95 de 293 habilitados expiraram sem captar</w:t>
+              <w:t xml:space="preserve">O parecer indica, por critério, se o projeto atende ou não, e a CAP decide só habilitar ou não, em fluxo contínuo; não há nota nem ordem de prioridade. Em 2022-2024, 95 de 293 habilitados expiraram sem captar</w:t>
             </w:r>
           </w:p>
         </w:tc>
@@ -2333,7 +2333,19 @@
         <w:t xml:space="preserve">“avaliação simplificada”</w:t>
       </w:r>
       <w:r>
-        <w:t xml:space="preserve">, não como avaliação técnica (SECULT, 2026e). Se o formulário de parecer atribui nota aos critérios, ela não é publicada e não decide quem recebe. A habilitação qualifica, mas não prioriza, e autoriza mais do que o teto financia. A escolha entre projetos considerados aptos passa, assim, à empresa e à fila de validação. De 2023 a 2025 a captação esgotou o montante de cada ano ao centavo, e o excesso de demanda com patrocinador foi racionado pela ordem de chegada dos termos, não por mérito (SECULT, 2026c).</w:t>
+        <w:t xml:space="preserve">, não como avaliação técnica (SECULT, 2026e). O modelo de parecer também não atribui nota: para cada critério, o parecerista indica se o projeto</w:t>
+      </w:r>
+      <w:r>
+        <w:t xml:space="preserve"> </w:t>
+      </w:r>
+      <w:r>
+        <w:t xml:space="preserve">“atende ou não”</w:t>
+      </w:r>
+      <w:r>
+        <w:t xml:space="preserve"> </w:t>
+      </w:r>
+      <w:r>
+        <w:t xml:space="preserve">e, ao final, sugere habilitação, inabilitação ou diligência (SECULT, 2026f). A única pontuação do processo é a dos pareceristas, no edital que os credencia. A habilitação qualifica, mas não prioriza, e autoriza mais do que o teto financia. A escolha entre projetos considerados aptos passa, assim, à empresa e à fila de validação. De 2023 a 2025 a captação esgotou o montante de cada ano ao centavo, e o excesso de demanda com patrocinador foi racionado pela ordem de chegada dos termos, não por mérito (SECULT, 2026c).</w:t>
       </w:r>
     </w:p>
     <w:p>
@@ -3211,7 +3223,7 @@
         <w:t xml:space="preserve"> </w:t>
       </w:r>
       <w:r>
-        <w:t xml:space="preserve">Se o formulário de parecer atribuir nota com ponto de corte, a regressão descontínua na habilitação se torna candidata, desde que o proponente não manipule a nota. Sem nota, a pergunta fica descritiva: a associação entre a avaliação da SECULT e a captação.</w:t>
+        <w:t xml:space="preserve">Como o parecer não atribui nota, não há ponto de corte para regressão descontínua. A pergunta fica descritiva: se a captação se associa ao que o parecer registrou (critérios atendidos, diligências), com os pareceres obtidos por LAI.</w:t>
       </w:r>
     </w:p>
     <w:bookmarkEnd w:id="22"/>
@@ -4948,7 +4960,7 @@
         <w:pStyle w:val="BodyText"/>
       </w:pPr>
       <w:r>
-        <w:t xml:space="preserve">A proposta de avaliação transforma as premissas em três perguntas: a adicionalidade do financiamento (H1b), identificável pelo racionamento no teto e pelos habilitados que não captaram; o efeito do atrito na entrada (H3), identificável por uma oferta sorteada de apoio à inscrição, com bom poder; e o papel da avaliação da SECULT (H2a), que depende de haver nota no parecer. As limitações são as dos dados. A situação publicada serve de aproximação para a captação, a estreia é medida por nome de proponente, e o retrato territorial cobre 74% do valor.</w:t>
+        <w:t xml:space="preserve">A proposta de avaliação transforma as premissas em três perguntas: a adicionalidade do financiamento (H1b), identificável pelo racionamento no teto e pelos habilitados que não captaram; o efeito do atrito na entrada (H3), identificável por uma oferta sorteada de apoio à inscrição, com bom poder; e o papel da avaliação da SECULT (H2a), que, sem nota no parecer, fica descritivo. As limitações são as dos dados. A situação publicada serve de aproximação para a captação, a estreia é medida por nome de proponente, e o retrato territorial cobre 74% do valor.</w:t>
       </w:r>
     </w:p>
     <w:bookmarkEnd w:id="27"/>
@@ -5892,6 +5904,27 @@
           <w:b/>
           <w:bCs/>
         </w:rPr>
+        <w:t xml:space="preserve">Parecer técnico cultural LICC</w:t>
+      </w:r>
+      <w:r>
+        <w:t xml:space="preserve">: modelo padrão. Vitória: SECULT, 2026f. Disponível em: https://secult.es.gov.br/LICC. Acesso em: 24 set. 2026.</w:t>
+      </w:r>
+    </w:p>
+    <w:p>
+      <w:pPr>
+        <w:pStyle w:val="BodyText"/>
+      </w:pPr>
+      <w:r>
+        <w:t xml:space="preserve">SECULT – SECRETARIA DE ESTADO DA CULTURA DO ESPÍRITO SANTO.</w:t>
+      </w:r>
+      <w:r>
+        <w:t xml:space="preserve"> </w:t>
+      </w:r>
+      <w:r>
+        <w:rPr>
+          <w:b/>
+          <w:bCs/>
+        </w:rPr>
         <w:t xml:space="preserve">Sobre a LICC</w:t>
       </w:r>
       <w:r>
@@ -6079,7 +6112,7 @@
         <w:t xml:space="preserve">The World Bank Research Observer</w:t>
       </w:r>
       <w:r>
-        <w:t xml:space="preserve">, v. 35, n. 2, p. 158-191, 2020. [VERIFICAR DOI]</w:t>
+        <w:t xml:space="preserve">, v. 35, n. 2, p. 158-191, 2020. DOI: 10.1093/wbro/lky010.</w:t>
       </w:r>
     </w:p>
     <w:bookmarkEnd w:id="28"/>

</xml_diff>

<commit_message>
Literatura brasileira: lista externa conferida; entram Alcântara et al. (2019) e Colombo e Cruz (2023)
- 19 DOIs da lista conferidos pelo relé (todos existem; seis com ano divergente,
  um DOI incompleto); o item principal da lista era o próprio rascunho do artigo
- §3: Colombo e Cruz (2023) como precedente brasileiro de avaliação causal de
  gasto tributário (Lei do Bem, pareamento + DiD); citado também no desenho de H1b
- §4.2: limite por patrocinador proporcional ao ICMS e Alcântara, Benedicto e
  Silva (2019) sobre porte e concentração setorial de quem patrocina
- Santos, Juchem e Maduro (2017) conferida, mas fora do texto para caber em 15 p.
- cortes de redação para manter a Figura 1 na p. 5 e o artigo em 15 páginas;
  BAIRD antes de BARROS na lista; checagem D65 atualizada (40/40)

Co-Authored-By: Claude Opus 5.5 <noreply@anthropic.com>
Claude-Session: https://claude.ai/code/session_01XEaG1GvUXhdfnXot6AtJxa
</commit_message>
<xml_diff>
--- a/artigo/rascunho-artigo.docx
+++ b/artigo/rascunho-artigo.docx
@@ -123,7 +123,7 @@
         <w:pStyle w:val="BodyText"/>
       </w:pPr>
       <w:r>
-        <w:t xml:space="preserve">Avaliar a LICC se justifica por três razões. Primeiro, é gasto público que não passa pelo lado da despesa do orçamento: a renúncia efetiva equivale a 14% a 21% do gasto estadual direto na função cultura em 2022-2025 (SECULT, 2026c; BRASIL, 2026a). Segundo, quem decide o destino do recurso é a empresa patrocinadora, e não o Estado, o que torna a política exposta às críticas de concentração e de lógica de marketing feitas à Lei Rouanet (SILVA, 2017; DEKKER; RODRIGUES, 2019). Terceiro, a política é nova e muda de regra a cada ano; sua primeira avaliação, conduzida pelo Instituto Jones dos Santos Neves (IJSN) com a SECULT e a FAPES, teve resultados preliminares apresentados em julho de 2026 (SECULT, 2026d), aos quais este artigo não teve acesso.</w:t>
+        <w:t xml:space="preserve">Avaliar a LICC se justifica por três razões. Primeiro, é gasto público que não passa pelo lado da despesa do orçamento: a renúncia efetiva equivale a 14% a 21% do gasto estadual direto na função cultura em 2022-2025 (SECULT, 2026c; BRASIL, 2026a). Segundo, quem decide o destino do recurso é a empresa patrocinadora, e não o Estado, o que torna a política exposta às críticas de concentração e de lógica de marketing feitas à Lei Rouanet (SILVA, 2017; DEKKER; RODRIGUES, 2019). Terceiro, a política é nova e muda de regra a cada ano; sua primeira avaliação, conduzida pelo Instituto Jones dos Santos Neves com a SECULT e a FAPES, teve resultados preliminares apresentados em julho de 2026 (SECULT, 2026d), aos quais este artigo não teve acesso.</w:t>
       </w:r>
     </w:p>
     <w:p>
@@ -144,7 +144,7 @@
         <w:t xml:space="preserve">como ela está</w:t>
       </w:r>
       <w:r>
-        <w:t xml:space="preserve">, sem propor redesenho do mecanismo, e estruturar uma avaliação de impacto, com desenho amostral, fontes de dados e cálculo de poder. A seção 2 caracteriza a política; a seção 3 revisa a literatura; a seção 4 reconstrói a teoria da mudança e audita suas premissas com os dados administrativos; a seção 5 transforma as premissas em perguntas de avaliação de impacto, com desenho da amostra, fontes de dados e cálculo do poder; a seção 6 conclui.</w:t>
+        <w:t xml:space="preserve">, sem propor redesenho do mecanismo, e estruturar uma avaliação de impacto, com desenho amostral, fontes de dados e cálculo de poder. A seção 2 caracteriza a política; a seção 3 revisa a literatura; a seção 4 reconstrói a teoria da mudança e audita suas premissas com os dados administrativos; a seção 5 transforma as premissas em perguntas de avaliação de impacto; a seção 6 conclui.</w:t>
       </w:r>
     </w:p>
     <w:bookmarkEnd w:id="12"/>
@@ -762,7 +762,7 @@
         <w:t xml:space="preserve">instabilidade</w:t>
       </w:r>
       <w:r>
-        <w:t xml:space="preserve">: a SECULT edita uma instrução normativa por ano e, alegando esgotamento do teto, fechou as inscrições no meio de 2024 e alterou o fluxo de habilitação no meio de 2025 (SECULT, 2024b; 2025b). Em 2023 e 2024, a comissão habilitava o projeto e abria um prazo de captação de um ano, prorrogável uma vez; o projeto que terminasse o prazo sem compromissos de ao menos 50% do valor aprovado era arquivado (SECULT, 2023a, arts. 32-36; 2024a, arts. 32-36). Em 2025 a ordem se inverteu: o projeto só vai à comissão com termos de patrocínio de ao menos 35% do valor (SECULT, 2025a, arts. 41-45) ou, desde maio, com carta de intenção de patrocínio apresentada em 120 dias, sob pena de arquivamento (SECULT, 2025b). A terceira é a</w:t>
+        <w:t xml:space="preserve">: a SECULT edita uma instrução normativa por ano e, alegando esgotamento do teto, fechou as inscrições no meio de 2024 e alterou o fluxo de habilitação no meio de 2025 (SECULT, 2024b; 2025b). Em 2023 e 2024, a comissão habilitava o projeto e abria um prazo de captação de um ano, prorrogável uma vez; o projeto que terminasse o prazo sem compromissos de ao menos 50% do valor aprovado era arquivado (SECULT, 2023a; 2024a, arts. 32-36). Em 2025 a ordem se inverteu: o projeto só vai à comissão com termos de patrocínio de ao menos 35% do valor (SECULT, 2025a, arts. 41-45) ou, desde maio, com carta de intenção de patrocínio apresentada em 120 dias, sob pena de arquivamento (SECULT, 2025b). A terceira é a</w:t>
       </w:r>
       <w:r>
         <w:t xml:space="preserve"> </w:t>
@@ -860,7 +860,7 @@
         <w:t xml:space="preserve"> </w:t>
       </w:r>
       <w:r>
-        <w:t xml:space="preserve">Não localizamos avaliação causal de incentivo cultural no Brasil. Para leis estaduais via ICMS, os estudos localizados são descritivos: em Minas Gerais, a captação pela lei estadual concentrou-se na região metropolitana de Belo Horizonte, e municípios com museu, teatro ou cinema tinham mais chance de captar (TEIXEIRA</w:t>
+        <w:t xml:space="preserve">Não localizamos avaliação causal de incentivo cultural no Brasil; os estudos de leis estaduais via ICMS são descritivos: em Minas Gerais, a captação pela lei estadual concentrou-se na região metropolitana de Belo Horizonte, e municípios com museu, teatro ou cinema tinham mais chance de captar (TEIXEIRA</w:t>
       </w:r>
       <w:r>
         <w:t xml:space="preserve"> </w:t>
@@ -873,7 +873,7 @@
         <w:t xml:space="preserve">et al.</w:t>
       </w:r>
       <w:r>
-        <w:t xml:space="preserve">, 2021). O análogo internacional mais próximo em instrumento são os créditos estaduais à produção audiovisual nos Estados Unidos. As avaliações com adoção escalonada e variáveis instrumentais encontram efeitos pequenos e concentrados na atividade incentivada — mais filmagens de séries, pouco ou nenhum emprego adicional — e nenhum efeito macroeconômico (THOM, 2018; BUTTON, 2019; BRADBURY, 2020). Com grandes eventos, a Capital Europeia da Cultura elevou em 4,5% o PIB per capita das regiões das cidades-sede (GOMES; LIBRERO-CANO, 2018). Sobre a interação entre recurso público e privado, os resultados variam de leve</w:t>
+        <w:t xml:space="preserve">, 2021). Fora da cultura, Colombo e Cruz (2023) avaliam outro gasto tributário, a Lei do Bem, com pareamento e diferenças em diferenças: há efeito sobre o gasto em P&amp;D, o pessoal de pesquisa e o emprego, mas não sobre os resultados de inovação. No exterior, o análogo mais próximo em instrumento são os créditos estaduais ao audiovisual nos Estados Unidos, cujas avaliações, com adoção escalonada e variáveis instrumentais, encontram efeitos pequenos e concentrados na atividade incentivada — mais filmagens de séries, pouco ou nenhum emprego adicional — e nenhum efeito macroeconômico (THOM, 2018; BUTTON, 2019; BRADBURY, 2020). Com grandes eventos, a Capital Europeia da Cultura elevou em 4,5% o PIB per capita das regiões das cidades-sede (GOMES; LIBRERO-CANO, 2018). Entre recurso público e privado, os resultados vão de leve</w:t>
       </w:r>
       <w:r>
         <w:t xml:space="preserve"> </w:t>
@@ -889,7 +889,7 @@
         <w:t xml:space="preserve"> </w:t>
       </w:r>
       <w:r>
-        <w:t xml:space="preserve">a independência (BORGONOVI; O’HARE, 2004). Duas lições servem à LICC. Para instrumentos que financiam produções dispersas, e não um grande evento, os efeitos plausíveis são proximais e pequenos. E os desenhos críveis exploram candidatos não escolhidos como grupo de comparação: Gomes e Librero-Cano (2018) comparam cidades que sediaram a Capital Europeia da Cultura com cidades candidatas.</w:t>
+        <w:t xml:space="preserve">à independência (BORGONOVI; O’HARE, 2004). Duas lições servem à LICC: em instrumentos que financiam produções dispersas, os efeitos plausíveis são proximais e pequenos; e os desenhos críveis usam como comparação candidatos não escolhidos, como as cidades candidatas à Capital Europeia da Cultura.</w:t>
       </w:r>
     </w:p>
     <w:bookmarkEnd w:id="14"/>
@@ -916,7 +916,7 @@
         <w:pStyle w:val="FirstParagraph"/>
       </w:pPr>
       <w:r>
-        <w:t xml:space="preserve">Como a LICC não explicita sua lógica, reconstruímos a teoria da mudança pelos cinco passos do J-PAL: propósito, cadeia causal, premissas e riscos, hipótese causal e indicadores. Usamos o formato de árvore adotado na disciplina (Figura 1). A cadeia tem uma particularidade. Na cadeia de resultados de Gertler</w:t>
+        <w:t xml:space="preserve">Como a LICC não explicita sua lógica, reconstruímos a teoria da mudança (Figura 1) pelos cinco passos do J-PAL usados na disciplina: propósito, cadeia causal, premissas e riscos, hipótese causal e indicadores. Na cadeia de resultados de Gertler</w:t>
       </w:r>
       <w:r>
         <w:t xml:space="preserve"> </w:t>
@@ -944,7 +944,7 @@
         <w:t xml:space="preserve"> </w:t>
       </w:r>
       <w:r>
-        <w:t xml:space="preserve">depende de um terceiro ator, a empresa, que decide quem recebe. Por isso a Figura 1 separa três cadeias, como recomendam White e Raitzer (2017): a entrada (inscrição e habilitação), o financiamento (escolha da empresa e validação até o teto) e a entrega. A figura também indica quem decide em cada elo.</w:t>
+        <w:t xml:space="preserve">depende de um terceiro ator, a empresa, que decide quem recebe. Por isso a Figura 1 separa três cadeias, como recomendam White e Raitzer (2017): a entrada (inscrição e habilitação), o financiamento (escolha da empresa e validação até o teto) e a entrega, e indica quem decide em cada elo.</w:t>
       </w:r>
     </w:p>
     <w:p>
@@ -1155,7 +1155,7 @@
         <w:pStyle w:val="FirstParagraph"/>
       </w:pPr>
       <w:r>
-        <w:t xml:space="preserve">Aplicamos as perguntas de avaliação de desenho do material da disciplina: o problema está formulado? os objetivos são mensuráveis? cada elo tem premissa crível e indicador? quanto se perde ao longo da cadeia? Para as premissas usamos o mecanismo de mapeamento de Williams (2020). A premissa de cada elo é confrontada com o contexto real e classificada como sustentada, não atendida, contestada ou indeterminada (Quadro 2).</w:t>
+        <w:t xml:space="preserve">Aplicamos as perguntas de avaliação de desenho do material da disciplina: o problema está formulado? os objetivos são mensuráveis? cada elo tem premissa crível e indicador? quanto se perde ao longo da cadeia? Pelo mecanismo de mapeamento de Williams (2020), a premissa de cada elo é confrontada com o contexto real e classificada como sustentada, não atendida, contestada ou indeterminada (Quadro 2).</w:t>
       </w:r>
     </w:p>
     <w:p>
@@ -1756,7 +1756,7 @@
         <w:rPr>
           <w:sz w:val="20"/>
         </w:rPr>
-        <w:t xml:space="preserve">. Cadastro no Mapa Cultural não é elegibilidade, porque a inscrição exige CNPJ.</w:t>
+        <w:t xml:space="preserve">.</w:t>
       </w:r>
     </w:p>
     <w:p>
@@ -2324,7 +2324,7 @@
         <w:t xml:space="preserve"> </w:t>
       </w:r>
       <w:r>
-        <w:t xml:space="preserve">(ESPÍRITO SANTO, 2021b, art. 14; SECULT, 2025a, arts. 37-42). A comissão se reúne semanalmente (SECULT, 2023b, art. 9º), e o certificado de aptidão é emitido projeto a projeto, depois do parecer (SECULT, 2025a, arts. 40 e 45). Os inscritos não disputam vagas entre si, e por isso não há classificação. Nenhuma norma lida prevê nota, peso, nota de corte ou ordem de prioridade, e no Mapa Cultural as fases de parecer e de comissão estão registradas como</w:t>
+        <w:t xml:space="preserve">(ESPÍRITO SANTO, 2021b, art. 14; SECULT, 2025a, arts. 37-42). A comissão se reúne semanalmente e o certificado de aptidão sai projeto a projeto (SECULT, 2023b, art. 9º; 2025a, arts. 40 e 45): os inscritos não disputam vagas entre si, e por isso não há classificação. Nenhuma norma lida prevê nota, peso, nota de corte ou ordem de prioridade, e no Mapa Cultural as fases de parecer e de comissão estão registradas como</w:t>
       </w:r>
       <w:r>
         <w:t xml:space="preserve"> </w:t>
@@ -2345,7 +2345,7 @@
         <w:t xml:space="preserve"> </w:t>
       </w:r>
       <w:r>
-        <w:t xml:space="preserve">e, ao final, sugere habilitação, inabilitação ou diligência (SECULT, 2026f). A única pontuação do processo é a dos pareceristas, no edital que os credencia. A habilitação qualifica, mas não prioriza, e autoriza mais do que o teto financia. A escolha entre projetos considerados aptos passa, assim, à empresa e à fila de validação. De 2023 a 2025 a captação esgotou o montante de cada ano ao centavo, e o excesso de demanda com patrocinador foi racionado pela ordem de chegada dos termos, não por mérito (SECULT, 2026c).</w:t>
+        <w:t xml:space="preserve">e, ao final, sugere habilitação, inabilitação ou diligência (SECULT, 2026f). A única pontuação do processo é a dos pareceristas, no edital que os credencia. A habilitação qualifica, mas não prioriza, e autoriza mais do que o teto financia. A escolha entre projetos considerados aptos passa, assim, à empresa e à fila de validação. Com o montante esgotado de 2023 a 2025, o excesso de demanda com patrocinador foi racionado pela ordem de chegada dos termos, não por mérito (SECULT, 2026c).</w:t>
       </w:r>
     </w:p>
     <w:p>
@@ -2363,7 +2363,7 @@
         <w:t xml:space="preserve"> </w:t>
       </w:r>
       <w:r>
-        <w:t xml:space="preserve">Com crédito integral, a empresa escolhe o destino do ICMS que pagaria e fica com a marca. Imagem e relações de negócio estão entre os motivos do patrocínio (O’HAGAN; HARVEY, 2000), e a filantropia empresarial também serve de canal de influência política (BERTRAND</w:t>
+        <w:t xml:space="preserve">Com crédito integral, a empresa escolhe o destino do ICMS que pagaria e fica com a marca; como o limite por patrocinador é uma fração do ICMS recolhido (Quadro 1), as maiores contribuintes têm mais espaço para patrocinar. Imagem e relações de negócio estão entre os motivos do patrocínio (O’HAGAN; HARVEY, 2000), e a filantropia empresarial também serve de canal de influência política (BERTRAND</w:t>
       </w:r>
       <w:r>
         <w:t xml:space="preserve"> </w:t>
@@ -2376,7 +2376,7 @@
         <w:t xml:space="preserve">et al.</w:t>
       </w:r>
       <w:r>
-        <w:t xml:space="preserve">, 2020). Das 26 empresas que patrocinaram em 2025, 13 também aparecem como incentivadoras da Lei Rouanet, e elas responderam por 86% da renúncia daquele ano (BRASIL, 2026b). A evidência sobre o destino é mista. Quando a busca de patrocinador passou para antes da comissão, a parcela da RMGV no valor habilitado atribuível a um município caiu de 74% (ciclo 2024) para 57% (2025). Projetos que pediram exatamente o teto de R$ 500 mil foram executados com mais frequência que os menores. Esses fatos têm explicações que não dependem da marca: quem já tem patrocinador acertado pede o teto, e quem já captou tem rede e experiência. Daí a premissa ficar contestada.</w:t>
+        <w:t xml:space="preserve">, 2020). Entre as companhias abertas brasileiras, a chance de patrocinar cultura cresce com o porte da empresa e com a concentração do setor (ALCÂNTARA; BENEDICTO; SILVA, 2019). Das 26 empresas que patrocinaram em 2025, 13 também aparecem como incentivadoras da Lei Rouanet, e elas responderam por 86% da renúncia daquele ano (BRASIL, 2026b). A evidência sobre o destino é mista. Quando a busca de patrocinador passou para antes da comissão, a parcela da RMGV no valor habilitado atribuível a um município caiu de 74% (ciclo 2024) para 57% (2025). Projetos que pediram exatamente o teto de R$ 500 mil foram executados com mais frequência que os menores. Esses fatos têm explicações que não dependem da marca: quem já tem patrocinador acertado pede o teto, e quem já captou tem rede e experiência. Daí a premissa ficar contestada.</w:t>
       </w:r>
     </w:p>
     <w:p>
@@ -2460,7 +2460,7 @@
         <w:pStyle w:val="FirstParagraph"/>
       </w:pPr>
       <w:r>
-        <w:t xml:space="preserve">No material do J-PAL, premissas e riscos podem ser perguntas de pesquisa. Das premissas do Quadro 2 derivamos três perguntas de avaliação (Quadro 3), escritas na notação de resultados potenciais. Seja</w:t>
+        <w:t xml:space="preserve">Como no material do J-PAL, as premissas do Quadro 2 viram perguntas de pesquisa: três perguntas de avaliação (Quadro 3), na notação de resultados potenciais. Seja</w:t>
       </w:r>
       <w:r>
         <w:t xml:space="preserve"> </w:t>
@@ -3113,7 +3113,7 @@
         <w:pStyle w:val="BodyText"/>
       </w:pPr>
       <w:r>
-        <w:t xml:space="preserve">O EMPT é o parâmetro indicado quando a participação é voluntária, e aqui ela é voluntária dos dois lados, do proponente e da empresa.</w:t>
+        <w:t xml:space="preserve">O EMPT é o parâmetro indicado porque a participação é voluntária, do proponente e da empresa.</w:t>
       </w:r>
     </w:p>
     <w:bookmarkEnd w:id="21"/>
@@ -3166,7 +3166,7 @@
         <w:t xml:space="preserve"> </w:t>
       </w:r>
       <w:r>
-        <w:t xml:space="preserve">Em 2023 e 2024, os termos validados pouco antes do esgotamento do teto e os indeferidos logo depois tinham, todos, patrocinador disposto. Se a ordem de chegada não depender das características do projeto, o que se testa pelo balanço dos observáveis, a comparação é quase experimental. Os 95 habilitados que expiraram sem captar, comparados aos que captaram com diferenças em diferenças e pareamento dentro do ciclo, delimitam o efeito sem afastar a seleção. O SALIC mostra se as mesmas empresas deixaram de patrocinar pela Rouanet ao entrar na LICC (substituição).</w:t>
+        <w:t xml:space="preserve">Em 2023 e 2024, os termos validados pouco antes do esgotamento do teto e os indeferidos logo depois tinham, todos, patrocinador disposto. Se a ordem de chegada não depender das características do projeto, o que se testa pelo balanço dos observáveis, a comparação é quase experimental. Os 95 habilitados que expiraram sem captar, comparados aos que captaram com diferenças em diferenças e pareamento dentro do ciclo (o desenho de Colombo e Cruz, 2023), delimitam o efeito sem afastar a seleção. O SALIC mostra se as mesmas empresas deixaram de patrocinar pela Rouanet ao entrar na LICC (substituição).</w:t>
       </w:r>
     </w:p>
     <w:p>
@@ -4107,17 +4107,11 @@
         <w:pStyle w:val="FirstParagraph"/>
       </w:pPr>
       <w:r>
-        <w:t xml:space="preserve">A fórmula segue o material da disciplina (DJIMEU; HOUNDOLO, 2016), com α = 5% bicaudal e poder de 80%. Nela:</w:t>
-      </w:r>
-    </w:p>
-    <w:p>
-      <w:pPr>
-        <w:pStyle w:val="Compact"/>
-        <w:numPr>
-          <w:ilvl w:val="0"/>
-          <w:numId w:val="1002"/>
-        </w:numPr>
-      </w:pPr>
+        <w:t xml:space="preserve">A fórmula segue o material da disciplina (DJIMEU; HOUNDOLO, 2016), com α = 5% bicaudal e poder de 80%. Nela,</w:t>
+      </w:r>
+      <w:r>
+        <w:t xml:space="preserve"> </w:t>
+      </w:r>
       <m:oMath>
         <m:sSub>
           <m:e>
@@ -4136,17 +4130,11 @@
         <w:t xml:space="preserve"> </w:t>
       </w:r>
       <w:r>
-        <w:t xml:space="preserve">é a proporção no grupo de comparação;</w:t>
-      </w:r>
-    </w:p>
-    <w:p>
-      <w:pPr>
-        <w:pStyle w:val="Compact"/>
-        <w:numPr>
-          <w:ilvl w:val="0"/>
-          <w:numId w:val="1002"/>
-        </w:numPr>
-      </w:pPr>
+        <w:t xml:space="preserve">é a proporção no grupo de comparação,</w:t>
+      </w:r>
+      <w:r>
+        <w:t xml:space="preserve"> </w:t>
+      </w:r>
       <m:oMath>
         <m:r>
           <m:t>T</m:t>
@@ -4156,7 +4144,7 @@
         <w:t xml:space="preserve"> </w:t>
       </w:r>
       <w:r>
-        <w:t xml:space="preserve">é a fração tratada e</w:t>
+        <w:t xml:space="preserve">a fração tratada,</w:t>
       </w:r>
       <w:r>
         <w:t xml:space="preserve"> </w:t>
@@ -4170,19 +4158,7 @@
         <w:t xml:space="preserve"> </w:t>
       </w:r>
       <w:r>
-        <w:t xml:space="preserve">o número de unidades;</w:t>
-      </w:r>
-    </w:p>
-    <w:p>
-      <w:pPr>
-        <w:pStyle w:val="Compact"/>
-        <w:numPr>
-          <w:ilvl w:val="0"/>
-          <w:numId w:val="1002"/>
-        </w:numPr>
-      </w:pPr>
-      <w:r>
-        <w:t xml:space="preserve">o último termo é o efeito do desenho quando as unidades vêm em grupos (projetos de um mesmo proponente, agentes de um mesmo município), com tamanho médio</w:t>
+        <w:t xml:space="preserve">o número de unidades, e o último termo é o efeito do desenho quando as unidades vêm em grupos (projetos de um mesmo proponente, agentes de um mesmo município), com tamanho médio</w:t>
       </w:r>
       <w:r>
         <w:t xml:space="preserve"> </w:t>
@@ -4231,15 +4207,7 @@
         <w:t xml:space="preserve"> </w:t>
       </w:r>
       <w:r>
-        <w:t xml:space="preserve">(ELDRIDGE; ASHBY; KERRY, 2006).</w:t>
-      </w:r>
-    </w:p>
-    <w:p>
-      <w:pPr>
-        <w:pStyle w:val="FirstParagraph"/>
-      </w:pPr>
-      <w:r>
-        <w:t xml:space="preserve">Com conglomerados sorteados, usa-se a forma equivalente por número de conglomerados. A Tabela 2 reporta os cenários.</w:t>
+        <w:t xml:space="preserve">(ELDRIDGE; ASHBY; KERRY, 2006). Com conglomerados sorteados, usa-se a forma equivalente por número de conglomerados. A Tabela 2 reporta os cenários.</w:t>
       </w:r>
       <w:r>
         <w:t xml:space="preserve"> </w:t>
@@ -4925,7 +4893,7 @@
         <w:pStyle w:val="FirstParagraph"/>
       </w:pPr>
       <w:r>
-        <w:t xml:space="preserve">A primeira ameaça à validade interna é a violação da hipótese de ausência de interferência entre unidades (SUTVA): com o teto fixo, o que um projeto capta falta a outro. Seguem-se a substituição (quem não capta pode executar com outra fonte, por isso o SALIC entra como resultado), a seleção por fatores que mudam no tempo, os eventos externos do período (Lei Paulo Gustavo e Política Nacional Aldir Blanc) e o atrito dos dados: projeto sem registro não é projeto que não aconteceu. A validade externa é limitada. As comparações de H1b valem para o regime de 2022-2024, em que a habilitação precedia a busca por patrocinador. Desde 2025 essa ordem se inverteu e os expirados quase desapareceram (3 em 56 resolvidos no ciclo 2025). No plano ético, nenhum desenho nega ou adia o acesso de elegíveis, e a oferta de apoio só acrescenta informação. O uso de dados identificados exige anonimização, conforme a LGPD, e uma pesquisa com o público exigiria aprovação de comitê de ética.</w:t>
+        <w:t xml:space="preserve">A primeira ameaça à validade interna é a violação da hipótese de ausência de interferência entre unidades (SUTVA): com o teto fixo, o que um projeto capta falta a outro. Seguem-se a substituição (quem não capta pode executar com outra fonte; o SALIC entra como resultado), a seleção por fatores que mudam no tempo, os eventos externos do período (Lei Paulo Gustavo e Política Nacional Aldir Blanc) e o atrito dos dados: projeto sem registro não é projeto que não aconteceu. A validade externa é limitada. As comparações de H1b valem para o regime de 2022-2024, em que a habilitação precedia a busca por patrocinador. Desde 2025 essa ordem se inverteu e os expirados quase desapareceram (3 em 56 resolvidos no ciclo 2025). No plano ético, nenhum desenho nega ou adia o acesso de elegíveis, e a oferta de apoio só acrescenta informação. O uso de dados identificados exige anonimização, conforme a LGPD, e uma pesquisa com o público exigiria aprovação de comitê de ética.</w:t>
       </w:r>
     </w:p>
     <w:bookmarkEnd w:id="25"/>
@@ -4944,23 +4912,23 @@
         <w:pStyle w:val="FirstParagraph"/>
       </w:pPr>
       <w:r>
-        <w:t xml:space="preserve">A LICC é um gasto tributário de crescimento rápido, sem problema declarado, sem objetivos mensuráveis e sem previsão de avaliação. Nela o Estado define quem pode receber e as empresas decidem quem recebe. A teoria da mudança reconstruída mostra onde isso pesa. A habilitação qualifica, mas não prioriza, e o racionamento no teto segue a ordem de chegada: duas premissas de critério que o desenho não atende. A premissa de que as empresas escolheriam projetos alinhados aos objetivos públicos é contestada. O financiamento vem de poucas empresas de serviços regulados, mas a escolha não mostra viés territorial forte. A entrada e a entrega, os dois extremos da cadeia, são indeterminadas porque a SECULT não publica os inscritos nem o público alcançado.</w:t>
-      </w:r>
-    </w:p>
-    <w:p>
-      <w:pPr>
-        <w:pStyle w:val="BodyText"/>
-      </w:pPr>
-      <w:r>
-        <w:t xml:space="preserve">Sem mexer no mecanismo, fora do escopo deste trabalho, há recomendações que dependem só da gestão: declarar objetivos, metas e indicadores; publicar os inscritos e os motivos de inabilitação; publicar, por projeto, o CNPJ do proponente, a sede, a captação por cota e as datas; e agregar e publicar as contrapartidas executadas e o público, como a própria lei já exige para os benefícios concedidos.</w:t>
-      </w:r>
-    </w:p>
-    <w:p>
-      <w:pPr>
-        <w:pStyle w:val="BodyText"/>
-      </w:pPr>
-      <w:r>
-        <w:t xml:space="preserve">A proposta de avaliação transforma as premissas em três perguntas: a adicionalidade do financiamento (H1b), identificável pelo racionamento no teto e pelos habilitados que não captaram; o efeito do atrito na entrada (H3), identificável por uma oferta sorteada de apoio à inscrição, com bom poder; e o papel da avaliação da SECULT (H2a), que, sem nota no parecer, fica descritivo. As limitações são as dos dados. A situação publicada serve de aproximação para a captação, a estreia é medida por nome de proponente, e o retrato territorial cobre 74% do valor.</w:t>
+        <w:t xml:space="preserve">A LICC é um gasto tributário de crescimento rápido, sem problema declarado, sem objetivos mensuráveis e sem previsão de avaliação, em que o Estado define quem pode receber e as empresas decidem quem recebe. Duas premissas de critério não são atendidas pelo desenho: a habilitação qualifica sem priorizar, e o racionamento no teto segue a ordem de chegada. A escolha pelas empresas é contestada: o financiamento vem de poucas empresas de serviços regulados, mas sem viés territorial forte. A entrada e a entrega, os extremos da cadeia, são indeterminadas, porque a SECULT não publica os inscritos nem o público alcançado.</w:t>
+      </w:r>
+    </w:p>
+    <w:p>
+      <w:pPr>
+        <w:pStyle w:val="BodyText"/>
+      </w:pPr>
+      <w:r>
+        <w:t xml:space="preserve">Sem mexer no mecanismo, há recomendações que dependem só da gestão: declarar objetivos, metas e indicadores; publicar os inscritos e os motivos de inabilitação; publicar, por projeto, o CNPJ do proponente, a sede, a captação por cota e as datas; e publicar as contrapartidas executadas e o público alcançado.</w:t>
+      </w:r>
+    </w:p>
+    <w:p>
+      <w:pPr>
+        <w:pStyle w:val="BodyText"/>
+      </w:pPr>
+      <w:r>
+        <w:t xml:space="preserve">A proposta de avaliação transforma as premissas em três perguntas: a adicionalidade do financiamento (H1b), pelo racionamento no teto e pelos habilitados que não captaram; o efeito do atrito na entrada (H3), por uma oferta sorteada de apoio à inscrição, com bom poder; e o papel da avaliação da SECULT (H2a), descritivo porque o parecer não dá nota. As limitações são as dos dados. A situação publicada serve de aproximação para a captação, a estreia é medida por nome de proponente, e o retrato territorial cobre 74% do valor.</w:t>
       </w:r>
     </w:p>
     <w:bookmarkEnd w:id="27"/>
@@ -4978,6 +4946,27 @@
         <w:pStyle w:val="FirstParagraph"/>
       </w:pPr>
       <w:r>
+        <w:t xml:space="preserve">ALCÂNTARA, Jessica Nunes de; BENEDICTO, Gideon Carvalho de; SILVA, Sabrina Soares da. Possible key factors for Brazilian publicly traded companies to adopt a sponsorship strategy.</w:t>
+      </w:r>
+      <w:r>
+        <w:t xml:space="preserve"> </w:t>
+      </w:r>
+      <w:r>
+        <w:rPr>
+          <w:b/>
+          <w:bCs/>
+        </w:rPr>
+        <w:t xml:space="preserve">Journal of Strategy and Management</w:t>
+      </w:r>
+      <w:r>
+        <w:t xml:space="preserve">, v. 12, n. 4, p. 429-446, 2019. DOI: 10.1108/JSMA-04-2018-0029.</w:t>
+      </w:r>
+    </w:p>
+    <w:p>
+      <w:pPr>
+        <w:pStyle w:val="BodyText"/>
+      </w:pPr>
+      <w:r>
         <w:t xml:space="preserve">ANGRIST, Joshua D.; IMBENS, Guido W.; RUBIN, Donald B. Identification of causal effects using instrumental variables.</w:t>
       </w:r>
       <w:r>
@@ -4992,6 +4981,27 @@
       </w:r>
       <w:r>
         <w:t xml:space="preserve">, v. 91, n. 434, p. 444-455, 1996. DOI: 10.1080/01621459.1996.10476902.</w:t>
+      </w:r>
+    </w:p>
+    <w:p>
+      <w:pPr>
+        <w:pStyle w:val="BodyText"/>
+      </w:pPr>
+      <w:r>
+        <w:t xml:space="preserve">BAIRD, Sarah; BOHREN, J. Aislinn; McINTOSH, Craig; ÖZLER, Berk. Optimal design of experiments in the presence of interference.</w:t>
+      </w:r>
+      <w:r>
+        <w:t xml:space="preserve"> </w:t>
+      </w:r>
+      <w:r>
+        <w:rPr>
+          <w:b/>
+          <w:bCs/>
+        </w:rPr>
+        <w:t xml:space="preserve">The Review of Economics and Statistics</w:t>
+      </w:r>
+      <w:r>
+        <w:t xml:space="preserve">, v. 100, n. 5, p. 844-860, 2018. DOI: 10.1162/rest_a_00716.</w:t>
       </w:r>
     </w:p>
     <w:p>
@@ -5033,27 +5043,6 @@
         <w:pStyle w:val="BodyText"/>
       </w:pPr>
       <w:r>
-        <w:t xml:space="preserve">BAIRD, Sarah; BOHREN, J. Aislinn; McINTOSH, Craig; ÖZLER, Berk. Optimal design of experiments in the presence of interference.</w:t>
-      </w:r>
-      <w:r>
-        <w:t xml:space="preserve"> </w:t>
-      </w:r>
-      <w:r>
-        <w:rPr>
-          <w:b/>
-          <w:bCs/>
-        </w:rPr>
-        <w:t xml:space="preserve">The Review of Economics and Statistics</w:t>
-      </w:r>
-      <w:r>
-        <w:t xml:space="preserve">, v. 100, n. 5, p. 844-860, 2018. DOI: 10.1162/rest_a_00716.</w:t>
-      </w:r>
-    </w:p>
-    <w:p>
-      <w:pPr>
-        <w:pStyle w:val="BodyText"/>
-      </w:pPr>
-      <w:r>
         <w:t xml:space="preserve">BAUMOL, William J.; BOWEN, William G.</w:t>
       </w:r>
       <w:r>
@@ -5287,6 +5276,27 @@
       </w:r>
       <w:r>
         <w:t xml:space="preserve">, v. 77, p. 315-339, 2019. DOI: 10.1016/j.regsciurbeco.2019.06.002.</w:t>
+      </w:r>
+    </w:p>
+    <w:p>
+      <w:pPr>
+        <w:pStyle w:val="BodyText"/>
+      </w:pPr>
+      <w:r>
+        <w:t xml:space="preserve">COLOMBO, Daniel Gama e; CRUZ, Hélio Nogueira da. Impact assessment of innovation tax incentives in Brazil.</w:t>
+      </w:r>
+      <w:r>
+        <w:t xml:space="preserve"> </w:t>
+      </w:r>
+      <w:r>
+        <w:rPr>
+          <w:b/>
+          <w:bCs/>
+        </w:rPr>
+        <w:t xml:space="preserve">Innovation &amp; Management Review</w:t>
+      </w:r>
+      <w:r>
+        <w:t xml:space="preserve">, v. 20, n. 1, p. 28-42, 2023. DOI: 10.1108/INMR-11-2020-0167.</w:t>
       </w:r>
     </w:p>
     <w:p>
@@ -5748,7 +5758,7 @@
         <w:pStyle w:val="BodyText"/>
       </w:pPr>
       <w:r>
-        <w:t xml:space="preserve">SECULT – SECRETARIA DE ESTADO DA CULTURA DO ESPÍRITO SANTO. Portaria nº 078, de 31 de julho de 2024. Introduz alterações no artigo 12 da Instrução Normativa nº 001 de 31 de janeiro de 2024 e traz outras diretrizes. Vitória: SECULT, 2024b. Disponível em: https://secult.es.gov.br/media/2024/PORTARIA_SECULT_N%C2%BA_078%2C_DE_31_DE_JULHO_DE_2024.pdf. Acesso em: 23 set. 2026.</w:t>
+        <w:t xml:space="preserve">SECULT – SECRETARIA DE ESTADO DA CULTURA DO ESPÍRITO SANTO. Portaria nº 078, de 31 de julho de 2024. Introduz alterações no artigo 12 da Instrução Normativa nº 001 de 31 de janeiro de 2024. Vitória: SECULT, 2024b. Disponível em: https://secult.es.gov.br/media/2024/PORTARIA_SECULT_N%C2%BA_078%2C_DE_31_DE_JULHO_DE_2024.pdf. Acesso em: 23 set. 2026.</w:t>
       </w:r>
     </w:p>
     <w:p>
@@ -5865,7 +5875,7 @@
         <w:t xml:space="preserve">Cultura em Dados</w:t>
       </w:r>
       <w:r>
-        <w:t xml:space="preserve">: evento apresenta resultados de pesquisa sobre a Lei de Incentivo à Cultura Capixaba (LICC) e o Boletim da Economia Criativa. Vitória: SECULT, 2026d. Disponível em: https://secult.es.gov.br/cultura-em-dados-evento-apresenta-resultados-de-pesquisa-sobre-a-lei-de-incentivo-a-cultura-capixaba-licc-e-o-boletim-da-economia-criativa. Acesso em: 24 set. 2026. [VERIFICAR: conteúdo lido só pelo resumo do buscador; a página não abriu na coleta automática.]</w:t>
+        <w:t xml:space="preserve">: evento apresenta resultados de pesquisa sobre a Lei de Incentivo à Cultura Capixaba (LICC) e o Boletim da Economia Criativa. Vitória: SECULT, 2026d. Disponível em: https://secult.es.gov.br/cultura-em-dados-evento-apresenta-resultados-de-pesquisa-sobre-a-lei-de-incentivo-a-cultura-capixaba-licc-e-o-boletim-da-economia-criativa. Acesso em: 24 set. 2026. [VERIFICAR: página lida só pelo resumo do buscador.]</w:t>
       </w:r>
     </w:p>
     <w:p>
@@ -6130,7 +6140,7 @@
         <w:pStyle w:val="FirstParagraph"/>
       </w:pPr>
       <w:r>
-        <w:t xml:space="preserve">[Adequar ao modelo anexo às instruções da disciplina.] Os autores utilizaram ferramenta de inteligência artificial generativa (Claude, da Anthropic) como apoio na organização dos dados, na programação dos scripts de análise e das figuras, na busca e conferência de referências e na redação de versões preliminares do texto, conforme a Portaria CNPq nº 2.664/2026. Todo o conteúdo foi revisado pelos autores, que assumem integral responsabilidade pelos dados, análises e conclusões. Dados e scripts estão no repositório citado.</w:t>
+        <w:t xml:space="preserve">[Adequar ao modelo anexo às instruções da disciplina.] Os autores utilizaram ferramenta de inteligência artificial generativa (Claude, da Anthropic) como apoio na organização dos dados, na programação dos scripts de análise e das figuras, na busca e conferência de referências e na redação de versões preliminares do texto, conforme a Portaria CNPq nº 2.664/2026. Todo o conteúdo foi revisado pelos autores, que assumem integral responsabilidade pelos dados, análises e conclusões.</w:t>
       </w:r>
     </w:p>
     <w:bookmarkEnd w:id="29"/>
@@ -6179,7 +6189,7 @@
         <w:t xml:space="preserve"> </w:t>
       </w:r>
       <w:r>
-        <w:t xml:space="preserve">Para 2022, a Portaria SEFAZ nº 09-R fixou R$ 10 milhões; o anexo de captação de 2022 da SECULT informa R$ 15 milhões disponíveis e R$ 11,5 milhões em termos validados. Não localizamos o ato de ampliação, e o montante de 2022 fica indeterminado entre os dois valores.</w:t>
+        <w:t xml:space="preserve">Para 2022, a Portaria SEFAZ nº 09-R fixou R$ 10 milhões, e o anexo de captação da SECULT informa R$ 15 milhões disponíveis (R$ 11,5 milhões validados). Sem o ato de ampliação, o montante de 2022 fica indeterminado entre os dois valores.</w:t>
       </w:r>
     </w:p>
   </w:footnote>
@@ -6213,22 +6223,10 @@
         <w:t xml:space="preserve"> </w:t>
       </w:r>
       <w:r>
-        <w:t xml:space="preserve">“Recurso financeiro captado - 2025”</w:t>
-      </w:r>
-      <w:r>
-        <w:t xml:space="preserve">), dos anexos</w:t>
-      </w:r>
-      <w:r>
-        <w:t xml:space="preserve"> </w:t>
-      </w:r>
-      <w:r>
         <w:t xml:space="preserve">“Recurso financeiro captado”</w:t>
       </w:r>
       <w:r>
-        <w:t xml:space="preserve"> </w:t>
-      </w:r>
-      <w:r>
-        <w:t xml:space="preserve">de 2022 a 2026, de bases públicas do IBGE, do Tesouro Nacional (SICONFI) e do Ministério da Cultura (SALIC). A lista de habilitados foi transcrita na versão disponível em 3 set. 2026 (repositório licc.gov); a SECULT atualizou o arquivo em 10 set. 2026, e os status publicados podem ter mudado desde então. Dados, scripts e tabelas estão em</w:t>
+        <w:t xml:space="preserve">, de 2022 a 2026), de bases públicas do IBGE, do Tesouro Nacional (SICONFI) e do Ministério da Cultura (SALIC). A lista de habilitados foi transcrita na versão disponível em 3 set. 2026 (repositório licc.gov); a SECULT atualizou o arquivo em 10 set. 2026, e os status publicados podem ter mudado desde então. Dados, scripts e tabelas estão em</w:t>
       </w:r>
       <w:r>
         <w:t xml:space="preserve"> </w:t>
@@ -6473,9 +6471,6 @@
     <w:abstractNumId w:val="990"/>
   </w:num>
   <w:num w:numId="1001">
-    <w:abstractNumId w:val="991"/>
-  </w:num>
-  <w:num w:numId="1002">
     <w:abstractNumId w:val="991"/>
   </w:num>
 </w:numbering>

</xml_diff>

<commit_message>
Artigo: introdução auditada, separando teto, captação e demanda habilitada
- 'montante anual de renúncia' passa a 'teto anual de captação, o montante fixado pela SEFAZ' (Lei 7.000/2001,
  art. 5º-B, IX, c); crédito 'correspondente ao valor', como na lei
- R$ 184 mi fica explícito como soma do valor autorizado dos 463 projetos dos cinco ciclos de habilitação, acima da
  soma dos tetos de 2022-2026 (no máximo R$ 111 mi); '459 com valor válido' (3 com R$ 500,00 impresso)
- 2025: 62 validados + 1 em análise = 63; nota de 2022 cita o Portal da Transparência (mesmo R$ 15 mi atribuído à
  Portaria 09-R)
- checagens D06 e N45 ajustadas, D06b e D65b novas (60/60); Tabela 1 depois do Quadro 2 para ele caber numa página;
  15 páginas

Co-Authored-By: Claude Opus 5.5 <noreply@anthropic.com>
Claude-Session: https://claude.ai/code/session_01XEaG1GvUXhdfnXot6AtJxa
</commit_message>
<xml_diff>
--- a/artigo/rascunho-artigo.docx
+++ b/artigo/rascunho-artigo.docx
@@ -76,7 +76,7 @@
         <w:pStyle w:val="FirstParagraph"/>
       </w:pPr>
       <w:r>
-        <w:t xml:space="preserve">A Lei estadual nº 11.246/2021 incluiu na lei do ICMS um crédito presumido igual ao valor que o contribuinte destina a projetos culturais credenciados pela Secretaria da Cultura (SECULT), com efeitos a partir de 2022 (ESPÍRITO SANTO, 2021a). A Lei de Incentivo à Cultura Capixaba, como o mecanismo passou a ser chamado no regulamento (ESPÍRITO SANTO, 2021b), cresceu rapidamente: o montante anual de renúncia passou de R$ 15 milhões em 2023 para R$ 31 milhões em 2026,</w:t>
+        <w:t xml:space="preserve">A Lei estadual nº 11.246/2021 incluiu na lei do ICMS um crédito presumido correspondente ao valor que o contribuinte destina a projetos culturais credenciados pela Secretaria da Cultura (SECULT), com efeitos a partir de 2022 (ESPÍRITO SANTO, 2021a). A Lei de Incentivo à Cultura Capixaba, como o mecanismo passou a ser chamado no regulamento (ESPÍRITO SANTO, 2021b), cresceu rapidamente: o teto anual de captação, o montante fixado pela SEFAZ, passou de R$ 15 milhões em 2023 para R$ 31 milhões em 2026.</w:t>
       </w:r>
       <w:r>
         <w:rPr>
@@ -88,7 +88,7 @@
         <w:t xml:space="preserve"> </w:t>
       </w:r>
       <w:r>
-        <w:t xml:space="preserve">e 463 projetos foram habilitados a captar R$ 184 milhões nos cinco ciclos (459 com valor publicado). De 2023 a 2025, os termos listados pela SECULT somam exatamente o montante de cada ano; em 2025, 62 projetos validados somam R$ 24,64 milhões, e um ainda</w:t>
+        <w:t xml:space="preserve">De 2023 a 2025, a captação esgotou o teto: os termos de patrocínio listados pela SECULT somam exatamente o montante de cada ano (em 2025, 62 projetos validados somam R$ 24,64 milhões, e um ainda</w:t>
       </w:r>
       <w:r>
         <w:t xml:space="preserve"> </w:t>
@@ -100,7 +100,7 @@
         <w:t xml:space="preserve"> </w:t>
       </w:r>
       <w:r>
-        <w:t xml:space="preserve">completa os R$ 25 milhões (os demais números de 2025 usam o anexo inteiro).</w:t>
+        <w:t xml:space="preserve">completa os R$ 25 milhões; os números de 2025 contam os 63). A demanda supera o teto: nos cinco ciclos de habilitação (2022-2026), 463 projetos foram autorizados a captar, somados, R$ 184 milhões (459 com valor válido), acima da soma dos tetos do período, de no máximo R$ 111 milhões.</w:t>
       </w:r>
       <w:r>
         <w:rPr>
@@ -156,7 +156,7 @@
         <w:t xml:space="preserve">como ela está</w:t>
       </w:r>
       <w:r>
-        <w:t xml:space="preserve">, sem propor redesenho do mecanismo, e estruturar uma avaliação de impacto, com desenho amostral, fontes de dados e cálculo de poder. A seção 2 caracteriza a política; a seção 3 revisa a literatura; a seção 4 reconstrói a teoria da mudança e audita suas premissas; a seção 5 transforma as premissas em perguntas de avaliação de impacto; a seção 6 conclui.</w:t>
+        <w:t xml:space="preserve">, sem propor redesenho do mecanismo, e estruturar uma avaliação de impacto, com desenho amostral, fontes de dados e cálculo de poder. A seção 2 caracteriza a política, a 3 revisa a literatura, a 4 reconstrói e audita a teoria da mudança, a 5 propõe a avaliação de impacto e a 6 conclui.</w:t>
       </w:r>
     </w:p>
     <w:bookmarkEnd w:id="12"/>
@@ -1331,514 +1331,6 @@
         <w:rPr>
           <w:b/>
         </w:rPr>
-        <w:t>Tabela 1</w:t>
-      </w:r>
-      <w:r>
-        <w:rPr>
-          <w:b w:val="0"/>
-        </w:rPr>
-        <w:t xml:space="preserve"> – Funil de atrito da LICC</w:t>
-      </w:r>
-    </w:p>
-    <w:tbl>
-      <w:tblPr>
-        <w:tblStyle w:val="Table"/>
-        <w:tblW w:type="pct" w:w="5000"/>
-        <w:jc w:val="center"/>
-        <w:tblLayout w:type="fixed"/>
-        <w:tblLook w:firstRow="1" w:lastRow="0" w:firstColumn="0" w:lastColumn="0" w:noHBand="0" w:noVBand="0" w:val="0020"/>
-        <w:tblBorders>
-          <w:top w:val="single" w:sz="8" w:space="0" w:color="000000"/>
-          <w:bottom w:val="single" w:sz="8" w:space="0" w:color="000000"/>
-          <w:left w:val="nil"/>
-          <w:right w:val="nil"/>
-          <w:insideH w:val="nil"/>
-          <w:insideV w:val="nil"/>
-        </w:tblBorders>
-      </w:tblPr>
-      <w:tblGrid>
-        <w:gridCol w:w="4054"/>
-        <w:gridCol w:w="2545"/>
-        <w:gridCol w:w="1320"/>
-      </w:tblGrid>
-      <w:tr>
-        <w:trPr>
-          <w:tblHeader w:val="on"/>
-          <w:tblHeader w:val="true"/>
-        </w:trPr>
-        <w:tc>
-          <w:tcPr>
-            <w:tcBorders>
-              <w:bottom w:val="single" w:sz="4" w:space="0" w:color="000000"/>
-            </w:tcBorders>
-          </w:tcPr>
-          <w:p>
-            <w:pPr>
-              <w:pStyle w:val="Compact"/>
-              <w:keepNext/>
-              <w:spacing w:after="0" w:before="0"/>
-              <w:jc w:val="left"/>
-            </w:pPr>
-            <w:r>
-              <w:rPr>
-                <w:sz w:val="20"/>
-              </w:rPr>
-              <w:t xml:space="preserve">Etapa</w:t>
-            </w:r>
-          </w:p>
-        </w:tc>
-        <w:tc>
-          <w:tcPr>
-            <w:tcBorders>
-              <w:bottom w:val="single" w:sz="4" w:space="0" w:color="000000"/>
-            </w:tcBorders>
-          </w:tcPr>
-          <w:p>
-            <w:pPr>
-              <w:pStyle w:val="Compact"/>
-              <w:keepNext/>
-              <w:spacing w:after="0" w:before="0"/>
-              <w:jc w:val="left"/>
-            </w:pPr>
-            <w:r>
-              <w:rPr>
-                <w:sz w:val="20"/>
-              </w:rPr>
-              <w:t xml:space="preserve">Valor</w:t>
-            </w:r>
-          </w:p>
-        </w:tc>
-        <w:tc>
-          <w:tcPr>
-            <w:tcBorders>
-              <w:bottom w:val="single" w:sz="4" w:space="0" w:color="000000"/>
-            </w:tcBorders>
-          </w:tcPr>
-          <w:p>
-            <w:pPr>
-              <w:pStyle w:val="Compact"/>
-              <w:keepNext/>
-              <w:spacing w:after="0" w:before="0"/>
-              <w:jc w:val="left"/>
-            </w:pPr>
-            <w:r>
-              <w:rPr>
-                <w:sz w:val="20"/>
-              </w:rPr>
-              <w:t xml:space="preserve">Período</w:t>
-            </w:r>
-          </w:p>
-        </w:tc>
-      </w:tr>
-      <w:tr>
-        <w:tc>
-          <w:tcPr/>
-          <w:p>
-            <w:pPr>
-              <w:pStyle w:val="Compact"/>
-              <w:keepNext/>
-              <w:spacing w:after="0" w:before="0"/>
-              <w:jc w:val="left"/>
-            </w:pPr>
-            <w:r>
-              <w:rPr>
-                <w:sz w:val="20"/>
-              </w:rPr>
-              <w:t xml:space="preserve">Agentes culturais cadastrados no Mapa Cultural (coletivos)</w:t>
-            </w:r>
-          </w:p>
-        </w:tc>
-        <w:tc>
-          <w:tcPr/>
-          <w:p>
-            <w:pPr>
-              <w:pStyle w:val="Compact"/>
-              <w:keepNext/>
-              <w:spacing w:after="0" w:before="0"/>
-              <w:jc w:val="left"/>
-            </w:pPr>
-            <w:r>
-              <w:rPr>
-                <w:sz w:val="20"/>
-              </w:rPr>
-              <w:t xml:space="preserve">25.441 (2.592)</w:t>
-            </w:r>
-          </w:p>
-        </w:tc>
-        <w:tc>
-          <w:tcPr/>
-          <w:p>
-            <w:pPr>
-              <w:pStyle w:val="Compact"/>
-              <w:keepNext/>
-              <w:spacing w:after="0" w:before="0"/>
-              <w:jc w:val="left"/>
-            </w:pPr>
-            <w:r>
-              <w:rPr>
-                <w:sz w:val="20"/>
-              </w:rPr>
-              <w:t xml:space="preserve">set. 2026</w:t>
-            </w:r>
-          </w:p>
-        </w:tc>
-      </w:tr>
-      <w:tr>
-        <w:tc>
-          <w:tcPr/>
-          <w:p>
-            <w:pPr>
-              <w:pStyle w:val="Compact"/>
-              <w:keepNext/>
-              <w:spacing w:after="0" w:before="0"/>
-              <w:jc w:val="left"/>
-            </w:pPr>
-            <w:r>
-              <w:rPr>
-                <w:sz w:val="20"/>
-              </w:rPr>
-              <w:t xml:space="preserve">Projetos inscritos</w:t>
-            </w:r>
-          </w:p>
-        </w:tc>
-        <w:tc>
-          <w:tcPr/>
-          <w:p>
-            <w:pPr>
-              <w:pStyle w:val="Compact"/>
-              <w:keepNext/>
-              <w:spacing w:after="0" w:before="0"/>
-              <w:jc w:val="left"/>
-            </w:pPr>
-            <w:r>
-              <w:rPr>
-                <w:sz w:val="20"/>
-              </w:rPr>
-              <w:t xml:space="preserve">não publicado</w:t>
-            </w:r>
-          </w:p>
-        </w:tc>
-        <w:tc>
-          <w:tcPr/>
-          <w:p>
-            <w:pPr>
-              <w:pStyle w:val="Compact"/>
-              <w:keepNext/>
-              <w:spacing w:after="0" w:before="0"/>
-              <w:jc w:val="left"/>
-            </w:pPr>
-            <w:r>
-              <w:rPr>
-                <w:sz w:val="20"/>
-              </w:rPr>
-              <w:t xml:space="preserve">—</w:t>
-            </w:r>
-          </w:p>
-        </w:tc>
-      </w:tr>
-      <w:tr>
-        <w:tc>
-          <w:tcPr/>
-          <w:p>
-            <w:pPr>
-              <w:pStyle w:val="Compact"/>
-              <w:keepNext/>
-              <w:spacing w:after="0" w:before="0"/>
-              <w:jc w:val="left"/>
-            </w:pPr>
-            <w:r>
-              <w:rPr>
-                <w:sz w:val="20"/>
-              </w:rPr>
-              <w:t xml:space="preserve">Projetos habilitados; proponentes por ciclo</w:t>
-            </w:r>
-          </w:p>
-        </w:tc>
-        <w:tc>
-          <w:tcPr/>
-          <w:p>
-            <w:pPr>
-              <w:pStyle w:val="Compact"/>
-              <w:keepNext/>
-              <w:spacing w:after="0" w:before="0"/>
-              <w:jc w:val="left"/>
-            </w:pPr>
-            <w:r>
-              <w:rPr>
-                <w:sz w:val="20"/>
-              </w:rPr>
-              <w:t xml:space="preserve">305; 53, 92 e 95</w:t>
-            </w:r>
-          </w:p>
-        </w:tc>
-        <w:tc>
-          <w:tcPr/>
-          <w:p>
-            <w:pPr>
-              <w:pStyle w:val="Compact"/>
-              <w:keepNext/>
-              <w:spacing w:after="0" w:before="0"/>
-              <w:jc w:val="left"/>
-            </w:pPr>
-            <w:r>
-              <w:rPr>
-                <w:sz w:val="20"/>
-              </w:rPr>
-              <w:t xml:space="preserve">ciclos 2022-2024</w:t>
-            </w:r>
-          </w:p>
-        </w:tc>
-      </w:tr>
-      <w:tr>
-        <w:tc>
-          <w:tcPr/>
-          <w:p>
-            <w:pPr>
-              <w:pStyle w:val="Compact"/>
-              <w:keepNext/>
-              <w:spacing w:after="0" w:before="0"/>
-              <w:jc w:val="left"/>
-            </w:pPr>
-            <w:r>
-              <w:rPr>
-                <w:sz w:val="20"/>
-              </w:rPr>
-              <w:t xml:space="preserve">Habilitados com situação resolvida; captaram</w:t>
-            </w:r>
-          </w:p>
-        </w:tc>
-        <w:tc>
-          <w:tcPr/>
-          <w:p>
-            <w:pPr>
-              <w:pStyle w:val="Compact"/>
-              <w:keepNext/>
-              <w:spacing w:after="0" w:before="0"/>
-              <w:jc w:val="left"/>
-            </w:pPr>
-            <w:r>
-              <w:rPr>
-                <w:sz w:val="20"/>
-              </w:rPr>
-              <w:t xml:space="preserve">293; 198</w:t>
-            </w:r>
-          </w:p>
-        </w:tc>
-        <w:tc>
-          <w:tcPr/>
-          <w:p>
-            <w:pPr>
-              <w:pStyle w:val="Compact"/>
-              <w:keepNext/>
-              <w:spacing w:after="0" w:before="0"/>
-              <w:jc w:val="left"/>
-            </w:pPr>
-            <w:r>
-              <w:rPr>
-                <w:sz w:val="20"/>
-              </w:rPr>
-              <w:t xml:space="preserve">ciclos 2022-2024</w:t>
-            </w:r>
-          </w:p>
-        </w:tc>
-      </w:tr>
-      <w:tr>
-        <w:tc>
-          <w:tcPr/>
-          <w:p>
-            <w:pPr>
-              <w:pStyle w:val="Compact"/>
-              <w:keepNext/>
-              <w:spacing w:after="0" w:before="0"/>
-              <w:jc w:val="left"/>
-            </w:pPr>
-            <w:r>
-              <w:rPr>
-                <w:sz w:val="20"/>
-              </w:rPr>
-              <w:t xml:space="preserve">Valor com patrocinador que coube no teto</w:t>
-            </w:r>
-          </w:p>
-        </w:tc>
-        <w:tc>
-          <w:tcPr/>
-          <w:p>
-            <w:pPr>
-              <w:pStyle w:val="Compact"/>
-              <w:keepNext/>
-              <w:spacing w:after="0" w:before="0"/>
-              <w:jc w:val="left"/>
-            </w:pPr>
-            <w:r>
-              <w:rPr>
-                <w:sz w:val="20"/>
-              </w:rPr>
-              <w:t xml:space="preserve">78%; 74%</w:t>
-            </w:r>
-          </w:p>
-        </w:tc>
-        <w:tc>
-          <w:tcPr/>
-          <w:p>
-            <w:pPr>
-              <w:pStyle w:val="Compact"/>
-              <w:keepNext/>
-              <w:spacing w:after="0" w:before="0"/>
-              <w:jc w:val="left"/>
-            </w:pPr>
-            <w:r>
-              <w:rPr>
-                <w:sz w:val="20"/>
-              </w:rPr>
-              <w:t xml:space="preserve">captação 2023; 2024</w:t>
-            </w:r>
-          </w:p>
-        </w:tc>
-      </w:tr>
-      <w:tr>
-        <w:tc>
-          <w:tcPr/>
-          <w:p>
-            <w:pPr>
-              <w:pStyle w:val="Compact"/>
-              <w:spacing w:after="0" w:before="0"/>
-              <w:jc w:val="left"/>
-            </w:pPr>
-            <w:r>
-              <w:rPr>
-                <w:sz w:val="20"/>
-              </w:rPr>
-              <w:t xml:space="preserve">Público alcançado e gratuidade</w:t>
-            </w:r>
-          </w:p>
-        </w:tc>
-        <w:tc>
-          <w:tcPr/>
-          <w:p>
-            <w:pPr>
-              <w:pStyle w:val="Compact"/>
-              <w:spacing w:after="0" w:before="0"/>
-              <w:jc w:val="left"/>
-            </w:pPr>
-            <w:r>
-              <w:rPr>
-                <w:sz w:val="20"/>
-              </w:rPr>
-              <w:t xml:space="preserve">não publicado</w:t>
-            </w:r>
-          </w:p>
-        </w:tc>
-        <w:tc>
-          <w:tcPr/>
-          <w:p>
-            <w:pPr>
-              <w:pStyle w:val="Compact"/>
-              <w:spacing w:after="0" w:before="0"/>
-              <w:jc w:val="left"/>
-            </w:pPr>
-            <w:r>
-              <w:rPr>
-                <w:sz w:val="20"/>
-              </w:rPr>
-              <w:t xml:space="preserve">—</w:t>
-            </w:r>
-          </w:p>
-        </w:tc>
-      </w:tr>
-    </w:tbl>
-    <w:p>
-      <w:pPr>
-        <w:pStyle w:val="BodyText"/>
-      </w:pPr>
-      <w:r>
-        <w:rPr>
-          <w:i/>
-          <w:sz w:val="20"/>
-        </w:rPr>
-        <w:t>Fonte</w:t>
-      </w:r>
-      <w:r>
-        <w:rPr>
-          <w:sz w:val="20"/>
-        </w:rPr>
-        <w:t>: elaboração própria com base em SECULT (2026b; 2026c) e na API pública do Mapa Cultural do Espírito Santo (SECULT, 2026d). Tabelas de origem:</w:t>
-      </w:r>
-      <w:r>
-        <w:rPr>
-          <w:sz w:val="20"/>
-        </w:rPr>
-        <w:t xml:space="preserve"> </w:t>
-      </w:r>
-      <w:hyperlink r:id="rId19">
-        <w:r>
-          <w:rPr>
-            <w:rStyle w:val="VerbatimChar"/>
-          </w:rPr>
-          <w:t xml:space="preserve">analise/tabelas/07_funil_por_ciclo.csv</w:t>
-        </w:r>
-      </w:hyperlink>
-      <w:r>
-        <w:rPr>
-          <w:sz w:val="20"/>
-        </w:rPr>
-        <w:t xml:space="preserve">,</w:t>
-      </w:r>
-      <w:r>
-        <w:rPr>
-          <w:sz w:val="20"/>
-        </w:rPr>
-        <w:t xml:space="preserve"> </w:t>
-      </w:r>
-      <w:hyperlink r:id="rId20">
-        <w:r>
-          <w:rPr>
-            <w:rStyle w:val="VerbatimChar"/>
-          </w:rPr>
-          <w:t xml:space="preserve">07_funil_captacao_anual.csv</w:t>
-        </w:r>
-      </w:hyperlink>
-      <w:r>
-        <w:rPr>
-          <w:sz w:val="20"/>
-        </w:rPr>
-        <w:t xml:space="preserve"> </w:t>
-      </w:r>
-      <w:r>
-        <w:rPr>
-          <w:sz w:val="20"/>
-        </w:rPr>
-        <w:t xml:space="preserve">e</w:t>
-      </w:r>
-      <w:r>
-        <w:rPr>
-          <w:sz w:val="20"/>
-        </w:rPr>
-        <w:t xml:space="preserve"> </w:t>
-      </w:r>
-      <w:hyperlink r:id="rId21">
-        <w:r>
-          <w:rPr>
-            <w:rStyle w:val="VerbatimChar"/>
-          </w:rPr>
-          <w:t xml:space="preserve">07_mapa_cultural_universo.csv</w:t>
-        </w:r>
-      </w:hyperlink>
-      <w:r>
-        <w:rPr>
-          <w:sz w:val="20"/>
-        </w:rPr>
-        <w:t xml:space="preserve">.</w:t>
-      </w:r>
-    </w:p>
-    <w:p>
-      <w:pPr>
-        <w:pStyle w:val="BodyText"/>
-        <w:keepNext/>
-      </w:pPr>
-      <w:r>
-        <w:rPr>
-          <w:b/>
-        </w:rPr>
         <w:t>Quadro 2</w:t>
       </w:r>
       <w:r>
@@ -2310,7 +1802,7 @@
         </w:rPr>
         <w:t xml:space="preserve"> </w:t>
       </w:r>
-      <w:hyperlink r:id="rId22">
+      <w:hyperlink r:id="rId19">
         <w:r>
           <w:rPr>
             <w:rStyle w:val="VerbatimChar"/>
@@ -2330,7 +1822,7 @@
         </w:rPr>
         <w:t xml:space="preserve"> </w:t>
       </w:r>
-      <w:hyperlink r:id="rId22">
+      <w:hyperlink r:id="rId19">
         <w:r>
           <w:rPr>
             <w:rStyle w:val="VerbatimChar"/>
@@ -2350,7 +1842,7 @@
         </w:rPr>
         <w:t xml:space="preserve"> </w:t>
       </w:r>
-      <w:hyperlink r:id="rId22">
+      <w:hyperlink r:id="rId19">
         <w:r>
           <w:rPr>
             <w:rStyle w:val="VerbatimChar"/>
@@ -2370,7 +1862,7 @@
         </w:rPr>
         <w:t xml:space="preserve"> </w:t>
       </w:r>
-      <w:hyperlink r:id="rId22">
+      <w:hyperlink r:id="rId19">
         <w:r>
           <w:rPr>
             <w:rStyle w:val="VerbatimChar"/>
@@ -2390,7 +1882,7 @@
         </w:rPr>
         <w:t xml:space="preserve"> </w:t>
       </w:r>
-      <w:hyperlink r:id="rId22">
+      <w:hyperlink r:id="rId19">
         <w:r>
           <w:rPr>
             <w:rStyle w:val="VerbatimChar"/>
@@ -2416,7 +1908,7 @@
         </w:rPr>
         <w:t xml:space="preserve"> </w:t>
       </w:r>
-      <w:hyperlink r:id="rId22">
+      <w:hyperlink r:id="rId19">
         <w:r>
           <w:rPr>
             <w:rStyle w:val="VerbatimChar"/>
@@ -2442,7 +1934,7 @@
         </w:rPr>
         <w:t xml:space="preserve"> </w:t>
       </w:r>
-      <w:hyperlink r:id="rId22">
+      <w:hyperlink r:id="rId19">
         <w:r>
           <w:rPr>
             <w:rStyle w:val="VerbatimChar"/>
@@ -2460,6 +1952,514 @@
     <w:p>
       <w:pPr>
         <w:pStyle w:val="BodyText"/>
+        <w:keepNext/>
+      </w:pPr>
+      <w:r>
+        <w:rPr>
+          <w:b/>
+        </w:rPr>
+        <w:t>Tabela 1</w:t>
+      </w:r>
+      <w:r>
+        <w:rPr>
+          <w:b w:val="0"/>
+        </w:rPr>
+        <w:t xml:space="preserve"> – Funil de atrito da LICC</w:t>
+      </w:r>
+    </w:p>
+    <w:tbl>
+      <w:tblPr>
+        <w:tblStyle w:val="Table"/>
+        <w:tblW w:type="pct" w:w="5000"/>
+        <w:jc w:val="center"/>
+        <w:tblLayout w:type="fixed"/>
+        <w:tblLook w:firstRow="1" w:lastRow="0" w:firstColumn="0" w:lastColumn="0" w:noHBand="0" w:noVBand="0" w:val="0020"/>
+        <w:tblBorders>
+          <w:top w:val="single" w:sz="8" w:space="0" w:color="000000"/>
+          <w:bottom w:val="single" w:sz="8" w:space="0" w:color="000000"/>
+          <w:left w:val="nil"/>
+          <w:right w:val="nil"/>
+          <w:insideH w:val="nil"/>
+          <w:insideV w:val="nil"/>
+        </w:tblBorders>
+      </w:tblPr>
+      <w:tblGrid>
+        <w:gridCol w:w="4054"/>
+        <w:gridCol w:w="2545"/>
+        <w:gridCol w:w="1320"/>
+      </w:tblGrid>
+      <w:tr>
+        <w:trPr>
+          <w:tblHeader w:val="on"/>
+          <w:tblHeader w:val="true"/>
+        </w:trPr>
+        <w:tc>
+          <w:tcPr>
+            <w:tcBorders>
+              <w:bottom w:val="single" w:sz="4" w:space="0" w:color="000000"/>
+            </w:tcBorders>
+          </w:tcPr>
+          <w:p>
+            <w:pPr>
+              <w:pStyle w:val="Compact"/>
+              <w:keepNext/>
+              <w:spacing w:after="0" w:before="0"/>
+              <w:jc w:val="left"/>
+            </w:pPr>
+            <w:r>
+              <w:rPr>
+                <w:sz w:val="20"/>
+              </w:rPr>
+              <w:t xml:space="preserve">Etapa</w:t>
+            </w:r>
+          </w:p>
+        </w:tc>
+        <w:tc>
+          <w:tcPr>
+            <w:tcBorders>
+              <w:bottom w:val="single" w:sz="4" w:space="0" w:color="000000"/>
+            </w:tcBorders>
+          </w:tcPr>
+          <w:p>
+            <w:pPr>
+              <w:pStyle w:val="Compact"/>
+              <w:keepNext/>
+              <w:spacing w:after="0" w:before="0"/>
+              <w:jc w:val="left"/>
+            </w:pPr>
+            <w:r>
+              <w:rPr>
+                <w:sz w:val="20"/>
+              </w:rPr>
+              <w:t xml:space="preserve">Valor</w:t>
+            </w:r>
+          </w:p>
+        </w:tc>
+        <w:tc>
+          <w:tcPr>
+            <w:tcBorders>
+              <w:bottom w:val="single" w:sz="4" w:space="0" w:color="000000"/>
+            </w:tcBorders>
+          </w:tcPr>
+          <w:p>
+            <w:pPr>
+              <w:pStyle w:val="Compact"/>
+              <w:keepNext/>
+              <w:spacing w:after="0" w:before="0"/>
+              <w:jc w:val="left"/>
+            </w:pPr>
+            <w:r>
+              <w:rPr>
+                <w:sz w:val="20"/>
+              </w:rPr>
+              <w:t xml:space="preserve">Período</w:t>
+            </w:r>
+          </w:p>
+        </w:tc>
+      </w:tr>
+      <w:tr>
+        <w:tc>
+          <w:tcPr/>
+          <w:p>
+            <w:pPr>
+              <w:pStyle w:val="Compact"/>
+              <w:keepNext/>
+              <w:spacing w:after="0" w:before="0"/>
+              <w:jc w:val="left"/>
+            </w:pPr>
+            <w:r>
+              <w:rPr>
+                <w:sz w:val="20"/>
+              </w:rPr>
+              <w:t xml:space="preserve">Agentes culturais cadastrados no Mapa Cultural (coletivos)</w:t>
+            </w:r>
+          </w:p>
+        </w:tc>
+        <w:tc>
+          <w:tcPr/>
+          <w:p>
+            <w:pPr>
+              <w:pStyle w:val="Compact"/>
+              <w:keepNext/>
+              <w:spacing w:after="0" w:before="0"/>
+              <w:jc w:val="left"/>
+            </w:pPr>
+            <w:r>
+              <w:rPr>
+                <w:sz w:val="20"/>
+              </w:rPr>
+              <w:t xml:space="preserve">25.441 (2.592)</w:t>
+            </w:r>
+          </w:p>
+        </w:tc>
+        <w:tc>
+          <w:tcPr/>
+          <w:p>
+            <w:pPr>
+              <w:pStyle w:val="Compact"/>
+              <w:keepNext/>
+              <w:spacing w:after="0" w:before="0"/>
+              <w:jc w:val="left"/>
+            </w:pPr>
+            <w:r>
+              <w:rPr>
+                <w:sz w:val="20"/>
+              </w:rPr>
+              <w:t xml:space="preserve">set. 2026</w:t>
+            </w:r>
+          </w:p>
+        </w:tc>
+      </w:tr>
+      <w:tr>
+        <w:tc>
+          <w:tcPr/>
+          <w:p>
+            <w:pPr>
+              <w:pStyle w:val="Compact"/>
+              <w:keepNext/>
+              <w:spacing w:after="0" w:before="0"/>
+              <w:jc w:val="left"/>
+            </w:pPr>
+            <w:r>
+              <w:rPr>
+                <w:sz w:val="20"/>
+              </w:rPr>
+              <w:t xml:space="preserve">Projetos inscritos</w:t>
+            </w:r>
+          </w:p>
+        </w:tc>
+        <w:tc>
+          <w:tcPr/>
+          <w:p>
+            <w:pPr>
+              <w:pStyle w:val="Compact"/>
+              <w:keepNext/>
+              <w:spacing w:after="0" w:before="0"/>
+              <w:jc w:val="left"/>
+            </w:pPr>
+            <w:r>
+              <w:rPr>
+                <w:sz w:val="20"/>
+              </w:rPr>
+              <w:t xml:space="preserve">não publicado</w:t>
+            </w:r>
+          </w:p>
+        </w:tc>
+        <w:tc>
+          <w:tcPr/>
+          <w:p>
+            <w:pPr>
+              <w:pStyle w:val="Compact"/>
+              <w:keepNext/>
+              <w:spacing w:after="0" w:before="0"/>
+              <w:jc w:val="left"/>
+            </w:pPr>
+            <w:r>
+              <w:rPr>
+                <w:sz w:val="20"/>
+              </w:rPr>
+              <w:t xml:space="preserve">—</w:t>
+            </w:r>
+          </w:p>
+        </w:tc>
+      </w:tr>
+      <w:tr>
+        <w:tc>
+          <w:tcPr/>
+          <w:p>
+            <w:pPr>
+              <w:pStyle w:val="Compact"/>
+              <w:keepNext/>
+              <w:spacing w:after="0" w:before="0"/>
+              <w:jc w:val="left"/>
+            </w:pPr>
+            <w:r>
+              <w:rPr>
+                <w:sz w:val="20"/>
+              </w:rPr>
+              <w:t xml:space="preserve">Projetos habilitados; proponentes por ciclo</w:t>
+            </w:r>
+          </w:p>
+        </w:tc>
+        <w:tc>
+          <w:tcPr/>
+          <w:p>
+            <w:pPr>
+              <w:pStyle w:val="Compact"/>
+              <w:keepNext/>
+              <w:spacing w:after="0" w:before="0"/>
+              <w:jc w:val="left"/>
+            </w:pPr>
+            <w:r>
+              <w:rPr>
+                <w:sz w:val="20"/>
+              </w:rPr>
+              <w:t xml:space="preserve">305; 53, 92 e 95</w:t>
+            </w:r>
+          </w:p>
+        </w:tc>
+        <w:tc>
+          <w:tcPr/>
+          <w:p>
+            <w:pPr>
+              <w:pStyle w:val="Compact"/>
+              <w:keepNext/>
+              <w:spacing w:after="0" w:before="0"/>
+              <w:jc w:val="left"/>
+            </w:pPr>
+            <w:r>
+              <w:rPr>
+                <w:sz w:val="20"/>
+              </w:rPr>
+              <w:t xml:space="preserve">ciclos 2022-2024</w:t>
+            </w:r>
+          </w:p>
+        </w:tc>
+      </w:tr>
+      <w:tr>
+        <w:tc>
+          <w:tcPr/>
+          <w:p>
+            <w:pPr>
+              <w:pStyle w:val="Compact"/>
+              <w:keepNext/>
+              <w:spacing w:after="0" w:before="0"/>
+              <w:jc w:val="left"/>
+            </w:pPr>
+            <w:r>
+              <w:rPr>
+                <w:sz w:val="20"/>
+              </w:rPr>
+              <w:t xml:space="preserve">Habilitados com situação resolvida; captaram</w:t>
+            </w:r>
+          </w:p>
+        </w:tc>
+        <w:tc>
+          <w:tcPr/>
+          <w:p>
+            <w:pPr>
+              <w:pStyle w:val="Compact"/>
+              <w:keepNext/>
+              <w:spacing w:after="0" w:before="0"/>
+              <w:jc w:val="left"/>
+            </w:pPr>
+            <w:r>
+              <w:rPr>
+                <w:sz w:val="20"/>
+              </w:rPr>
+              <w:t xml:space="preserve">293; 198</w:t>
+            </w:r>
+          </w:p>
+        </w:tc>
+        <w:tc>
+          <w:tcPr/>
+          <w:p>
+            <w:pPr>
+              <w:pStyle w:val="Compact"/>
+              <w:keepNext/>
+              <w:spacing w:after="0" w:before="0"/>
+              <w:jc w:val="left"/>
+            </w:pPr>
+            <w:r>
+              <w:rPr>
+                <w:sz w:val="20"/>
+              </w:rPr>
+              <w:t xml:space="preserve">ciclos 2022-2024</w:t>
+            </w:r>
+          </w:p>
+        </w:tc>
+      </w:tr>
+      <w:tr>
+        <w:tc>
+          <w:tcPr/>
+          <w:p>
+            <w:pPr>
+              <w:pStyle w:val="Compact"/>
+              <w:keepNext/>
+              <w:spacing w:after="0" w:before="0"/>
+              <w:jc w:val="left"/>
+            </w:pPr>
+            <w:r>
+              <w:rPr>
+                <w:sz w:val="20"/>
+              </w:rPr>
+              <w:t xml:space="preserve">Valor com patrocinador que coube no teto</w:t>
+            </w:r>
+          </w:p>
+        </w:tc>
+        <w:tc>
+          <w:tcPr/>
+          <w:p>
+            <w:pPr>
+              <w:pStyle w:val="Compact"/>
+              <w:keepNext/>
+              <w:spacing w:after="0" w:before="0"/>
+              <w:jc w:val="left"/>
+            </w:pPr>
+            <w:r>
+              <w:rPr>
+                <w:sz w:val="20"/>
+              </w:rPr>
+              <w:t xml:space="preserve">78%; 74%</w:t>
+            </w:r>
+          </w:p>
+        </w:tc>
+        <w:tc>
+          <w:tcPr/>
+          <w:p>
+            <w:pPr>
+              <w:pStyle w:val="Compact"/>
+              <w:keepNext/>
+              <w:spacing w:after="0" w:before="0"/>
+              <w:jc w:val="left"/>
+            </w:pPr>
+            <w:r>
+              <w:rPr>
+                <w:sz w:val="20"/>
+              </w:rPr>
+              <w:t xml:space="preserve">captação 2023; 2024</w:t>
+            </w:r>
+          </w:p>
+        </w:tc>
+      </w:tr>
+      <w:tr>
+        <w:tc>
+          <w:tcPr/>
+          <w:p>
+            <w:pPr>
+              <w:pStyle w:val="Compact"/>
+              <w:spacing w:after="0" w:before="0"/>
+              <w:jc w:val="left"/>
+            </w:pPr>
+            <w:r>
+              <w:rPr>
+                <w:sz w:val="20"/>
+              </w:rPr>
+              <w:t xml:space="preserve">Público alcançado e gratuidade</w:t>
+            </w:r>
+          </w:p>
+        </w:tc>
+        <w:tc>
+          <w:tcPr/>
+          <w:p>
+            <w:pPr>
+              <w:pStyle w:val="Compact"/>
+              <w:spacing w:after="0" w:before="0"/>
+              <w:jc w:val="left"/>
+            </w:pPr>
+            <w:r>
+              <w:rPr>
+                <w:sz w:val="20"/>
+              </w:rPr>
+              <w:t xml:space="preserve">não publicado</w:t>
+            </w:r>
+          </w:p>
+        </w:tc>
+        <w:tc>
+          <w:tcPr/>
+          <w:p>
+            <w:pPr>
+              <w:pStyle w:val="Compact"/>
+              <w:spacing w:after="0" w:before="0"/>
+              <w:jc w:val="left"/>
+            </w:pPr>
+            <w:r>
+              <w:rPr>
+                <w:sz w:val="20"/>
+              </w:rPr>
+              <w:t xml:space="preserve">—</w:t>
+            </w:r>
+          </w:p>
+        </w:tc>
+      </w:tr>
+    </w:tbl>
+    <w:p>
+      <w:pPr>
+        <w:pStyle w:val="BodyText"/>
+      </w:pPr>
+      <w:r>
+        <w:rPr>
+          <w:i/>
+          <w:sz w:val="20"/>
+        </w:rPr>
+        <w:t>Fonte</w:t>
+      </w:r>
+      <w:r>
+        <w:rPr>
+          <w:sz w:val="20"/>
+        </w:rPr>
+        <w:t>: elaboração própria com base em SECULT (2026b; 2026c) e na API pública do Mapa Cultural do Espírito Santo (SECULT, 2026d). Tabelas de origem:</w:t>
+      </w:r>
+      <w:r>
+        <w:rPr>
+          <w:sz w:val="20"/>
+        </w:rPr>
+        <w:t xml:space="preserve"> </w:t>
+      </w:r>
+      <w:hyperlink r:id="rId20">
+        <w:r>
+          <w:rPr>
+            <w:rStyle w:val="VerbatimChar"/>
+          </w:rPr>
+          <w:t xml:space="preserve">analise/tabelas/07_funil_por_ciclo.csv</w:t>
+        </w:r>
+      </w:hyperlink>
+      <w:r>
+        <w:rPr>
+          <w:sz w:val="20"/>
+        </w:rPr>
+        <w:t xml:space="preserve">,</w:t>
+      </w:r>
+      <w:r>
+        <w:rPr>
+          <w:sz w:val="20"/>
+        </w:rPr>
+        <w:t xml:space="preserve"> </w:t>
+      </w:r>
+      <w:hyperlink r:id="rId21">
+        <w:r>
+          <w:rPr>
+            <w:rStyle w:val="VerbatimChar"/>
+          </w:rPr>
+          <w:t xml:space="preserve">07_funil_captacao_anual.csv</w:t>
+        </w:r>
+      </w:hyperlink>
+      <w:r>
+        <w:rPr>
+          <w:sz w:val="20"/>
+        </w:rPr>
+        <w:t xml:space="preserve"> </w:t>
+      </w:r>
+      <w:r>
+        <w:rPr>
+          <w:sz w:val="20"/>
+        </w:rPr>
+        <w:t xml:space="preserve">e</w:t>
+      </w:r>
+      <w:r>
+        <w:rPr>
+          <w:sz w:val="20"/>
+        </w:rPr>
+        <w:t xml:space="preserve"> </w:t>
+      </w:r>
+      <w:hyperlink r:id="rId22">
+        <w:r>
+          <w:rPr>
+            <w:rStyle w:val="VerbatimChar"/>
+          </w:rPr>
+          <w:t xml:space="preserve">07_mapa_cultural_universo.csv</w:t>
+        </w:r>
+      </w:hyperlink>
+      <w:r>
+        <w:rPr>
+          <w:sz w:val="20"/>
+        </w:rPr>
+        <w:t xml:space="preserve">.</w:t>
+      </w:r>
+    </w:p>
+    <w:p>
+      <w:pPr>
+        <w:pStyle w:val="BodyText"/>
       </w:pPr>
       <w:r>
         <w:rPr>
@@ -2603,7 +2603,7 @@
     </w:p>
     <w:bookmarkEnd w:id="23"/>
     <w:bookmarkEnd w:id="24"/>
-    <w:bookmarkStart w:id="36" w:name="proposta-de-avaliação-de-impacto"/>
+    <w:bookmarkStart w:id="35" w:name="proposta-de-avaliação-de-impacto"/>
     <w:p>
       <w:pPr>
         <w:pStyle w:val="Heading1"/>
@@ -4349,7 +4349,7 @@
       </w:r>
     </w:p>
     <w:bookmarkEnd w:id="27"/>
-    <w:bookmarkStart w:id="34" w:name="cálculo-do-poder-estatístico"/>
+    <w:bookmarkStart w:id="33" w:name="cálculo-do-poder-estatístico"/>
     <w:p>
       <w:pPr>
         <w:pStyle w:val="Heading2"/>
@@ -5520,26 +5520,6 @@
         <w:rPr>
           <w:sz w:val="20"/>
         </w:rPr>
-        <w:t xml:space="preserve">, com as funções de</w:t>
-      </w:r>
-      <w:r>
-        <w:rPr>
-          <w:sz w:val="20"/>
-        </w:rPr>
-        <w:t xml:space="preserve"> </w:t>
-      </w:r>
-      <w:hyperlink r:id="rId33">
-        <w:r>
-          <w:rPr>
-            <w:rStyle w:val="VerbatimChar"/>
-          </w:rPr>
-          <w:t xml:space="preserve">analise/05_poder_mde.py</w:t>
-        </w:r>
-      </w:hyperlink>
-      <w:r>
-        <w:rPr>
-          <w:sz w:val="20"/>
-        </w:rPr>
         <w:t xml:space="preserve">).</w:t>
       </w:r>
     </w:p>
@@ -5563,14 +5543,33 @@
         <w:t xml:space="preserve">tende a exagerar o efeito verdadeiro (GELMAN; CARLIN, 2014), o que recomenda pré-registrar a análise e corrigir comparações múltiplas.</w:t>
       </w:r>
     </w:p>
+    <w:bookmarkEnd w:id="33"/>
+    <w:bookmarkStart w:id="34" w:name="ameaças-à-validade-e-ética"/>
+    <w:p>
+      <w:pPr>
+        <w:pStyle w:val="Heading2"/>
+      </w:pPr>
+      <w:r>
+        <w:t xml:space="preserve">5.5 Ameaças à validade e ética</w:t>
+      </w:r>
+    </w:p>
+    <w:p>
+      <w:pPr>
+        <w:pStyle w:val="FirstParagraph"/>
+      </w:pPr>
+      <w:r>
+        <w:t xml:space="preserve">A primeira ameaça à validade interna é a violação da hipótese de ausência de interferência entre unidades (SUTVA): com o teto fixo, o que um projeto capta falta a outro. Seguem-se a substituição de fonte (a captação pela Lei Rouanet entra como resultado), os eventos externos do período (Lei Paulo Gustavo e Política Nacional Aldir Blanc) e o atrito dos dados. No experimento conjunto, a escolha declarada pode pender para o socialmente desejável; a escolha forçada entre perfis reduz o viés, e os patrocínios observados servem de validação. A validade externa é limitada: as comparações de H5 valem para o regime de 2022-2024, em que a habilitação precedia a busca por patrocinador, e desde 2025 os expirados quase desapareceram (3 em 56 resolvidos no ciclo 2025). No plano ético, nenhum desenho nega acesso a elegíveis: o apoio chega aos controles ao fim, e o deslocamento pelo teto é medido pela saturação. Dados identificados exigem anonimização (LGPD), e pesquisas com pessoas, aprovação de comitê de ética.</w:t>
+      </w:r>
+    </w:p>
     <w:bookmarkEnd w:id="34"/>
-    <w:bookmarkStart w:id="35" w:name="ameaças-à-validade-e-ética"/>
-    <w:p>
-      <w:pPr>
-        <w:pStyle w:val="Heading2"/>
-      </w:pPr>
-      <w:r>
-        <w:t xml:space="preserve">5.5 Ameaças à validade e ética</w:t>
+    <w:bookmarkEnd w:id="35"/>
+    <w:bookmarkStart w:id="36" w:name="conclusão"/>
+    <w:p>
+      <w:pPr>
+        <w:pStyle w:val="Heading1"/>
+      </w:pPr>
+      <w:r>
+        <w:t xml:space="preserve">6 Conclusão</w:t>
       </w:r>
     </w:p>
     <w:p>
@@ -5578,46 +5577,27 @@
         <w:pStyle w:val="FirstParagraph"/>
       </w:pPr>
       <w:r>
-        <w:t xml:space="preserve">A primeira ameaça à validade interna é a violação da hipótese de ausência de interferência entre unidades (SUTVA): com o teto fixo, o que um projeto capta falta a outro. Seguem-se a substituição de fonte (a captação pela Lei Rouanet entra como resultado), os eventos externos do período (Lei Paulo Gustavo e Política Nacional Aldir Blanc) e o atrito dos dados. No experimento conjunto, a escolha declarada pode pender para o socialmente desejável; a escolha forçada entre perfis reduz o viés, e os patrocínios observados servem de validação. A validade externa é limitada: as comparações de H5 valem para o regime de 2022-2024, em que a habilitação precedia a busca por patrocinador, e desde 2025 os expirados quase desapareceram (3 em 56 resolvidos no ciclo 2025). No plano ético, nenhum desenho nega acesso a elegíveis: o apoio chega aos controles ao fim, e o deslocamento pelo teto é medido pela saturação. Dados identificados exigem anonimização (LGPD), e pesquisas com pessoas, aprovação de comitê de ética.</w:t>
-      </w:r>
-    </w:p>
-    <w:bookmarkEnd w:id="35"/>
+        <w:t xml:space="preserve">A LICC é um gasto tributário que mais que dobrou de 2023 a 2026, sem problema declarado, objetivos mensuráveis ou previsão de avaliação: o Estado paga, as empresas escolhem, e o público que usaria o bem cultural não passa pelo mecanismo. A escolha se concentra em poucas empresas de serviços regulados, que expõem a marca nas peças do projeto; entre os habilitados, a decisão fica com a empresa e com a fila dos termos; parte do recurso pode remunerar a intermediação; e quem não chega a um grande contribuinte fica de fora. A entrega, extremo da cadeia, é indeterminada, porque a SECULT não publica o público alcançado.</w:t>
+      </w:r>
+    </w:p>
+    <w:p>
+      <w:pPr>
+        <w:pStyle w:val="BodyText"/>
+      </w:pPr>
+      <w:r>
+        <w:t xml:space="preserve">Sem alterar o mecanismo, a gestão pode declarar objetivos, metas e indicadores e publicar os inscritos, com CNPJ, sede e motivo de inabilitação; a captação por cota; a fila de termos, com datas de protocolo e validação, também dos recusados; e custos, contrapartidas e público alcançado.</w:t>
+      </w:r>
+    </w:p>
+    <w:p>
+      <w:pPr>
+        <w:pStyle w:val="BodyText"/>
+      </w:pPr>
+      <w:r>
+        <w:t xml:space="preserve">Das quatro perguntas, a da entrega (H5) é a mais importante e a mais difícil: mais da metade dos recusados por falta de teto captou no ano seguinte, e comparar quem recebe com quem não recebe exige resultado datado e a fila de termos com as datas. Se a adicionalidade na margem for baixa, ampliar o teto financia sobretudo o que ocorreria de todo modo, e as decisões que importam passam a ser quem entra e o que se entrega. Limitações dos dados: a situação publicada aproxima a captação, a estreia é medida por nome de proponente, e o retrato territorial cobre 74% do valor.</w:t>
+      </w:r>
+    </w:p>
     <w:bookmarkEnd w:id="36"/>
-    <w:bookmarkStart w:id="37" w:name="conclusão"/>
-    <w:p>
-      <w:pPr>
-        <w:pStyle w:val="Heading1"/>
-      </w:pPr>
-      <w:r>
-        <w:t xml:space="preserve">6 Conclusão</w:t>
-      </w:r>
-    </w:p>
-    <w:p>
-      <w:pPr>
-        <w:pStyle w:val="FirstParagraph"/>
-      </w:pPr>
-      <w:r>
-        <w:t xml:space="preserve">A LICC é um gasto tributário que mais que dobrou de 2023 a 2026, sem problema declarado, objetivos mensuráveis ou previsão de avaliação: o Estado paga, as empresas escolhem, e o público que usaria o bem cultural não passa pelo mecanismo. A escolha se concentra em poucas empresas de serviços regulados, que expõem a marca nas peças do projeto; entre os habilitados, a decisão fica com a empresa e com a fila dos termos; parte do recurso pode remunerar a intermediação; e quem não chega a um grande contribuinte fica de fora. A entrega, extremo da cadeia, é indeterminada, porque a SECULT não publica o público alcançado.</w:t>
-      </w:r>
-    </w:p>
-    <w:p>
-      <w:pPr>
-        <w:pStyle w:val="BodyText"/>
-      </w:pPr>
-      <w:r>
-        <w:t xml:space="preserve">Sem alterar o mecanismo, a gestão pode declarar objetivos, metas e indicadores e publicar os inscritos, com CNPJ, sede e motivo de inabilitação; a captação por cota; a fila de termos, com datas de protocolo e validação, também dos recusados; e custos, contrapartidas e público alcançado.</w:t>
-      </w:r>
-    </w:p>
-    <w:p>
-      <w:pPr>
-        <w:pStyle w:val="BodyText"/>
-      </w:pPr>
-      <w:r>
-        <w:t xml:space="preserve">Das quatro perguntas de avaliação, a da entrega (H5) é a mais importante e a de resposta mais difícil: mais da metade dos recusados por falta de teto captou no ano seguinte, e comparar quem recebe com quem não recebe exige resultado datado e a fila de termos com as datas. Se a adicionalidade na margem for baixa, ampliar o teto financia sobretudo o que ocorreria de todo modo, e as decisões que importam passam a ser quem entra e o que se entrega. Limitações dos dados: a situação publicada aproxima a captação, a estreia é medida por nome de proponente, e o retrato territorial cobre 74% do valor.</w:t>
-      </w:r>
-    </w:p>
-    <w:bookmarkEnd w:id="37"/>
-    <w:bookmarkStart w:id="57" w:name="referências"/>
+    <w:bookmarkStart w:id="56" w:name="referências"/>
     <w:p>
       <w:pPr>
         <w:pStyle w:val="Heading1"/>
@@ -5649,7 +5629,7 @@
       <w:r>
         <w:t xml:space="preserve"> </w:t>
       </w:r>
-      <w:hyperlink r:id="rId38">
+      <w:hyperlink r:id="rId37">
         <w:r>
           <w:rPr>
             <w:rStyle w:val="Hyperlink"/>
@@ -5684,7 +5664,7 @@
       <w:r>
         <w:t xml:space="preserve"> </w:t>
       </w:r>
-      <w:hyperlink r:id="rId39">
+      <w:hyperlink r:id="rId38">
         <w:r>
           <w:rPr>
             <w:rStyle w:val="Hyperlink"/>
@@ -5804,7 +5784,7 @@
       <w:r>
         <w:t xml:space="preserve"> </w:t>
       </w:r>
-      <w:hyperlink r:id="rId40">
+      <w:hyperlink r:id="rId39">
         <w:r>
           <w:rPr>
             <w:rStyle w:val="Hyperlink"/>
@@ -5923,7 +5903,7 @@
       <w:r>
         <w:t xml:space="preserve"> </w:t>
       </w:r>
-      <w:hyperlink r:id="rId41">
+      <w:hyperlink r:id="rId40">
         <w:r>
           <w:rPr>
             <w:rStyle w:val="Hyperlink"/>
@@ -5958,7 +5938,7 @@
       <w:r>
         <w:t xml:space="preserve"> </w:t>
       </w:r>
-      <w:hyperlink r:id="rId42">
+      <w:hyperlink r:id="rId41">
         <w:r>
           <w:rPr>
             <w:rStyle w:val="Hyperlink"/>
@@ -5993,7 +5973,7 @@
       <w:r>
         <w:t xml:space="preserve"> </w:t>
       </w:r>
-      <w:hyperlink r:id="rId43">
+      <w:hyperlink r:id="rId42">
         <w:r>
           <w:rPr>
             <w:rStyle w:val="Hyperlink"/>
@@ -6028,7 +6008,7 @@
       <w:r>
         <w:t xml:space="preserve"> </w:t>
       </w:r>
-      <w:hyperlink r:id="rId44">
+      <w:hyperlink r:id="rId43">
         <w:r>
           <w:rPr>
             <w:rStyle w:val="Hyperlink"/>
@@ -6063,7 +6043,7 @@
       <w:r>
         <w:t xml:space="preserve"> </w:t>
       </w:r>
-      <w:hyperlink r:id="rId45">
+      <w:hyperlink r:id="rId44">
         <w:r>
           <w:rPr>
             <w:rStyle w:val="Hyperlink"/>
@@ -6182,7 +6162,7 @@
       <w:r>
         <w:t xml:space="preserve"> </w:t>
       </w:r>
-      <w:hyperlink r:id="rId46">
+      <w:hyperlink r:id="rId45">
         <w:r>
           <w:rPr>
             <w:rStyle w:val="Hyperlink"/>
@@ -6217,7 +6197,7 @@
       <w:r>
         <w:t xml:space="preserve"> </w:t>
       </w:r>
-      <w:hyperlink r:id="rId47">
+      <w:hyperlink r:id="rId46">
         <w:r>
           <w:rPr>
             <w:rStyle w:val="Hyperlink"/>
@@ -6273,7 +6253,7 @@
       <w:r>
         <w:t xml:space="preserve"> </w:t>
       </w:r>
-      <w:hyperlink r:id="rId48">
+      <w:hyperlink r:id="rId47">
         <w:r>
           <w:rPr>
             <w:rStyle w:val="Hyperlink"/>
@@ -6371,7 +6351,7 @@
       <w:r>
         <w:t xml:space="preserve"> </w:t>
       </w:r>
-      <w:hyperlink r:id="rId49">
+      <w:hyperlink r:id="rId48">
         <w:r>
           <w:rPr>
             <w:rStyle w:val="Hyperlink"/>
@@ -6406,7 +6386,7 @@
       <w:r>
         <w:t xml:space="preserve"> </w:t>
       </w:r>
-      <w:hyperlink r:id="rId50">
+      <w:hyperlink r:id="rId49">
         <w:r>
           <w:rPr>
             <w:rStyle w:val="Hyperlink"/>
@@ -6441,7 +6421,7 @@
       <w:r>
         <w:t xml:space="preserve"> </w:t>
       </w:r>
-      <w:hyperlink r:id="rId51">
+      <w:hyperlink r:id="rId50">
         <w:r>
           <w:rPr>
             <w:rStyle w:val="Hyperlink"/>
@@ -6497,7 +6477,7 @@
       <w:r>
         <w:t xml:space="preserve"> </w:t>
       </w:r>
-      <w:hyperlink r:id="rId52">
+      <w:hyperlink r:id="rId51">
         <w:r>
           <w:rPr>
             <w:rStyle w:val="Hyperlink"/>
@@ -6956,7 +6936,7 @@
       <w:r>
         <w:t xml:space="preserve"> </w:t>
       </w:r>
-      <w:hyperlink r:id="rId53">
+      <w:hyperlink r:id="rId52">
         <w:r>
           <w:rPr>
             <w:rStyle w:val="Hyperlink"/>
@@ -6991,7 +6971,7 @@
       <w:r>
         <w:t xml:space="preserve"> </w:t>
       </w:r>
-      <w:hyperlink r:id="rId54">
+      <w:hyperlink r:id="rId53">
         <w:r>
           <w:rPr>
             <w:rStyle w:val="Hyperlink"/>
@@ -7047,7 +7027,7 @@
       <w:r>
         <w:t xml:space="preserve"> </w:t>
       </w:r>
-      <w:hyperlink r:id="rId55">
+      <w:hyperlink r:id="rId54">
         <w:r>
           <w:rPr>
             <w:rStyle w:val="Hyperlink"/>
@@ -7082,7 +7062,7 @@
       <w:r>
         <w:t xml:space="preserve"> </w:t>
       </w:r>
-      <w:hyperlink r:id="rId56">
+      <w:hyperlink r:id="rId55">
         <w:r>
           <w:rPr>
             <w:rStyle w:val="Hyperlink"/>
@@ -7094,7 +7074,7 @@
         <w:t xml:space="preserve">.</w:t>
       </w:r>
     </w:p>
-    <w:bookmarkEnd w:id="57"/>
+    <w:bookmarkEnd w:id="56"/>
     <w:sectPr>
       <w:footnotePr>
         <w:numRestart w:val="eachSect"/>
@@ -7140,7 +7120,7 @@
         <w:t xml:space="preserve"> </w:t>
       </w:r>
       <w:r>
-        <w:t xml:space="preserve">Para 2022, a Portaria SEFAZ nº 09-R fixou R$ 10 milhões, e o anexo de captação da SECULT informa R$ 15 milhões disponíveis (R$ 11,5 milhões validados). Sem o ato de ampliação, o montante de 2022 fica indeterminado.</w:t>
+        <w:t xml:space="preserve">Para 2022, a Portaria SEFAZ nº 09-R fixou R$ 10 milhões, e o anexo de captação da SECULT informa R$ 15 milhões disponíveis (R$ 11,5 milhões validados), valor que a lista do Portal da Transparência atribui à mesma portaria (ESPÍRITO SANTO, 2026). Sem ato de ampliação localizado, o teto de 2022 fica indeterminado.</w:t>
       </w:r>
     </w:p>
   </w:footnote>

</xml_diff>

<commit_message>
Artigo: revisão r4 aplicada (poder de H4 e H5, CNPJ pelo Diário Oficial, indicadores e riscos); auditoria de lacunas
- §5.4: EMD do efeito local de H5 (69 a 84 pontos) e cenário com LAI (20 a 24); H4 com os 71
  municípios (35 ou 36 por grupo, regra de 30 a 50) e braços sorteados entre agentes (2,3 a 4,9)
- §5.3 e Quadro 4: CNPJ de 385 dos 463 habilitados pelo Portal e pelos avisos do DIO-ES; depósito
  datado para 82% dos termos; eventos do Mapa com cobertura declarada; referência DIO-ES (2026)
- §4.1 e §4.2: riscos (passo 3) e indicadores (passo 5) da teoria da mudança
- 15 páginas: sai a comparação com a lei do RS (foco só na LICC); Tabela 2 rebalanceada
- analise/18: depósitos ligados aos termos por parcela (267 de 325 termos)
- checagens 68/68 (N65-N72 novas); auditoria de lacunas e pipeline em revisao-stage3-r4/08

Co-Authored-By: Claude Opus 5.5 <noreply@anthropic.com>
Claude-Session: https://claude.ai/code/session_01XEaG1GvUXhdfnXot6AtJxa
</commit_message>
<xml_diff>
--- a/artigo/rascunho-artigo.docx
+++ b/artigo/rascunho-artigo.docx
@@ -1131,7 +1131,7 @@
         <w:pStyle w:val="BodyText"/>
       </w:pPr>
       <w:r>
-        <w:t xml:space="preserve">Cada seta da cadeia carrega uma premissa, uma condição que precisa valer para que um passo leve ao seguinte (MAYNE, 2015). Cinco delas são tratadas como hipóteses a testar, marcadas nos elos da Figura 1 e auditadas no Quadro 2. H1 (marketing): a empresa escolhe pela marca, único retorno privado do crédito integral, sem deixar de fora bem público que a população valorizaria. H2 (decisão concentrada): a decisão sobre recurso público segue critério público e não fica com poucos decisores. H3 (taxa de serviço): o recurso chega ao bem cultural, e não à intermediação. H4 (exclusão): quem não tem acesso a grandes contribuintes consegue entrar. H5 (entrega): o bem financiado não existiria sem a LICC. H1 a H4 perguntam quem decide e a que custo; H5, se o que se financia é adicional.</w:t>
+        <w:t xml:space="preserve">Cada seta da cadeia carrega uma premissa, uma condição que precisa valer para que um passo leve ao seguinte (MAYNE, 2015). Cinco delas são tratadas como hipóteses a testar, marcadas nos elos da Figura 1 e auditadas no Quadro 2. H1 (marketing): a empresa escolhe pela marca, único retorno privado do crédito integral, sem deixar de fora bem público que a população valorizaria. H2 (decisão concentrada): a decisão sobre recurso público segue critério público e não fica com poucos decisores. H3 (taxa de serviço): o recurso chega ao bem cultural, e não à intermediação. H4 (exclusão): quem não tem acesso a grandes contribuintes consegue entrar. H5 (entrega): o bem financiado não existiria sem a LICC. H1 a H4 perguntam quem decide e a que custo; H5, se o que se financia é adicional. Há dois riscos (efeitos não esperados): o teto fixo desloca outros projetos, e o crédito integral pode substituir o patrocínio próprio da empresa.</w:t>
       </w:r>
     </w:p>
     <w:p>
@@ -1313,13 +1313,29 @@
           <w:b/>
           <w:bCs/>
         </w:rPr>
-        <w:t xml:space="preserve">Funil de atrito.</w:t>
-      </w:r>
-      <w:r>
-        <w:t xml:space="preserve"> </w:t>
-      </w:r>
-      <w:r>
-        <w:t xml:space="preserve">O funil mede, elo a elo, quantos beneficiários potenciais chegam ao fim da cadeia (WHITE; RAITZER, 2017). A Tabela 1 mostra que ele se estreita onde não há dado: entre os 25.441 agentes cadastrados no Mapa Cultural e os 53 a 95 proponentes habilitados por ciclo, não se sabe quantos se inscreveram. Nas etapas observadas, a maioria passa: 68% dos habilitados de 2022-2024 com situação resolvida captaram.</w:t>
+        <w:t xml:space="preserve">Funil de atrito e indicadores.</w:t>
+      </w:r>
+      <w:r>
+        <w:t xml:space="preserve"> </w:t>
+      </w:r>
+      <w:r>
+        <w:t xml:space="preserve">O funil mede, elo a elo, quantos beneficiários potenciais chegam ao fim da cadeia (WHITE; RAITZER, 2017); suas etapas são os indicadores da cadeia, e os de resultado são os</w:t>
+      </w:r>
+      <w:r>
+        <w:t xml:space="preserve"> </w:t>
+      </w:r>
+      <w:r>
+        <w:rPr>
+          <w:i/>
+          <w:iCs/>
+        </w:rPr>
+        <w:t xml:space="preserve">Y</w:t>
+      </w:r>
+      <w:r>
+        <w:t xml:space="preserve"> </w:t>
+      </w:r>
+      <w:r>
+        <w:t xml:space="preserve">do Quadro 3. A Tabela 1 mostra que ele se estreita onde não há dado: entre os 25.441 agentes cadastrados no Mapa Cultural e os 53 a 95 proponentes habilitados por ciclo, não se sabe quantos se inscreveram. Nas etapas observadas, a maioria passa: 68% dos habilitados de 2022-2024 com situação resolvida captaram.</w:t>
       </w:r>
     </w:p>
     <w:p>
@@ -2514,7 +2530,7 @@
         <w:t xml:space="preserve"> </w:t>
       </w:r>
       <w:r>
-        <w:t xml:space="preserve">(SECULT, 2026e), e o Mapa Cultural registra só a situação da inscrição (SECULT, 2026d). Nenhuma das normas examinadas prevê nota, peso ou ordem de prioridade; a única pontuação é a do credenciamento dos pareceristas, que recebem os projetos por ordem de inscrição e área (SECULT, 2025c). Desde 2025, o parecer favorável já emite o certificado, e a comissão só delibera sobre inabilitações e, com 35% de patrocínio, sobre a habilitação (SECULT, 2025a, arts. 40, 41 e 45). Os extratos das atas de 158 reuniões com deliberação, de 2022 a 2026, listam 86 projetos inabilitados, 15% dos deliberados, sem motivo nem critério publicados (SECULT, 2026f). A habilitação qualifica, mas não prioriza, e o que excedeu o teto em 2023-2025 ficou de fora pelo momento em que o termo chegou e foi validado (SECULT, 2026c). A ordenação seria possível: no Funcultura, a SECULT atribui nota e ordena os projetos por linha e porte do município (SECULT, 2026g); na lei análoga do Rio Grande do Sul, também com 100% do ICMS, contempla-se por nota (mínimo de 60), com descentralização regional, e o patrocinador repassa 5% ou 10% a mais, sem incentivo, a um fundo de cultura (RIO GRANDE DO SUL, 2024; 2026). Nenhuma delas fixa a ordem de validação.</w:t>
+        <w:t xml:space="preserve">(SECULT, 2026e), e o Mapa Cultural registra só a situação da inscrição (SECULT, 2026d). Nenhuma das normas examinadas prevê nota, peso ou ordem de prioridade; a única pontuação é a do credenciamento dos pareceristas, que recebem os projetos por ordem de inscrição e área (SECULT, 2025c). Desde 2025, o parecer favorável já emite o certificado, e a comissão só delibera sobre inabilitações e, com 35% de patrocínio, sobre a habilitação (SECULT, 2025a, arts. 40, 41 e 45). Os extratos das atas de 158 reuniões com deliberação, de 2022 a 2026, listam 86 projetos inabilitados, 15% dos deliberados, sem motivo nem critério publicados (SECULT, 2026f). A habilitação qualifica, mas não prioriza, e o que excedeu o teto em 2023-2025 ficou de fora pelo momento em que o termo chegou e foi validado (SECULT, 2026c). A ordenação seria possível: no Funcultura, a mesma SECULT atribui nota e ordena os projetos por linha e porte do município (SECULT, 2026g).</w:t>
       </w:r>
     </w:p>
     <w:p>
@@ -2603,7 +2619,7 @@
     </w:p>
     <w:bookmarkEnd w:id="23"/>
     <w:bookmarkEnd w:id="24"/>
-    <w:bookmarkStart w:id="35" w:name="proposta-de-avaliação-de-impacto"/>
+    <w:bookmarkStart w:id="37" w:name="proposta-de-avaliação-de-impacto"/>
     <w:p>
       <w:pPr>
         <w:pStyle w:val="Heading1"/>
@@ -3633,7 +3649,7 @@
         <w:t xml:space="preserve"> </w:t>
       </w:r>
       <w:r>
-        <w:t xml:space="preserve">Uma promoção aleatória de apoio à inscrição e à busca de patrocínio, sorteada entre municípios do interior, não altera nenhuma regra de alocação; dois braços sorteados separam o atrito documental do de patrocínio. A promoção estima o efeito da oferta e, para quem responde a ela, o efeito local (ANGRIST; IMBENS; RUBIN, 1996). Como o teto é fixo, sortear também a intensidade da oferta entre municípios mede o deslocamento de outros proponentes (BAIRD</w:t>
+        <w:t xml:space="preserve">Uma promoção aleatória de apoio à inscrição e à busca de patrocínio, sorteada entre os 71 municípios do interior, não altera nenhuma regra de alocação; nos municípios sorteados, dois braços, sorteados entre os agentes, separam o atrito documental do de patrocínio. A promoção estima o efeito da oferta e, para quem responde a ela, o efeito local (ANGRIST; IMBENS; RUBIN, 1996). Como o teto é fixo, sortear também a intensidade da oferta mede o deslocamento de outros proponentes (BAIRD</w:t>
       </w:r>
       <w:r>
         <w:t xml:space="preserve"> </w:t>
@@ -3646,7 +3662,7 @@
         <w:t xml:space="preserve">et al.</w:t>
       </w:r>
       <w:r>
-        <w:t xml:space="preserve">, 2018).</w:t>
+        <w:t xml:space="preserve">, 2018), mas, com 71 municípios, só em caráter exploratório.</w:t>
       </w:r>
     </w:p>
     <w:p>
@@ -3668,7 +3684,7 @@
         <w:t xml:space="preserve"> </w:t>
       </w:r>
       <w:r>
-        <w:t xml:space="preserve">Sem nota, não há corte para regressão descontínua, mas os projetos são distribuídos aos pareceristas por ordem de inscrição e área (SECULT, 2025c). Se essa designação se comportar como sorteio dentro de área e período, a severidade do parecerista (a parcela de pareceres favoráveis nos seus outros projetos) é instrumento para o parecer, como o examinador designado em Maestas, Mullen e Strand (2013), sob exclusão e monotonicidade testáveis e com o parecerista de cada inscrição obtido por LAI. Como são 41 pareceristas credenciados, de 4 a 20 por área, o instrumento por área é fraco, e o desenho fica exploratório, com áreas afins agrupadas.</w:t>
+        <w:t xml:space="preserve">Sem nota, não há corte para regressão descontínua, mas os projetos são distribuídos aos pareceristas por ordem de inscrição e área (SECULT, 2025c). Se essa designação se comportar como sorteio dentro de área e período, a severidade do parecerista (a parcela de pareceres favoráveis nos seus outros projetos) é instrumento para o parecer, como o examinador designado em Maestas, Mullen e Strand (2013), sob exclusão e monotonicidade testáveis e com o parecerista de cada inscrição obtido pela Lei de Acesso à Informação (LAI). Como são 41 pareceristas credenciados, de 4 a 20 por área, o instrumento por área é fraco, e o desenho fica exploratório, com áreas afins agrupadas.</w:t>
       </w:r>
     </w:p>
     <w:p>
@@ -3686,7 +3702,7 @@
         <w:t xml:space="preserve"> </w:t>
       </w:r>
       <w:r>
-        <w:t xml:space="preserve">Cada estratégia pede um método próprio: regressão descontínua no tempo, com a hora de protocolo em torno do esgotamento de cada cota; variáveis instrumentais, com a recusa pelo teto e a severidade do parecerista; e diferenças em diferenças para H3, com as regras de custo novas de 2025 e 2026.</w:t>
+        <w:t xml:space="preserve">Regressão descontínua no tempo (protocolo em torno do esgotamento de cada cota), variáveis instrumentais (recusa pelo teto; severidade do parecerista) e, para H3, diferenças em diferenças com as regras de custo de 2025 e 2026.</w:t>
       </w:r>
     </w:p>
     <w:bookmarkEnd w:id="26"/>
@@ -3704,7 +3720,7 @@
         <w:pStyle w:val="FirstParagraph"/>
       </w:pPr>
       <w:r>
-        <w:t xml:space="preserve">Para H5 e H2, trabalha-se com o universo, e a listagem vem dos anexos oficiais: 293 projetos habilitados em 2022-2024 com situação resolvida, de 172 proponentes, e os termos de 2023 e 2024 na margem do racionamento. Para H1, a população principal é quem decide o patrocínio (marketing, diretoria ou relações institucionais): a listagem parte das 26 patrocinadoras de 2025, e os maiores contribuintes fora do Simples Nacional, listados com a SEFAZ, formam uma extensão, com parâmetro possivelmente diferente. Para H4, a listagem é o cadastro de agentes do Mapa Cultural, em que 79% dos coletivos e 78% dos individuais não informam município; com município no interior, há 257 coletivos em 52 municípios e 2.389 agentes, somados os individuais, nos 71. A oferta é sorteada entre municípios do interior e chega a todos os agentes cadastrados sem inscrição anterior; quem não está no Mapa fica de fora, um viés de cobertura. A chave de ligação é o CNPJ do proponente: o Portal da Transparência o traz para quem captou (ESPÍRITO SANTO, 2026), e a SECULT, para os demais, por pedido de acesso à informação (Quadro 4).</w:t>
+        <w:t xml:space="preserve">Para H5 e H2, trabalha-se com o universo, e a listagem vem dos anexos oficiais: 293 projetos habilitados em 2022-2024 com situação resolvida, de 172 proponentes, e os termos de 2023 e 2024 na margem do racionamento. Para H1, a população principal é quem decide o patrocínio (marketing, diretoria ou relações institucionais): a listagem parte das 26 patrocinadoras de 2025, e os maiores contribuintes fora do Simples Nacional, listados com a SEFAZ, formam uma extensão, com parâmetro possivelmente diferente. Para H4, a listagem é o cadastro de agentes do Mapa Cultural, em que 79% dos coletivos e 78% dos individuais não informam município; com município no interior, há 257 coletivos em 52 municípios e 2.389 agentes, somados os individuais, nos 71. A oferta é sorteada entre municípios do interior e chega a todos os agentes cadastrados sem inscrição anterior; quem não está no Mapa fica de fora, um viés de cobertura. A chave de ligação é o CNPJ do proponente: o Portal da Transparência o traz para quem captou (ESPÍRITO SANTO, 2026), e os avisos de habilitação no Diário Oficial, para a maior parte dos demais (DIO-ES, 2026); juntas, cobrem 385 dos 463 habilitados (83%), e o restante e os inabilitados ficam para a LAI (Quadro 4).</w:t>
       </w:r>
     </w:p>
     <w:p>
@@ -3978,23 +3994,23 @@
               <w:rPr>
                 <w:sz w:val="20"/>
               </w:rPr>
-              <w:t xml:space="preserve">Anexos de habilitados e captados; extratos do Diário Oficial e das atas da CAP</w:t>
-            </w:r>
-          </w:p>
-        </w:tc>
-        <w:tc>
-          <w:tcPr/>
-          <w:p>
-            <w:pPr>
-              <w:pStyle w:val="Compact"/>
-              <w:spacing w:after="0" w:before="0"/>
-              <w:jc w:val="left"/>
-            </w:pPr>
-            <w:r>
-              <w:rPr>
-                <w:sz w:val="20"/>
-              </w:rPr>
-              <w:t xml:space="preserve">Status, valores, patrocinador e data de cada repasse; inabilitados e data da habilitação</w:t>
+              <w:t xml:space="preserve">Anexos de habilitados e captados; avisos do Diário Oficial; extratos das atas da CAP</w:t>
+            </w:r>
+          </w:p>
+        </w:tc>
+        <w:tc>
+          <w:tcPr/>
+          <w:p>
+            <w:pPr>
+              <w:pStyle w:val="Compact"/>
+              <w:spacing w:after="0" w:before="0"/>
+              <w:jc w:val="left"/>
+            </w:pPr>
+            <w:r>
+              <w:rPr>
+                <w:sz w:val="20"/>
+              </w:rPr>
+              <w:t xml:space="preserve">Status, valores e patrocinador; CNPJ e data da habilitação; data de cada depósito (82% dos termos de 2022-2025); inabilitados</w:t>
             </w:r>
           </w:p>
         </w:tc>
@@ -4126,7 +4142,7 @@
               <w:rPr>
                 <w:sz w:val="20"/>
               </w:rPr>
-              <w:t xml:space="preserve">Data de protocolo e de validação dos termos, cota e indeferidos</w:t>
+              <w:t xml:space="preserve">Hora de protocolo (pública só nos validados de 2025) e de validação dos termos, cota e indeferidos</w:t>
             </w:r>
           </w:p>
         </w:tc>
@@ -4288,7 +4304,7 @@
               <w:rPr>
                 <w:sz w:val="20"/>
               </w:rPr>
-              <w:t xml:space="preserve">Listagem de H4; ocorrência de eventos (</w:t>
+              <w:t xml:space="preserve">Listagem de H4; eventos datados de 18 projetos (</w:t>
             </w:r>
             <w:r>
               <w:rPr>
@@ -4349,7 +4365,7 @@
       </w:r>
     </w:p>
     <w:bookmarkEnd w:id="27"/>
-    <w:bookmarkStart w:id="33" w:name="cálculo-do-poder-estatístico"/>
+    <w:bookmarkStart w:id="35" w:name="cálculo-do-poder-estatístico"/>
     <w:p>
       <w:pPr>
         <w:pStyle w:val="Heading2"/>
@@ -4835,8 +4851,8 @@
         </w:tblBorders>
       </w:tblPr>
       <w:tblGrid>
-        <w:gridCol w:w="3615"/>
-        <w:gridCol w:w="1807"/>
+        <w:gridCol w:w="2926"/>
+        <w:gridCol w:w="2496"/>
         <w:gridCol w:w="1721"/>
         <w:gridCol w:w="774"/>
       </w:tblGrid>
@@ -4961,7 +4977,7 @@
               <w:rPr>
                 <w:sz w:val="20"/>
               </w:rPr>
-              <w:t xml:space="preserve">30 a 60 decisores × 12 tarefas (720 a 1.440 perfis)</w:t>
+              <w:t xml:space="preserve">30 a 60 decisores × 12 tarefas</w:t>
             </w:r>
           </w:p>
         </w:tc>
@@ -5051,7 +5067,7 @@
               <w:rPr>
                 <w:sz w:val="20"/>
               </w:rPr>
-              <w:t xml:space="preserve">32 recusados × 32 validados antes do esgotamento</w:t>
+              <w:t xml:space="preserve">32 recusados × 32 validados</w:t>
             </w:r>
           </w:p>
         </w:tc>
@@ -5442,13 +5458,7 @@
         <w:rPr>
           <w:sz w:val="20"/>
         </w:rPr>
-        <w:t xml:space="preserve"> </w:t>
-      </w:r>
-      <w:r>
-        <w:rPr>
-          <w:sz w:val="20"/>
-        </w:rPr>
-        <w:t xml:space="preserve">e</w:t>
+        <w:t xml:space="preserve">,</w:t>
       </w:r>
       <w:r>
         <w:rPr>
@@ -5474,6 +5484,32 @@
         <w:rPr>
           <w:sz w:val="20"/>
         </w:rPr>
+        <w:t xml:space="preserve">e</w:t>
+      </w:r>
+      <w:r>
+        <w:rPr>
+          <w:sz w:val="20"/>
+        </w:rPr>
+        <w:t xml:space="preserve"> </w:t>
+      </w:r>
+      <w:hyperlink r:id="rId31">
+        <w:r>
+          <w:rPr>
+            <w:rStyle w:val="VerbatimChar"/>
+          </w:rPr>
+          <w:t xml:space="preserve">19_poder_revisao.csv</w:t>
+        </w:r>
+      </w:hyperlink>
+      <w:r>
+        <w:rPr>
+          <w:sz w:val="20"/>
+        </w:rPr>
+        <w:t xml:space="preserve"> </w:t>
+      </w:r>
+      <w:r>
+        <w:rPr>
+          <w:sz w:val="20"/>
+        </w:rPr>
         <w:t xml:space="preserve">(scripts</w:t>
       </w:r>
       <w:r>
@@ -5482,7 +5518,7 @@
         </w:rPr>
         <w:t xml:space="preserve"> </w:t>
       </w:r>
-      <w:hyperlink r:id="rId31">
+      <w:hyperlink r:id="rId32">
         <w:r>
           <w:rPr>
             <w:rStyle w:val="VerbatimChar"/>
@@ -5494,21 +5530,15 @@
         <w:rPr>
           <w:sz w:val="20"/>
         </w:rPr>
-        <w:t xml:space="preserve"> </w:t>
+        <w:t xml:space="preserve">,</w:t>
       </w:r>
       <w:r>
         <w:rPr>
           <w:sz w:val="20"/>
         </w:rPr>
-        <w:t xml:space="preserve">e</w:t>
-      </w:r>
-      <w:r>
-        <w:rPr>
-          <w:sz w:val="20"/>
-        </w:rPr>
-        <w:t xml:space="preserve"> </w:t>
-      </w:r>
-      <w:hyperlink r:id="rId32">
+        <w:t xml:space="preserve"> </w:t>
+      </w:r>
+      <w:hyperlink r:id="rId33">
         <w:r>
           <w:rPr>
             <w:rStyle w:val="VerbatimChar"/>
@@ -5520,6 +5550,32 @@
         <w:rPr>
           <w:sz w:val="20"/>
         </w:rPr>
+        <w:t xml:space="preserve"> </w:t>
+      </w:r>
+      <w:r>
+        <w:rPr>
+          <w:sz w:val="20"/>
+        </w:rPr>
+        <w:t xml:space="preserve">e</w:t>
+      </w:r>
+      <w:r>
+        <w:rPr>
+          <w:sz w:val="20"/>
+        </w:rPr>
+        <w:t xml:space="preserve"> </w:t>
+      </w:r>
+      <w:hyperlink r:id="rId34">
+        <w:r>
+          <w:rPr>
+            <w:rStyle w:val="VerbatimChar"/>
+          </w:rPr>
+          <w:t xml:space="preserve">19_poder_revisao.py</w:t>
+        </w:r>
+      </w:hyperlink>
+      <w:r>
+        <w:rPr>
+          <w:sz w:val="20"/>
+        </w:rPr>
         <w:t xml:space="preserve">).</w:t>
       </w:r>
     </w:p>
@@ -5528,7 +5584,20 @@
         <w:pStyle w:val="BodyText"/>
       </w:pPr>
       <w:r>
-        <w:t xml:space="preserve">A comparação na margem do racionamento só detecta efeitos muito grandes, acima dos esperados (seção 3), e serve como verificação de robustez. O experimento conjunto detecta diferenças de 7 a 13 pontos na probabilidade de escolha com 60 decisores, e de 10 a 19 com 30. O desenho de H4 detecta efeitos de poucos pontos se incluir os agentes individuais, que precisariam de CNPJ (MEI) para se inscrever; só com os coletivos, o efeito mínimo passa de 5 pontos. Com poder baixo, uma estimativa</w:t>
+        <w:t xml:space="preserve">A comparação na margem do racionamento só detecta efeitos muito grandes, acima dos esperados (seção 3), e serve como verificação de robustez; para o efeito de receber em algum momento, o EMD divide-se pelo primeiro estágio (0,41) e vai a 69 a 84 pontos. Com os recusados de 2025 e 2026 (LAI), se dobrarem a margem, o EMD de receber agora cai para 20 a 24 pontos. O experimento conjunto detecta diferenças de 7 a 13 pontos na probabilidade de escolha com 60 decisores, e de 10 a 19 com 30. O desenho de H4 detecta efeitos de poucos pontos se incluir os agentes individuais, que precisariam de CNPJ (MEI) para se inscrever, e só assim atende à regra de 30 a 50 conglomerados por grupo (GERTLER</w:t>
+      </w:r>
+      <w:r>
+        <w:t xml:space="preserve"> </w:t>
+      </w:r>
+      <w:r>
+        <w:rPr>
+          <w:i/>
+          <w:iCs/>
+        </w:rPr>
+        <w:t xml:space="preserve">et al.</w:t>
+      </w:r>
+      <w:r>
+        <w:t xml:space="preserve">, 2018): são 35 ou 36 municípios em cada, e a diferença entre os braços tem EMD de 2,3 a 4,9 pontos. Só com os coletivos, são 26 por grupo, e o efeito mínimo passa de 5 pontos. Para quem adere à oferta, o EMD é o da Tabela 2 dividido pela adesão. Com poder baixo, uma estimativa</w:t>
       </w:r>
       <w:r>
         <w:t xml:space="preserve"> </w:t>
@@ -5543,8 +5612,8 @@
         <w:t xml:space="preserve">tende a exagerar o efeito verdadeiro (GELMAN; CARLIN, 2014), o que recomenda pré-registrar a análise e corrigir comparações múltiplas.</w:t>
       </w:r>
     </w:p>
-    <w:bookmarkEnd w:id="33"/>
-    <w:bookmarkStart w:id="34" w:name="ameaças-à-validade-e-ética"/>
+    <w:bookmarkEnd w:id="35"/>
+    <w:bookmarkStart w:id="36" w:name="ameaças-à-validade-e-ética"/>
     <w:p>
       <w:pPr>
         <w:pStyle w:val="Heading2"/>
@@ -5561,9 +5630,9 @@
         <w:t xml:space="preserve">A primeira ameaça à validade interna é a violação da hipótese de ausência de interferência entre unidades (SUTVA): com o teto fixo, o que um projeto capta falta a outro. Seguem-se a substituição de fonte (a captação pela Lei Rouanet entra como resultado), os eventos externos do período (Lei Paulo Gustavo e Política Nacional Aldir Blanc) e o atrito dos dados. No experimento conjunto, a escolha declarada pode pender para o socialmente desejável; a escolha forçada entre perfis reduz o viés, e os patrocínios observados servem de validação. A validade externa é limitada: as comparações de H5 valem para o regime de 2022-2024, em que a habilitação precedia a busca por patrocinador, e desde 2025 os expirados quase desapareceram (3 em 56 resolvidos no ciclo 2025). No plano ético, nenhum desenho nega acesso a elegíveis: o apoio chega aos controles ao fim, e o deslocamento pelo teto é medido pela saturação. Dados identificados exigem anonimização (LGPD), e pesquisas com pessoas, aprovação de comitê de ética.</w:t>
       </w:r>
     </w:p>
-    <w:bookmarkEnd w:id="34"/>
-    <w:bookmarkEnd w:id="35"/>
-    <w:bookmarkStart w:id="36" w:name="conclusão"/>
+    <w:bookmarkEnd w:id="36"/>
+    <w:bookmarkEnd w:id="37"/>
+    <w:bookmarkStart w:id="38" w:name="conclusão"/>
     <w:p>
       <w:pPr>
         <w:pStyle w:val="Heading1"/>
@@ -5585,7 +5654,7 @@
         <w:pStyle w:val="BodyText"/>
       </w:pPr>
       <w:r>
-        <w:t xml:space="preserve">Sem alterar o mecanismo, a gestão pode declarar objetivos, metas e indicadores e publicar os inscritos, com CNPJ, sede e motivo de inabilitação; a captação por cota; a fila de termos, com datas de protocolo e validação, também dos recusados; e custos, contrapartidas e público alcançado.</w:t>
+        <w:t xml:space="preserve">Sem alterar o mecanismo, a gestão pode declarar objetivos, metas e indicadores e publicar, em formato aberto, os inscritos, com CNPJ, sede e motivo de inabilitação; a captação por cota; a fila de termos, com datas de protocolo e validação, também dos recusados; e custos, contrapartidas e público alcançado.</w:t>
       </w:r>
     </w:p>
     <w:p>
@@ -5596,8 +5665,8 @@
         <w:t xml:space="preserve">Das quatro perguntas, a da entrega (H5) é a mais importante e a mais difícil: mais da metade dos recusados por falta de teto captou no ano seguinte, e comparar quem recebe com quem não recebe exige resultado datado e a fila de termos com as datas. Se a adicionalidade na margem for baixa, ampliar o teto financia sobretudo o que ocorreria de todo modo, e as decisões que importam passam a ser quem entra e o que se entrega. Limitações dos dados: a situação publicada aproxima a captação, a estreia é medida por nome de proponente, e o retrato territorial cobre 74% do valor.</w:t>
       </w:r>
     </w:p>
-    <w:bookmarkEnd w:id="36"/>
-    <w:bookmarkStart w:id="56" w:name="referências"/>
+    <w:bookmarkEnd w:id="38"/>
+    <w:bookmarkStart w:id="58" w:name="referências"/>
     <w:p>
       <w:pPr>
         <w:pStyle w:val="Heading1"/>
@@ -5629,7 +5698,7 @@
       <w:r>
         <w:t xml:space="preserve"> </w:t>
       </w:r>
-      <w:hyperlink r:id="rId37">
+      <w:hyperlink r:id="rId39">
         <w:r>
           <w:rPr>
             <w:rStyle w:val="Hyperlink"/>
@@ -5664,7 +5733,7 @@
       <w:r>
         <w:t xml:space="preserve"> </w:t>
       </w:r>
-      <w:hyperlink r:id="rId38">
+      <w:hyperlink r:id="rId40">
         <w:r>
           <w:rPr>
             <w:rStyle w:val="Hyperlink"/>
@@ -5784,7 +5853,7 @@
       <w:r>
         <w:t xml:space="preserve"> </w:t>
       </w:r>
-      <w:hyperlink r:id="rId39">
+      <w:hyperlink r:id="rId41">
         <w:r>
           <w:rPr>
             <w:rStyle w:val="Hyperlink"/>
@@ -5903,7 +5972,7 @@
       <w:r>
         <w:t xml:space="preserve"> </w:t>
       </w:r>
-      <w:hyperlink r:id="rId40">
+      <w:hyperlink r:id="rId42">
         <w:r>
           <w:rPr>
             <w:rStyle w:val="Hyperlink"/>
@@ -5938,7 +6007,7 @@
       <w:r>
         <w:t xml:space="preserve"> </w:t>
       </w:r>
-      <w:hyperlink r:id="rId41">
+      <w:hyperlink r:id="rId43">
         <w:r>
           <w:rPr>
             <w:rStyle w:val="Hyperlink"/>
@@ -5973,7 +6042,7 @@
       <w:r>
         <w:t xml:space="preserve"> </w:t>
       </w:r>
-      <w:hyperlink r:id="rId42">
+      <w:hyperlink r:id="rId44">
         <w:r>
           <w:rPr>
             <w:rStyle w:val="Hyperlink"/>
@@ -5990,7 +6059,7 @@
         <w:pStyle w:val="BodyText"/>
       </w:pPr>
       <w:r>
-        <w:t xml:space="preserve">DJIMEU, Eric W.; HOUNDOLO, Deo-Gracias. Power calculation for causal inference in social science: sample size and minimum detectable effect determination.</w:t>
+        <w:t xml:space="preserve">DIO-ES – DEPARTAMENTO DE IMPRENSA OFICIAL DO ESPÍRITO SANTO.</w:t>
       </w:r>
       <w:r>
         <w:t xml:space="preserve"> </w:t>
@@ -6000,6 +6069,27 @@
           <w:b/>
           <w:bCs/>
         </w:rPr>
+        <w:t xml:space="preserve">Diário Oficial dos Poderes do Estado</w:t>
+      </w:r>
+      <w:r>
+        <w:t xml:space="preserve">: avisos de habilitação e de depósito da LICC, 2022-2026. Vitória: DIO-ES, 2026. Disponível em: https://ioes.dio.es.gov.br. Acesso em: 27 set. 2026.</w:t>
+      </w:r>
+    </w:p>
+    <w:p>
+      <w:pPr>
+        <w:pStyle w:val="BodyText"/>
+      </w:pPr>
+      <w:r>
+        <w:t xml:space="preserve">DJIMEU, Eric W.; HOUNDOLO, Deo-Gracias. Power calculation for causal inference in social science: sample size and minimum detectable effect determination.</w:t>
+      </w:r>
+      <w:r>
+        <w:t xml:space="preserve"> </w:t>
+      </w:r>
+      <w:r>
+        <w:rPr>
+          <w:b/>
+          <w:bCs/>
+        </w:rPr>
         <w:t xml:space="preserve">Journal of Development Effectiveness</w:t>
       </w:r>
       <w:r>
@@ -6008,7 +6098,7 @@
       <w:r>
         <w:t xml:space="preserve"> </w:t>
       </w:r>
-      <w:hyperlink r:id="rId43">
+      <w:hyperlink r:id="rId45">
         <w:r>
           <w:rPr>
             <w:rStyle w:val="Hyperlink"/>
@@ -6043,7 +6133,7 @@
       <w:r>
         <w:t xml:space="preserve"> </w:t>
       </w:r>
-      <w:hyperlink r:id="rId44">
+      <w:hyperlink r:id="rId46">
         <w:r>
           <w:rPr>
             <w:rStyle w:val="Hyperlink"/>
@@ -6162,7 +6252,7 @@
       <w:r>
         <w:t xml:space="preserve"> </w:t>
       </w:r>
-      <w:hyperlink r:id="rId45">
+      <w:hyperlink r:id="rId47">
         <w:r>
           <w:rPr>
             <w:rStyle w:val="Hyperlink"/>
@@ -6197,7 +6287,7 @@
       <w:r>
         <w:t xml:space="preserve"> </w:t>
       </w:r>
-      <w:hyperlink r:id="rId46">
+      <w:hyperlink r:id="rId48">
         <w:r>
           <w:rPr>
             <w:rStyle w:val="Hyperlink"/>
@@ -6253,7 +6343,7 @@
       <w:r>
         <w:t xml:space="preserve"> </w:t>
       </w:r>
-      <w:hyperlink r:id="rId47">
+      <w:hyperlink r:id="rId49">
         <w:r>
           <w:rPr>
             <w:rStyle w:val="Hyperlink"/>
@@ -6351,7 +6441,7 @@
       <w:r>
         <w:t xml:space="preserve"> </w:t>
       </w:r>
-      <w:hyperlink r:id="rId48">
+      <w:hyperlink r:id="rId50">
         <w:r>
           <w:rPr>
             <w:rStyle w:val="Hyperlink"/>
@@ -6386,7 +6476,7 @@
       <w:r>
         <w:t xml:space="preserve"> </w:t>
       </w:r>
-      <w:hyperlink r:id="rId49">
+      <w:hyperlink r:id="rId51">
         <w:r>
           <w:rPr>
             <w:rStyle w:val="Hyperlink"/>
@@ -6421,7 +6511,7 @@
       <w:r>
         <w:t xml:space="preserve"> </w:t>
       </w:r>
-      <w:hyperlink r:id="rId50">
+      <w:hyperlink r:id="rId52">
         <w:r>
           <w:rPr>
             <w:rStyle w:val="Hyperlink"/>
@@ -6477,7 +6567,7 @@
       <w:r>
         <w:t xml:space="preserve"> </w:t>
       </w:r>
-      <w:hyperlink r:id="rId51">
+      <w:hyperlink r:id="rId53">
         <w:r>
           <w:rPr>
             <w:rStyle w:val="Hyperlink"/>
@@ -6494,7 +6584,7 @@
         <w:pStyle w:val="BodyText"/>
       </w:pPr>
       <w:r>
-        <w:t xml:space="preserve">RIO GRANDE DO SUL. Governo do Estado.</w:t>
+        <w:t xml:space="preserve">SECULT – SECRETARIA DE ESTADO DA CULTURA DO ESPÍRITO SANTO.</w:t>
       </w:r>
       <w:r>
         <w:t xml:space="preserve"> </w:t>
@@ -6504,18 +6594,18 @@
           <w:b/>
           <w:bCs/>
         </w:rPr>
-        <w:t xml:space="preserve">Estado divulga lista de projetos classificados no edital da Lei de Incentivo à Cultura</w:t>
-      </w:r>
-      <w:r>
-        <w:t xml:space="preserve">. Porto Alegre, 20 jun. 2024. Disponível em: https://www.estado.rs.gov.br/estado-divulga-lista-de-projetos-classificados-no-edital-da-lei-de-incentivo-a-cultura. Acesso em: 27 set. 2026.</w:t>
-      </w:r>
-    </w:p>
-    <w:p>
-      <w:pPr>
-        <w:pStyle w:val="BodyText"/>
-      </w:pPr>
-      <w:r>
-        <w:t xml:space="preserve">RIO GRANDE DO SUL. Secretaria da Cultura.</w:t>
+        <w:t xml:space="preserve">Boletim de Economia Criativa</w:t>
+      </w:r>
+      <w:r>
+        <w:t xml:space="preserve">: Espírito Santo, 2º trimestre de 2020. Vitória: SECULT, 2020. Disponível em: https://secult.es.gov.br/media/002/Boletim_Economia_Criativa_02T_2020.pdf. Acesso em: 27 set. 2026.</w:t>
+      </w:r>
+    </w:p>
+    <w:p>
+      <w:pPr>
+        <w:pStyle w:val="BodyText"/>
+      </w:pPr>
+      <w:r>
+        <w:t xml:space="preserve">SECULT – SECRETARIA DE ESTADO DA CULTURA DO ESPÍRITO SANTO.</w:t>
       </w:r>
       <w:r>
         <w:t xml:space="preserve"> </w:t>
@@ -6525,18 +6615,28 @@
           <w:b/>
           <w:bCs/>
         </w:rPr>
-        <w:t xml:space="preserve">Lei de Incentivo à Cultura</w:t>
-      </w:r>
-      <w:r>
-        <w:t xml:space="preserve">: sobre. Porto Alegre: Sedac, 2026. Disponível em: https://cultura.rs.gov.br/lei-de-incentivo-a-cultura. Acesso em: 27 set. 2026.</w:t>
-      </w:r>
-    </w:p>
-    <w:p>
-      <w:pPr>
-        <w:pStyle w:val="BodyText"/>
-      </w:pPr>
-      <w:r>
-        <w:t xml:space="preserve">SECULT – SECRETARIA DE ESTADO DA CULTURA DO ESPÍRITO SANTO.</w:t>
+        <w:t xml:space="preserve">Instrução Normativa nº 002, de 31 de janeiro de 2022</w:t>
+      </w:r>
+      <w:r>
+        <w:t xml:space="preserve">. Vitória: SECULT, 2022. Disponível em: https://secult.es.gov.br/media/2022/INSTRU_</w:t>
+      </w:r>
+      <w:r>
+        <w:rPr>
+          <w:i/>
+          <w:iCs/>
+        </w:rPr>
+        <w:t xml:space="preserve">O_NORMATIVA_LICC</w:t>
+      </w:r>
+      <w:r>
+        <w:t xml:space="preserve">-_SECULT.pdf. Acesso em: 27 set. 2026.</w:t>
+      </w:r>
+    </w:p>
+    <w:p>
+      <w:pPr>
+        <w:pStyle w:val="BodyText"/>
+      </w:pPr>
+      <w:r>
+        <w:t xml:space="preserve">SECULT – SECRETARIA DE ESTADO DA CULTURA DO ESPÍRITO SANTO. Instrução Normativa nº 001, de 31 de janeiro de 2023.</w:t>
       </w:r>
       <w:r>
         <w:t xml:space="preserve"> </w:t>
@@ -6546,18 +6646,18 @@
           <w:b/>
           <w:bCs/>
         </w:rPr>
-        <w:t xml:space="preserve">Boletim de Economia Criativa</w:t>
-      </w:r>
-      <w:r>
-        <w:t xml:space="preserve">: Espírito Santo, 2º trimestre de 2020. Vitória: SECULT, 2020. Disponível em: https://secult.es.gov.br/media/002/Boletim_Economia_Criativa_02T_2020.pdf. Acesso em: 27 set. 2026.</w:t>
-      </w:r>
-    </w:p>
-    <w:p>
-      <w:pPr>
-        <w:pStyle w:val="BodyText"/>
-      </w:pPr>
-      <w:r>
-        <w:t xml:space="preserve">SECULT – SECRETARIA DE ESTADO DA CULTURA DO ESPÍRITO SANTO.</w:t>
+        <w:t xml:space="preserve">Diário Oficial dos Poderes do Estado</w:t>
+      </w:r>
+      <w:r>
+        <w:t xml:space="preserve">, Vitória, 1º fev. 2023a. Disponível em: https://secult.es.gov.br/instrucao-normativa-licc-2023. Acesso em: 24 set. 2026.</w:t>
+      </w:r>
+    </w:p>
+    <w:p>
+      <w:pPr>
+        <w:pStyle w:val="BodyText"/>
+      </w:pPr>
+      <w:r>
+        <w:t xml:space="preserve">SECULT – SECRETARIA DE ESTADO DA CULTURA DO ESPÍRITO SANTO. Regimento interno da Comissão de Avaliação Permanente (CAP) da Lei de Incentivo à Cultura Capixaba.</w:t>
       </w:r>
       <w:r>
         <w:t xml:space="preserve"> </w:t>
@@ -6567,28 +6667,18 @@
           <w:b/>
           <w:bCs/>
         </w:rPr>
-        <w:t xml:space="preserve">Instrução Normativa nº 002, de 31 de janeiro de 2022</w:t>
-      </w:r>
-      <w:r>
-        <w:t xml:space="preserve">. Vitória: SECULT, 2022. Disponível em: https://secult.es.gov.br/media/2022/INSTRU_</w:t>
-      </w:r>
-      <w:r>
-        <w:rPr>
-          <w:i/>
-          <w:iCs/>
-        </w:rPr>
-        <w:t xml:space="preserve">O_NORMATIVA_LICC</w:t>
-      </w:r>
-      <w:r>
-        <w:t xml:space="preserve">-_SECULT.pdf. Acesso em: 27 set. 2026.</w:t>
-      </w:r>
-    </w:p>
-    <w:p>
-      <w:pPr>
-        <w:pStyle w:val="BodyText"/>
-      </w:pPr>
-      <w:r>
-        <w:t xml:space="preserve">SECULT – SECRETARIA DE ESTADO DA CULTURA DO ESPÍRITO SANTO. Instrução Normativa nº 001, de 31 de janeiro de 2023.</w:t>
+        <w:t xml:space="preserve">Diário Oficial dos Poderes do Estado</w:t>
+      </w:r>
+      <w:r>
+        <w:t xml:space="preserve">, Vitória, 16 fev. 2023b. Disponível em: https://secult.es.gov.br/legislacao-licc. Acesso em: 23 set. 2026.</w:t>
+      </w:r>
+    </w:p>
+    <w:p>
+      <w:pPr>
+        <w:pStyle w:val="BodyText"/>
+      </w:pPr>
+      <w:r>
+        <w:t xml:space="preserve">SECULT – SECRETARIA DE ESTADO DA CULTURA DO ESPÍRITO SANTO. Instrução Normativa nº 001, de 31 de janeiro de 2024.</w:t>
       </w:r>
       <w:r>
         <w:t xml:space="preserve"> </w:t>
@@ -6601,15 +6691,23 @@
         <w:t xml:space="preserve">Diário Oficial dos Poderes do Estado</w:t>
       </w:r>
       <w:r>
-        <w:t xml:space="preserve">, Vitória, 1º fev. 2023a. Disponível em: https://secult.es.gov.br/instrucao-normativa-licc-2023. Acesso em: 24 set. 2026.</w:t>
-      </w:r>
-    </w:p>
-    <w:p>
-      <w:pPr>
-        <w:pStyle w:val="BodyText"/>
-      </w:pPr>
-      <w:r>
-        <w:t xml:space="preserve">SECULT – SECRETARIA DE ESTADO DA CULTURA DO ESPÍRITO SANTO. Regimento interno da Comissão de Avaliação Permanente (CAP) da Lei de Incentivo à Cultura Capixaba.</w:t>
+        <w:t xml:space="preserve">, Vitória, 1º fev. 2024a. Disponível em: https://secult.es.gov.br/instrucao-normativa-licc-2024. Acesso em: 24 set. 2026.</w:t>
+      </w:r>
+    </w:p>
+    <w:p>
+      <w:pPr>
+        <w:pStyle w:val="BodyText"/>
+      </w:pPr>
+      <w:r>
+        <w:t xml:space="preserve">SECULT – SECRETARIA DE ESTADO DA CULTURA DO ESPÍRITO SANTO. Portaria nº 078, de 31 de julho de 2024. Introduz alterações no artigo 12 da Instrução Normativa nº 001 de 31 de janeiro de 2024. Vitória: SECULT, 2024b. Disponível em: https://secult.es.gov.br/media/2024/PORTARIA_SECULT_N%C2%BA_078%2C_DE_31_DE_JULHO_DE_2024.pdf. Acesso em: 23 set. 2026.</w:t>
+      </w:r>
+    </w:p>
+    <w:p>
+      <w:pPr>
+        <w:pStyle w:val="BodyText"/>
+      </w:pPr>
+      <w:r>
+        <w:t xml:space="preserve">SECULT – SECRETARIA DE ESTADO DA CULTURA DO ESPÍRITO SANTO.</w:t>
       </w:r>
       <w:r>
         <w:t xml:space="preserve"> </w:t>
@@ -6619,18 +6717,18 @@
           <w:b/>
           <w:bCs/>
         </w:rPr>
-        <w:t xml:space="preserve">Diário Oficial dos Poderes do Estado</w:t>
-      </w:r>
-      <w:r>
-        <w:t xml:space="preserve">, Vitória, 16 fev. 2023b. Disponível em: https://secult.es.gov.br/legislacao-licc. Acesso em: 23 set. 2026.</w:t>
-      </w:r>
-    </w:p>
-    <w:p>
-      <w:pPr>
-        <w:pStyle w:val="BodyText"/>
-      </w:pPr>
-      <w:r>
-        <w:t xml:space="preserve">SECULT – SECRETARIA DE ESTADO DA CULTURA DO ESPÍRITO SANTO. Instrução Normativa nº 001, de 31 de janeiro de 2024.</w:t>
+        <w:t xml:space="preserve">Instrução Normativa nº 001/2025, de 14 de janeiro de 2025</w:t>
+      </w:r>
+      <w:r>
+        <w:t xml:space="preserve">. Vitória: SECULT, 2025a.</w:t>
+      </w:r>
+    </w:p>
+    <w:p>
+      <w:pPr>
+        <w:pStyle w:val="BodyText"/>
+      </w:pPr>
+      <w:r>
+        <w:t xml:space="preserve">SECULT – SECRETARIA DE ESTADO DA CULTURA DO ESPÍRITO SANTO. Portaria nº 062-S, de 9 de maio de 2025. Altera a Instrução Normativa nº 001 de 31 de janeiro de 2025.</w:t>
       </w:r>
       <w:r>
         <w:t xml:space="preserve"> </w:t>
@@ -6643,15 +6741,7 @@
         <w:t xml:space="preserve">Diário Oficial dos Poderes do Estado</w:t>
       </w:r>
       <w:r>
-        <w:t xml:space="preserve">, Vitória, 1º fev. 2024a. Disponível em: https://secult.es.gov.br/instrucao-normativa-licc-2024. Acesso em: 24 set. 2026.</w:t>
-      </w:r>
-    </w:p>
-    <w:p>
-      <w:pPr>
-        <w:pStyle w:val="BodyText"/>
-      </w:pPr>
-      <w:r>
-        <w:t xml:space="preserve">SECULT – SECRETARIA DE ESTADO DA CULTURA DO ESPÍRITO SANTO. Portaria nº 078, de 31 de julho de 2024. Introduz alterações no artigo 12 da Instrução Normativa nº 001 de 31 de janeiro de 2024. Vitória: SECULT, 2024b. Disponível em: https://secult.es.gov.br/media/2024/PORTARIA_SECULT_N%C2%BA_078%2C_DE_31_DE_JULHO_DE_2024.pdf. Acesso em: 23 set. 2026.</w:t>
+        <w:t xml:space="preserve">, Vitória, 2025b.</w:t>
       </w:r>
     </w:p>
     <w:p>
@@ -6669,18 +6759,18 @@
           <w:b/>
           <w:bCs/>
         </w:rPr>
-        <w:t xml:space="preserve">Instrução Normativa nº 001/2025, de 14 de janeiro de 2025</w:t>
-      </w:r>
-      <w:r>
-        <w:t xml:space="preserve">. Vitória: SECULT, 2025a.</w:t>
-      </w:r>
-    </w:p>
-    <w:p>
-      <w:pPr>
-        <w:pStyle w:val="BodyText"/>
-      </w:pPr>
-      <w:r>
-        <w:t xml:space="preserve">SECULT – SECRETARIA DE ESTADO DA CULTURA DO ESPÍRITO SANTO. Portaria nº 062-S, de 9 de maio de 2025. Altera a Instrução Normativa nº 001 de 31 de janeiro de 2025.</w:t>
+        <w:t xml:space="preserve">Edital de credenciamento nº 001/2025</w:t>
+      </w:r>
+      <w:r>
+        <w:t xml:space="preserve">: serviços de pareceristas da Lei de Incentivo à Cultura Capixaba; lista de credenciados por área, atualizada em 18 set. 2026. Vitória: SECULT, 2025c. Disponível em: https://secult.es.gov.br/credenciamento. Acesso em: 27 set. 2026.</w:t>
+      </w:r>
+    </w:p>
+    <w:p>
+      <w:pPr>
+        <w:pStyle w:val="BodyText"/>
+      </w:pPr>
+      <w:r>
+        <w:t xml:space="preserve">SECULT – SECRETARIA DE ESTADO DA CULTURA DO ESPÍRITO SANTO.</w:t>
       </w:r>
       <w:r>
         <w:t xml:space="preserve"> </w:t>
@@ -6690,10 +6780,10 @@
           <w:b/>
           <w:bCs/>
         </w:rPr>
-        <w:t xml:space="preserve">Diário Oficial dos Poderes do Estado</w:t>
-      </w:r>
-      <w:r>
-        <w:t xml:space="preserve">, Vitória, 2025b.</w:t>
+        <w:t xml:space="preserve">Instrução Normativa nº 001/2026, de 12 de janeiro de 2026</w:t>
+      </w:r>
+      <w:r>
+        <w:t xml:space="preserve">. Vitória: SECULT, 2026a.</w:t>
       </w:r>
     </w:p>
     <w:p>
@@ -6711,10 +6801,22 @@
           <w:b/>
           <w:bCs/>
         </w:rPr>
-        <w:t xml:space="preserve">Edital de credenciamento nº 001/2025</w:t>
-      </w:r>
-      <w:r>
-        <w:t xml:space="preserve">: serviços de pareceristas da Lei de Incentivo à Cultura Capixaba; lista de credenciados por área, atualizada em 18 set. 2026. Vitória: SECULT, 2025c. Disponível em: https://secult.es.gov.br/credenciamento. Acesso em: 27 set. 2026.</w:t>
+        <w:t xml:space="preserve">Recursos financeiros captados</w:t>
+      </w:r>
+      <w:r>
+        <w:t xml:space="preserve">: anexos</w:t>
+      </w:r>
+      <w:r>
+        <w:t xml:space="preserve"> </w:t>
+      </w:r>
+      <w:r>
+        <w:t xml:space="preserve">“Recurso financeiro captado”</w:t>
+      </w:r>
+      <w:r>
+        <w:t xml:space="preserve"> </w:t>
+      </w:r>
+      <w:r>
+        <w:t xml:space="preserve">de 2022 a 2026. Vitória: SECULT, 2026c. Disponível em: https://secult.es.gov.br/recursos-financeiros-captados. Acesso em: 24 set. 2026.</w:t>
       </w:r>
     </w:p>
     <w:p>
@@ -6732,10 +6834,10 @@
           <w:b/>
           <w:bCs/>
         </w:rPr>
-        <w:t xml:space="preserve">Instrução Normativa nº 001/2026, de 12 de janeiro de 2026</w:t>
-      </w:r>
-      <w:r>
-        <w:t xml:space="preserve">. Vitória: SECULT, 2026a.</w:t>
+        <w:t xml:space="preserve">Mapa Cultural do Espírito Santo</w:t>
+      </w:r>
+      <w:r>
+        <w:t xml:space="preserve">: API pública de agentes e oportunidades (inclusive as fases de avaliação da LICC). Vitória: SECULT, 2026d. Disponível em: https://mapa.cultura.es.gov.br. Acesso em: 24 set. 2026.</w:t>
       </w:r>
     </w:p>
     <w:p>
@@ -6753,22 +6855,10 @@
           <w:b/>
           <w:bCs/>
         </w:rPr>
-        <w:t xml:space="preserve">Recursos financeiros captados</w:t>
-      </w:r>
-      <w:r>
-        <w:t xml:space="preserve">: anexos</w:t>
-      </w:r>
-      <w:r>
-        <w:t xml:space="preserve"> </w:t>
-      </w:r>
-      <w:r>
-        <w:t xml:space="preserve">“Recurso financeiro captado”</w:t>
-      </w:r>
-      <w:r>
-        <w:t xml:space="preserve"> </w:t>
-      </w:r>
-      <w:r>
-        <w:t xml:space="preserve">de 2022 a 2026. Vitória: SECULT, 2026c. Disponível em: https://secult.es.gov.br/recursos-financeiros-captados. Acesso em: 24 set. 2026.</w:t>
+        <w:t xml:space="preserve">Parecer técnico cultural LICC</w:t>
+      </w:r>
+      <w:r>
+        <w:t xml:space="preserve">: modelo padrão. Vitória: SECULT, 2026e. Disponível em: https://secult.es.gov.br/LICC. Acesso em: 24 set. 2026.</w:t>
       </w:r>
     </w:p>
     <w:p>
@@ -6786,18 +6876,13 @@
           <w:b/>
           <w:bCs/>
         </w:rPr>
-        <w:t xml:space="preserve">Mapa Cultural do Espírito Santo</w:t>
-      </w:r>
-      <w:r>
-        <w:t xml:space="preserve">: API pública de agentes e oportunidades (inclusive as fases de avaliação da LICC). Vitória: SECULT, 2026d. Disponível em: https://mapa.cultura.es.gov.br. Acesso em: 24 set. 2026.</w:t>
-      </w:r>
-    </w:p>
-    <w:p>
-      <w:pPr>
-        <w:pStyle w:val="BodyText"/>
-      </w:pPr>
-      <w:r>
-        <w:t xml:space="preserve">SECULT – SECRETARIA DE ESTADO DA CULTURA DO ESPÍRITO SANTO.</w:t>
+        <w:t xml:space="preserve">Lista de projetos habilitados</w:t>
+      </w:r>
+      <w:r>
+        <w:t xml:space="preserve"> </w:t>
+      </w:r>
+      <w:r>
+        <w:t xml:space="preserve">(seções 2022 a 2026) e</w:t>
       </w:r>
       <w:r>
         <w:t xml:space="preserve"> </w:t>
@@ -6807,10 +6892,10 @@
           <w:b/>
           <w:bCs/>
         </w:rPr>
-        <w:t xml:space="preserve">Parecer técnico cultural LICC</w:t>
-      </w:r>
-      <w:r>
-        <w:t xml:space="preserve">: modelo padrão. Vitória: SECULT, 2026e. Disponível em: https://secult.es.gov.br/LICC. Acesso em: 24 set. 2026.</w:t>
+        <w:t xml:space="preserve">Recurso financeiro captado – 2025</w:t>
+      </w:r>
+      <w:r>
+        <w:t xml:space="preserve">. Vitória: SECULT, 2026b. Disponível em: https://secult.es.gov.br/lista-de-projetos-habilitados. Acesso em: 3 set. 2026.</w:t>
       </w:r>
     </w:p>
     <w:p>
@@ -6828,13 +6913,18 @@
           <w:b/>
           <w:bCs/>
         </w:rPr>
-        <w:t xml:space="preserve">Lista de projetos habilitados</w:t>
-      </w:r>
-      <w:r>
-        <w:t xml:space="preserve"> </w:t>
-      </w:r>
-      <w:r>
-        <w:t xml:space="preserve">(seções 2022 a 2026) e</w:t>
+        <w:t xml:space="preserve">Comissão de Avaliação Permanente (CAP)</w:t>
+      </w:r>
+      <w:r>
+        <w:t xml:space="preserve">: extratos das atas das reuniões, 2023 a 2026. Vitória: SECULT, 2026f. Disponível em: https://secult.es.gov.br/cap-2026. Acesso em: 27 set. 2026.</w:t>
+      </w:r>
+    </w:p>
+    <w:p>
+      <w:pPr>
+        <w:pStyle w:val="BodyText"/>
+      </w:pPr>
+      <w:r>
+        <w:t xml:space="preserve">SECULT – SECRETARIA DE ESTADO DA CULTURA DO ESPÍRITO SANTO.</w:t>
       </w:r>
       <w:r>
         <w:t xml:space="preserve"> </w:t>
@@ -6844,18 +6934,18 @@
           <w:b/>
           <w:bCs/>
         </w:rPr>
-        <w:t xml:space="preserve">Recurso financeiro captado – 2025</w:t>
-      </w:r>
-      <w:r>
-        <w:t xml:space="preserve">. Vitória: SECULT, 2026b. Disponível em: https://secult.es.gov.br/lista-de-projetos-habilitados. Acesso em: 3 set. 2026.</w:t>
-      </w:r>
-    </w:p>
-    <w:p>
-      <w:pPr>
-        <w:pStyle w:val="BodyText"/>
-      </w:pPr>
-      <w:r>
-        <w:t xml:space="preserve">SECULT – SECRETARIA DE ESTADO DA CULTURA DO ESPÍRITO SANTO.</w:t>
+        <w:t xml:space="preserve">Ata de julgamento de recursos e resultado final da etapa de pré-seleção de projetos</w:t>
+      </w:r>
+      <w:r>
+        <w:t xml:space="preserve">: Edital nº 29/2025, produção de curta e média-metragem. Vitória: SECULT, 2026g. Disponível em: https://secult.es.gov.br/media/ata-de-julgamento-de-recursos-pre-selecao-29-2025.pdf. Acesso em: 27 set. 2026.</w:t>
+      </w:r>
+    </w:p>
+    <w:p>
+      <w:pPr>
+        <w:pStyle w:val="BodyText"/>
+      </w:pPr>
+      <w:r>
+        <w:t xml:space="preserve">SILVA, Frederico Augusto Barbosa da.</w:t>
       </w:r>
       <w:r>
         <w:t xml:space="preserve"> </w:t>
@@ -6865,18 +6955,18 @@
           <w:b/>
           <w:bCs/>
         </w:rPr>
-        <w:t xml:space="preserve">Comissão de Avaliação Permanente (CAP)</w:t>
-      </w:r>
-      <w:r>
-        <w:t xml:space="preserve">: extratos das atas das reuniões, 2023 a 2026. Vitória: SECULT, 2026f. Disponível em: https://secult.es.gov.br/cap-2026. Acesso em: 27 set. 2026.</w:t>
-      </w:r>
-    </w:p>
-    <w:p>
-      <w:pPr>
-        <w:pStyle w:val="BodyText"/>
-      </w:pPr>
-      <w:r>
-        <w:t xml:space="preserve">SECULT – SECRETARIA DE ESTADO DA CULTURA DO ESPÍRITO SANTO.</w:t>
+        <w:t xml:space="preserve">Financiamento cultural no Brasil contemporâneo</w:t>
+      </w:r>
+      <w:r>
+        <w:t xml:space="preserve">. Brasília: Ipea, 2017. (Texto para Discussão, 2280).</w:t>
+      </w:r>
+    </w:p>
+    <w:p>
+      <w:pPr>
+        <w:pStyle w:val="BodyText"/>
+      </w:pPr>
+      <w:r>
+        <w:t xml:space="preserve">TEIXEIRA, Lusvânio Carlos; XAVIER, Wescley Silva; FARIA, Evandro Rodrigues de; BRAVIM, Márcio Teixeira. Relação entre os equipamentos e políticas culturais dos municípios de Minas Gerais e a captação de recursos via Lei Estadual de Incentivo à Cultura.</w:t>
       </w:r>
       <w:r>
         <w:t xml:space="preserve"> </w:t>
@@ -6886,48 +6976,6 @@
           <w:b/>
           <w:bCs/>
         </w:rPr>
-        <w:t xml:space="preserve">Ata de julgamento de recursos e resultado final da etapa de pré-seleção de projetos</w:t>
-      </w:r>
-      <w:r>
-        <w:t xml:space="preserve">: Edital nº 29/2025, produção de curta e média-metragem. Vitória: SECULT, 2026g. Disponível em: https://secult.es.gov.br/media/ata-de-julgamento-de-recursos-pre-selecao-29-2025.pdf. Acesso em: 27 set. 2026.</w:t>
-      </w:r>
-    </w:p>
-    <w:p>
-      <w:pPr>
-        <w:pStyle w:val="BodyText"/>
-      </w:pPr>
-      <w:r>
-        <w:t xml:space="preserve">SILVA, Frederico Augusto Barbosa da.</w:t>
-      </w:r>
-      <w:r>
-        <w:t xml:space="preserve"> </w:t>
-      </w:r>
-      <w:r>
-        <w:rPr>
-          <w:b/>
-          <w:bCs/>
-        </w:rPr>
-        <w:t xml:space="preserve">Financiamento cultural no Brasil contemporâneo</w:t>
-      </w:r>
-      <w:r>
-        <w:t xml:space="preserve">. Brasília: Ipea, 2017. (Texto para Discussão, 2280).</w:t>
-      </w:r>
-    </w:p>
-    <w:p>
-      <w:pPr>
-        <w:pStyle w:val="BodyText"/>
-      </w:pPr>
-      <w:r>
-        <w:t xml:space="preserve">TEIXEIRA, Lusvânio Carlos; XAVIER, Wescley Silva; FARIA, Evandro Rodrigues de; BRAVIM, Márcio Teixeira. Relação entre os equipamentos e políticas culturais dos municípios de Minas Gerais e a captação de recursos via Lei Estadual de Incentivo à Cultura.</w:t>
-      </w:r>
-      <w:r>
-        <w:t xml:space="preserve"> </w:t>
-      </w:r>
-      <w:r>
-        <w:rPr>
-          <w:b/>
-          <w:bCs/>
-        </w:rPr>
         <w:t xml:space="preserve">Interações</w:t>
       </w:r>
       <w:r>
@@ -6936,7 +6984,7 @@
       <w:r>
         <w:t xml:space="preserve"> </w:t>
       </w:r>
-      <w:hyperlink r:id="rId52">
+      <w:hyperlink r:id="rId54">
         <w:r>
           <w:rPr>
             <w:rStyle w:val="Hyperlink"/>
@@ -6971,7 +7019,7 @@
       <w:r>
         <w:t xml:space="preserve"> </w:t>
       </w:r>
-      <w:hyperlink r:id="rId53">
+      <w:hyperlink r:id="rId55">
         <w:r>
           <w:rPr>
             <w:rStyle w:val="Hyperlink"/>
@@ -7027,7 +7075,7 @@
       <w:r>
         <w:t xml:space="preserve"> </w:t>
       </w:r>
-      <w:hyperlink r:id="rId54">
+      <w:hyperlink r:id="rId56">
         <w:r>
           <w:rPr>
             <w:rStyle w:val="Hyperlink"/>
@@ -7062,7 +7110,7 @@
       <w:r>
         <w:t xml:space="preserve"> </w:t>
       </w:r>
-      <w:hyperlink r:id="rId55">
+      <w:hyperlink r:id="rId57">
         <w:r>
           <w:rPr>
             <w:rStyle w:val="Hyperlink"/>
@@ -7074,7 +7122,7 @@
         <w:t xml:space="preserve">.</w:t>
       </w:r>
     </w:p>
-    <w:bookmarkEnd w:id="56"/>
+    <w:bookmarkEnd w:id="58"/>
     <w:sectPr>
       <w:footnotePr>
         <w:numRestart w:val="eachSect"/>

</xml_diff>

<commit_message>
Teto de 2022 determinado: Portaria SEFAZ nº 83-R/2022 ampliou o montante para R$ 15 milhões
- a busca dirigida do relé no Diário Oficial achou a Portaria 83-R, de 26/09/2022 (+R$ 5 milhões
  sobre os R$ 10 milhões da 09-R); a nota de rodapé deixa de dizer "indeterminado", o Quadro 1
  passa a R$ 15 mi em 2022 e a soma dos tetos a R$ 111 milhões (sem "no máximo")
- transcrição em notas/politica/fontes/portarias-sefaz-secult-2022.md; checagens D65, D65b, D65c
  e D06b (70/70); PDF com 15 páginas; roteiro frase a frase regenerado

Co-Authored-By: Claude Opus 5.5 <noreply@anthropic.com>
Claude-Session: https://claude.ai/code/session_01XEaG1GvUXhdfnXot6AtJxa
</commit_message>
<xml_diff>
--- a/artigo/rascunho-artigo.docx
+++ b/artigo/rascunho-artigo.docx
@@ -100,7 +100,7 @@
         <w:t xml:space="preserve"> </w:t>
       </w:r>
       <w:r>
-        <w:t xml:space="preserve">completa os R$ 25 milhões; os números de 2025 contam os 63). A demanda supera o teto: nos cinco ciclos de habilitação (2022-2026), 463 projetos foram autorizados a captar, somados, R$ 184 milhões (459 com valor válido), acima da soma dos tetos do período, de no máximo R$ 111 milhões.</w:t>
+        <w:t xml:space="preserve">completa os R$ 25 milhões; os números de 2025 contam os 63). A demanda supera o teto: nos cinco ciclos de habilitação (2022-2026), 463 projetos foram autorizados a captar, somados, R$ 184 milhões (459 com valor válido), acima da soma dos tetos do período, de R$ 111 milhões.</w:t>
       </w:r>
       <w:r>
         <w:rPr>
@@ -374,7 +374,7 @@
               <w:rPr>
                 <w:sz w:val="20"/>
               </w:rPr>
-              <w:t xml:space="preserve">Fixado pela SEFAZ até 31/01, ampliável no exercício, limitado a 2% do ICMS estadual do ano anterior: R$ 10 mi em 2022, 15 mi (2023), 25 mi (2024 e 2025), 31 mi (2026)</w:t>
+              <w:t xml:space="preserve">Fixado pela SEFAZ até 31/01, ampliável no exercício, limitado a 2% do ICMS estadual do ano anterior: R$ 15 mi em 2022 (10 mi ampliados em setembro) e 2023, 25 mi em 2024 e 2025, 31 mi em 2026</w:t>
             </w:r>
           </w:p>
         </w:tc>
@@ -6072,7 +6072,7 @@
         <w:t xml:space="preserve">Diário Oficial dos Poderes do Estado</w:t>
       </w:r>
       <w:r>
-        <w:t xml:space="preserve">: avisos de habilitação e de depósito da LICC, 2022-2026. Vitória: DIO-ES, 2026. Disponível em: https://ioes.dio.es.gov.br. Acesso em: 27 set. 2026.</w:t>
+        <w:t xml:space="preserve">: atos e avisos da LICC, 2022-2026. Vitória: DIO-ES, 2026. Disponível em: https://ioes.dio.es.gov.br. Acesso em: 27 set. 2026.</w:t>
       </w:r>
     </w:p>
     <w:p>
@@ -7168,7 +7168,7 @@
         <w:t xml:space="preserve"> </w:t>
       </w:r>
       <w:r>
-        <w:t xml:space="preserve">Para 2022, a Portaria SEFAZ nº 09-R fixou R$ 10 milhões, e o anexo de captação da SECULT informa R$ 15 milhões disponíveis (R$ 11,5 milhões validados), valor que a lista do Portal da Transparência atribui à mesma portaria (ESPÍRITO SANTO, 2026). Sem ato de ampliação localizado, o teto de 2022 fica indeterminado.</w:t>
+        <w:t xml:space="preserve">Para 2022, a Portaria SEFAZ nº 09-R fixou R$ 10 milhões, e a Portaria SEFAZ nº 83-R, de 26 de setembro, ampliou o montante em R$ 5 milhões (DIO-ES, 2026): o teto de 2022 foi de R$ 15 milhões, valor que o anexo de captação da SECULT e a lista do Portal da Transparência informam (ESPÍRITO SANTO, 2026), dos quais R$ 11,5 milhões foram validados.</w:t>
       </w:r>
     </w:p>
   </w:footnote>

</xml_diff>

<commit_message>
Revisão metodológica do desenho refeito (ARS methodology-focus), aplicada
- H5: validação tardia de 2024 (27 das 47 recusas viraram validação em versão posterior; 20 não)
  como variação para o efeito de receber mais tarde; desenho prospectivo leva de 6 a 16 ciclos no
  ritmo de 11 a 21 recusados por ano; momento do esgotamento desconhecido de antemão
- H2 rotulada como teste descritivo da regra de decisão; H1 compara médias marginais e aplica os
  pesos de empresas e residentes aos habilitados
- API do Mapa: o resumo das oportunidades da LICC não traz contagem de inscritos (summary: null;
  avaliação documental); 432 eventos ligados a 161 projetos, 18 da LICC com data
- checagens N81-N83 (79/79); 15 páginas; roteiro frase a frase, Word e zip regenerados
- parecer em artigo/auditoria/revisao-stage3-r4/10-revisao-metodologica-desenho.md

Co-Authored-By: Claude Opus 5.5 <noreply@anthropic.com>
Claude-Session: https://claude.ai/code/session_01XEaG1GvUXhdfnXot6AtJxa
</commit_message>
<xml_diff>
--- a/artigo/rascunho-artigo.docx
+++ b/artigo/rascunho-artigo.docx
@@ -41,7 +41,7 @@
         <w:t xml:space="preserve"> </w:t>
       </w:r>
       <w:r>
-        <w:t xml:space="preserve">A Lei de Incentivo à Cultura Capixaba (LICC) permite que empresas contribuintes do ICMS destinem a projetos culturais habilitados pela Secretaria da Cultura (SECULT) valores que recuperam integralmente como crédito presumido do imposto: o Estado paga, a empresa escolhe, e o público a quem o bem cultural se destina não entra na escolha. Neste artigo, avalia-se o desenho da LICC: da teoria da mudança derivam-se cinco premissas, confrontadas com normas, anexos oficiais e atas da comissão de 2022 a 2026, que orientam uma proposta de avaliação de impacto. A decisão de financiamento não mostra orientação evidente pelo valor público: duas empresas respondem por metade da renúncia de 2025, e o bem cultural oferecido à população confunde-se com o marketing das empresas. A decisão se concentra em poucos atores: a habilitação qualifica sem priorizar, e o que excede o teto é racionado pela ordem de recebimento e validação dos termos de patrocínio. Até 13% do valor captado em 2025 poderia remunerar captação e elaboração, projetos pequenos captam cada vez menos, e só pessoas jurídicas contribuintes patrocinam. Propõem-se quatro perguntas de avaliação, com estratégias, dados e poder estatístico, entre elas um experimento conjunto com decisores de empresas.</w:t>
+        <w:t xml:space="preserve">A Lei de Incentivo à Cultura Capixaba (LICC) permite que empresas contribuintes do ICMS destinem a projetos culturais habilitados pela Secretaria da Cultura (SECULT) valores que recuperam integralmente como crédito presumido do imposto: o Estado paga, a empresa escolhe, e o público a quem o bem cultural se destina não entra na escolha. Neste artigo, avalia-se o desenho da LICC: da teoria da mudança derivam-se cinco premissas, confrontadas com normas, anexos oficiais e atas da comissão de 2022 a 2026, que orientam uma proposta de avaliação de impacto. A decisão de financiamento não mostra orientação evidente pelo valor público: duas empresas respondem por metade da renúncia de 2025, e o bem cultural oferecido à população confunde-se com o marketing das empresas. A decisão se concentra em poucos atores: a habilitação qualifica sem priorizar, e o que excede o teto é racionado pela ordem de recebimento e validação dos termos de patrocínio. Até 13% do valor captado em 2025 poderia remunerar captação e elaboração, projetos pequenos captam cada vez menos, e só pessoas jurídicas contribuintes patrocinam. Para cada premissa, propõe-se um teste com regra de decisão, dados e poder estatístico, entre eles um experimento conjunto com decisores de empresas e residentes e uma avaliação cega dos projetos.</w:t>
       </w:r>
     </w:p>
     <w:p>
@@ -2549,7 +2549,7 @@
         <w:pStyle w:val="BodyText"/>
       </w:pPr>
       <w:r>
-        <w:t xml:space="preserve">Em síntese, o desenho entrega a escolha a quem recolhe mais imposto e raciona pela ordem de chegada: nenhum elo agrega a preferência de quem usa o bem cultural. O critério público na decisão (H2) não é assegurado pelo desenho, o que não implica que as escolhas sejam ruins; marketing (H1) e exclusão (H4) não se sustentam, com evidência mista; taxa de serviço (H3) e entrega (H5) ficam indeterminadas por falta de dado. A seção 5 trata de H1, H2, H4 e H5 e deixa H3 em aberto.</w:t>
+        <w:t xml:space="preserve">Em síntese, o desenho entrega a escolha a quem recolhe mais imposto e raciona pela ordem de chegada: nenhum elo agrega a preferência de quem usa o bem cultural. O critério público na decisão (H2) não é assegurado pelo desenho, o que não implica que as escolhas sejam ruins; marketing (H1) e exclusão (H4) não se sustentam, com evidência mista; taxa de serviço (H3) e entrega (H5) ficam indeterminadas por falta de dado. A seção 5 propõe um teste para cada premissa.</w:t>
       </w:r>
     </w:p>
     <w:bookmarkEnd w:id="23"/>
@@ -2577,7 +2577,7 @@
         <w:pStyle w:val="FirstParagraph"/>
       </w:pPr>
       <w:r>
-        <w:t xml:space="preserve">As premissas do Quadro 2 convertem-se em perguntas de pesquisa: quatro perguntas de avaliação (Quadro 3), na notação de resultados potenciais. Seja</w:t>
+        <w:t xml:space="preserve">Cada premissa do Quadro 2 vira uma pergunta de avaliação com uma regra de decisão, o resultado que a derruba (Quadro 3). O fio comum é saber se a escolha concentrada deixa de fora bens que muitos valorizariam e projetos pequenos que sinalizariam necessidades reais de financiamento: H1 compara os pesos das empresas com os da população, H2 compara a decisão com uma nota pública, e H4 mostra quem aparece quando o custo de entrada cai. Seja</w:t>
       </w:r>
       <w:r>
         <w:t xml:space="preserve"> </w:t>
@@ -2635,7 +2635,7 @@
         <w:t xml:space="preserve">Y</w:t>
       </w:r>
       <w:r>
-        <w:t xml:space="preserve">(0) os resultados com e sem ele. O Quadro 3 mostra também por que a comparação simples entre grupos não responde a nenhuma delas. A diferença simples de médias soma ao efeito médio o viés de seleção,</w:t>
+        <w:t xml:space="preserve">(0) os resultados com e sem ele. Em todas as perguntas há autosseleção (o proponente se inscreve, a empresa escolhe), e a diferença simples de médias soma ao efeito médio o viés de seleção,</w:t>
       </w:r>
       <w:r>
         <w:t xml:space="preserve"> </w:t>
@@ -2751,7 +2751,20 @@
         </m:r>
       </m:oMath>
       <w:r>
-        <w:t xml:space="preserve">, e o de efeitos heterogêneos.</w:t>
+        <w:t xml:space="preserve">, e o de efeitos heterogêneos. As perguntas testam elos da cadeia, como uma avaliação de mecanismo (GERTLER</w:t>
+      </w:r>
+      <w:r>
+        <w:t xml:space="preserve"> </w:t>
+      </w:r>
+      <w:r>
+        <w:rPr>
+          <w:i/>
+          <w:iCs/>
+        </w:rPr>
+        <w:t xml:space="preserve">et al.</w:t>
+      </w:r>
+      <w:r>
+        <w:t xml:space="preserve">, 2018), e não o efeito da LICC sobre o resultado final, que não tem grupo de comparação: a política vale para todo o estado desde 2022.</w:t>
       </w:r>
     </w:p>
     <w:p>
@@ -2769,7 +2782,7 @@
         <w:rPr>
           <w:b w:val="0"/>
         </w:rPr>
-        <w:t xml:space="preserve"> – Perguntas de avaliação</w:t>
+        <w:t xml:space="preserve"> – Perguntas de avaliação e regras de decisão</w:t>
       </w:r>
     </w:p>
     <w:tbl>
@@ -2896,7 +2909,7 @@
               <w:rPr>
                 <w:sz w:val="20"/>
               </w:rPr>
-              <w:t xml:space="preserve">Viés da comparação simples</w:t>
+              <w:t xml:space="preserve">A premissa cai se</w:t>
             </w:r>
           </w:p>
         </w:tc>
@@ -2914,39 +2927,39 @@
               <w:rPr>
                 <w:sz w:val="20"/>
               </w:rPr>
-              <w:t xml:space="preserve">H5</w:t>
-            </w:r>
-          </w:p>
-        </w:tc>
-        <w:tc>
-          <w:tcPr/>
-          <w:p>
-            <w:pPr>
-              <w:pStyle w:val="Compact"/>
-              <w:spacing w:after="0" w:before="0"/>
-              <w:jc w:val="left"/>
-            </w:pPr>
-            <w:r>
-              <w:rPr>
-                <w:sz w:val="20"/>
-              </w:rPr>
-              <w:t xml:space="preserve">Receber pela LICC muda a realização e o alcance do projeto?</w:t>
-            </w:r>
-          </w:p>
-        </w:tc>
-        <w:tc>
-          <w:tcPr/>
-          <w:p>
-            <w:pPr>
-              <w:pStyle w:val="Compact"/>
-              <w:spacing w:after="0" w:before="0"/>
-              <w:jc w:val="left"/>
-            </w:pPr>
-            <w:r>
-              <w:rPr>
-                <w:sz w:val="20"/>
-              </w:rPr>
-              <w:t xml:space="preserve">Projeto na margem do teto;</w:t>
+              <w:t xml:space="preserve">H1</w:t>
+            </w:r>
+          </w:p>
+        </w:tc>
+        <w:tc>
+          <w:tcPr/>
+          <w:p>
+            <w:pPr>
+              <w:pStyle w:val="Compact"/>
+              <w:spacing w:after="0" w:before="0"/>
+              <w:jc w:val="left"/>
+            </w:pPr>
+            <w:r>
+              <w:rPr>
+                <w:sz w:val="20"/>
+              </w:rPr>
+              <w:t xml:space="preserve">O que pesa na escolha da empresa, e pesaria o mesmo para a população?</w:t>
+            </w:r>
+          </w:p>
+        </w:tc>
+        <w:tc>
+          <w:tcPr/>
+          <w:p>
+            <w:pPr>
+              <w:pStyle w:val="Compact"/>
+              <w:spacing w:after="0" w:before="0"/>
+              <w:jc w:val="left"/>
+            </w:pPr>
+            <w:r>
+              <w:rPr>
+                <w:sz w:val="20"/>
+              </w:rPr>
+              <w:t xml:space="preserve">Decisor de empresa e residente;</w:t>
             </w:r>
             <w:r>
               <w:rPr>
@@ -2972,7 +2985,7 @@
               <w:rPr>
                 <w:sz w:val="20"/>
               </w:rPr>
-              <w:t xml:space="preserve">= termo validado;</w:t>
+              <w:t xml:space="preserve">= atributos sorteados de perfis de projeto;</w:t>
             </w:r>
             <w:r>
               <w:rPr>
@@ -2998,34 +3011,96 @@
               <w:rPr>
                 <w:sz w:val="20"/>
               </w:rPr>
-              <w:t xml:space="preserve">= acontece em janela fixa após o protocolo (agenda, Diário Oficial); público</w:t>
-            </w:r>
-          </w:p>
-        </w:tc>
-        <w:tc>
-          <w:tcPr/>
-          <w:p>
-            <w:pPr>
-              <w:pStyle w:val="Compact"/>
-              <w:spacing w:after="0" w:before="0"/>
-              <w:jc w:val="left"/>
-            </w:pPr>
-            <w:r>
-              <w:rPr>
-                <w:sz w:val="20"/>
-              </w:rPr>
-              <w:t xml:space="preserve">Efeito de receber agora, na margem; fora dela, efeito médio sobre os tratados (EMPT)</w:t>
-            </w:r>
-          </w:p>
-        </w:tc>
-        <w:tc>
-          <w:tcPr/>
-          <w:p>
-            <w:pPr>
-              <w:pStyle w:val="Compact"/>
-              <w:spacing w:after="0" w:before="0"/>
-              <w:jc w:val="left"/>
-            </w:pPr>
+              <w:t xml:space="preserve">= escolhe o perfil</w:t>
+            </w:r>
+          </w:p>
+        </w:tc>
+        <w:tc>
+          <w:tcPr/>
+          <w:p>
+            <w:pPr>
+              <w:pStyle w:val="Compact"/>
+              <w:spacing w:after="0" w:before="0"/>
+              <w:jc w:val="left"/>
+            </w:pPr>
+            <w:r>
+              <w:rPr>
+                <w:sz w:val="20"/>
+              </w:rPr>
+              <w:t xml:space="preserve">Efeito marginal médio de cada atributo, por grupo, e a diferença</w:t>
+            </w:r>
+          </w:p>
+        </w:tc>
+        <w:tc>
+          <w:tcPr/>
+          <w:p>
+            <w:pPr>
+              <w:pStyle w:val="Compact"/>
+              <w:spacing w:after="0" w:before="0"/>
+              <w:jc w:val="left"/>
+            </w:pPr>
+            <w:r>
+              <w:rPr>
+                <w:sz w:val="20"/>
+              </w:rPr>
+              <w:t xml:space="preserve">O peso da gratuidade, do interior ou da escala difere entre empresas e população</w:t>
+            </w:r>
+          </w:p>
+        </w:tc>
+      </w:tr>
+      <w:tr>
+        <w:tc>
+          <w:tcPr/>
+          <w:p>
+            <w:pPr>
+              <w:pStyle w:val="Compact"/>
+              <w:spacing w:after="0" w:before="0"/>
+              <w:jc w:val="left"/>
+            </w:pPr>
+            <w:r>
+              <w:rPr>
+                <w:sz w:val="20"/>
+              </w:rPr>
+              <w:t xml:space="preserve">H2</w:t>
+            </w:r>
+          </w:p>
+        </w:tc>
+        <w:tc>
+          <w:tcPr/>
+          <w:p>
+            <w:pPr>
+              <w:pStyle w:val="Compact"/>
+              <w:spacing w:after="0" w:before="0"/>
+              <w:jc w:val="left"/>
+            </w:pPr>
+            <w:r>
+              <w:rPr>
+                <w:sz w:val="20"/>
+              </w:rPr>
+              <w:t xml:space="preserve">A habilitação e a captação seguem critério público?</w:t>
+            </w:r>
+          </w:p>
+        </w:tc>
+        <w:tc>
+          <w:tcPr/>
+          <w:p>
+            <w:pPr>
+              <w:pStyle w:val="Compact"/>
+              <w:spacing w:after="0" w:before="0"/>
+              <w:jc w:val="left"/>
+            </w:pPr>
+            <w:r>
+              <w:rPr>
+                <w:sz w:val="20"/>
+              </w:rPr>
+              <w:t xml:space="preserve">Projeto inscrito; nota cega nos critérios do decreto;</w:t>
+            </w:r>
+            <w:r>
+              <w:rPr>
+                <w:sz w:val="20"/>
+              </w:rPr>
+              <w:t xml:space="preserve"> </w:t>
+            </w:r>
             <w:r>
               <w:rPr>
                 <w:i/>
@@ -3038,7 +3113,45 @@
               <w:rPr>
                 <w:sz w:val="20"/>
               </w:rPr>
-              <w:t xml:space="preserve">(0) maior entre os escolhidos pela empresa: viés de seleção positivo</w:t>
+              <w:t xml:space="preserve"> </w:t>
+            </w:r>
+            <w:r>
+              <w:rPr>
+                <w:sz w:val="20"/>
+              </w:rPr>
+              <w:t xml:space="preserve">= habilitado, captou</w:t>
+            </w:r>
+          </w:p>
+        </w:tc>
+        <w:tc>
+          <w:tcPr/>
+          <w:p>
+            <w:pPr>
+              <w:pStyle w:val="Compact"/>
+              <w:spacing w:after="0" w:before="0"/>
+              <w:jc w:val="left"/>
+            </w:pPr>
+            <w:r>
+              <w:rPr>
+                <w:sz w:val="20"/>
+              </w:rPr>
+              <w:t xml:space="preserve">Diferença de nota entre habilitados e inabilitados e entre quem capta e quem não capta</w:t>
+            </w:r>
+          </w:p>
+        </w:tc>
+        <w:tc>
+          <w:tcPr/>
+          <w:p>
+            <w:pPr>
+              <w:pStyle w:val="Compact"/>
+              <w:spacing w:after="0" w:before="0"/>
+              <w:jc w:val="left"/>
+            </w:pPr>
+            <w:r>
+              <w:rPr>
+                <w:sz w:val="20"/>
+              </w:rPr>
+              <w:t xml:space="preserve">A nota não separa os grupos, ou o par patrocinador–proponente recorrente explica mais que ela</w:t>
             </w:r>
           </w:p>
         </w:tc>
@@ -3056,39 +3169,39 @@
               <w:rPr>
                 <w:sz w:val="20"/>
               </w:rPr>
-              <w:t xml:space="preserve">H1</w:t>
-            </w:r>
-          </w:p>
-        </w:tc>
-        <w:tc>
-          <w:tcPr/>
-          <w:p>
-            <w:pPr>
-              <w:pStyle w:val="Compact"/>
-              <w:spacing w:after="0" w:before="0"/>
-              <w:jc w:val="left"/>
-            </w:pPr>
-            <w:r>
-              <w:rPr>
-                <w:sz w:val="20"/>
-              </w:rPr>
-              <w:t xml:space="preserve">O que pesa na escolha da empresa: marca ou valor público?</w:t>
-            </w:r>
-          </w:p>
-        </w:tc>
-        <w:tc>
-          <w:tcPr/>
-          <w:p>
-            <w:pPr>
-              <w:pStyle w:val="Compact"/>
-              <w:spacing w:after="0" w:before="0"/>
-              <w:jc w:val="left"/>
-            </w:pPr>
-            <w:r>
-              <w:rPr>
-                <w:sz w:val="20"/>
-              </w:rPr>
-              <w:t xml:space="preserve">Decisor de empresa;</w:t>
+              <w:t xml:space="preserve">H3</w:t>
+            </w:r>
+          </w:p>
+        </w:tc>
+        <w:tc>
+          <w:tcPr/>
+          <w:p>
+            <w:pPr>
+              <w:pStyle w:val="Compact"/>
+              <w:spacing w:after="0" w:before="0"/>
+              <w:jc w:val="left"/>
+            </w:pPr>
+            <w:r>
+              <w:rPr>
+                <w:sz w:val="20"/>
+              </w:rPr>
+              <w:t xml:space="preserve">O recurso chega ao bem cultural, e não à intermediação?</w:t>
+            </w:r>
+          </w:p>
+        </w:tc>
+        <w:tc>
+          <w:tcPr/>
+          <w:p>
+            <w:pPr>
+              <w:pStyle w:val="Compact"/>
+              <w:spacing w:after="0" w:before="0"/>
+              <w:jc w:val="left"/>
+            </w:pPr>
+            <w:r>
+              <w:rPr>
+                <w:sz w:val="20"/>
+              </w:rPr>
+              <w:t xml:space="preserve">Projeto com planilha de custos;</w:t>
             </w:r>
             <w:r>
               <w:rPr>
@@ -3102,7 +3215,7 @@
                 <w:iCs/>
                 <w:sz w:val="20"/>
               </w:rPr>
-              <w:t xml:space="preserve">T</w:t>
+              <w:t xml:space="preserve">Y</w:t>
             </w:r>
             <w:r>
               <w:rPr>
@@ -3114,7 +3227,89 @@
               <w:rPr>
                 <w:sz w:val="20"/>
               </w:rPr>
-              <w:t xml:space="preserve">= atributos sorteados de perfis de projeto;</w:t>
+              <w:t xml:space="preserve">= parcela de captação e elaboração</w:t>
+            </w:r>
+          </w:p>
+        </w:tc>
+        <w:tc>
+          <w:tcPr/>
+          <w:p>
+            <w:pPr>
+              <w:pStyle w:val="Compact"/>
+              <w:spacing w:after="0" w:before="0"/>
+              <w:jc w:val="left"/>
+            </w:pPr>
+            <w:r>
+              <w:rPr>
+                <w:sz w:val="20"/>
+              </w:rPr>
+              <w:t xml:space="preserve">Acúmulo no teto de 10%, antes e depois da regra de 2026</w:t>
+            </w:r>
+          </w:p>
+        </w:tc>
+        <w:tc>
+          <w:tcPr/>
+          <w:p>
+            <w:pPr>
+              <w:pStyle w:val="Compact"/>
+              <w:spacing w:after="0" w:before="0"/>
+              <w:jc w:val="left"/>
+            </w:pPr>
+            <w:r>
+              <w:rPr>
+                <w:sz w:val="20"/>
+              </w:rPr>
+              <w:t xml:space="preserve">As taxas se acumulam no teto e sobem quando podem ir ao proponente</w:t>
+            </w:r>
+          </w:p>
+        </w:tc>
+      </w:tr>
+      <w:tr>
+        <w:tc>
+          <w:tcPr/>
+          <w:p>
+            <w:pPr>
+              <w:pStyle w:val="Compact"/>
+              <w:spacing w:after="0" w:before="0"/>
+              <w:jc w:val="left"/>
+            </w:pPr>
+            <w:r>
+              <w:rPr>
+                <w:sz w:val="20"/>
+              </w:rPr>
+              <w:t xml:space="preserve">H4</w:t>
+            </w:r>
+          </w:p>
+        </w:tc>
+        <w:tc>
+          <w:tcPr/>
+          <w:p>
+            <w:pPr>
+              <w:pStyle w:val="Compact"/>
+              <w:spacing w:after="0" w:before="0"/>
+              <w:jc w:val="left"/>
+            </w:pPr>
+            <w:r>
+              <w:rPr>
+                <w:sz w:val="20"/>
+              </w:rPr>
+              <w:t xml:space="preserve">Reduzir o custo de entrada muda quem entra?</w:t>
+            </w:r>
+          </w:p>
+        </w:tc>
+        <w:tc>
+          <w:tcPr/>
+          <w:p>
+            <w:pPr>
+              <w:pStyle w:val="Compact"/>
+              <w:spacing w:after="0" w:before="0"/>
+              <w:jc w:val="left"/>
+            </w:pPr>
+            <w:r>
+              <w:rPr>
+                <w:sz w:val="20"/>
+              </w:rPr>
+              <w:t xml:space="preserve">Agente sem inscrição prévia;</w:t>
             </w:r>
             <w:r>
               <w:rPr>
@@ -3128,6 +3323,32 @@
                 <w:iCs/>
                 <w:sz w:val="20"/>
               </w:rPr>
+              <w:t xml:space="preserve">T</w:t>
+            </w:r>
+            <w:r>
+              <w:rPr>
+                <w:sz w:val="20"/>
+              </w:rPr>
+              <w:t xml:space="preserve"> </w:t>
+            </w:r>
+            <w:r>
+              <w:rPr>
+                <w:sz w:val="20"/>
+              </w:rPr>
+              <w:t xml:space="preserve">= oferta de apoio à inscrição e à busca de patrocínio;</w:t>
+            </w:r>
+            <w:r>
+              <w:rPr>
+                <w:sz w:val="20"/>
+              </w:rPr>
+              <w:t xml:space="preserve"> </w:t>
+            </w:r>
+            <w:r>
+              <w:rPr>
+                <w:i/>
+                <w:iCs/>
+                <w:sz w:val="20"/>
+              </w:rPr>
               <w:t xml:space="preserve">Y</w:t>
             </w:r>
             <w:r>
@@ -3140,39 +3361,39 @@
               <w:rPr>
                 <w:sz w:val="20"/>
               </w:rPr>
-              <w:t xml:space="preserve">= escolhe o perfil</w:t>
-            </w:r>
-          </w:p>
-        </w:tc>
-        <w:tc>
-          <w:tcPr/>
-          <w:p>
-            <w:pPr>
-              <w:pStyle w:val="Compact"/>
-              <w:spacing w:after="0" w:before="0"/>
-              <w:jc w:val="left"/>
-            </w:pPr>
-            <w:r>
-              <w:rPr>
-                <w:sz w:val="20"/>
-              </w:rPr>
-              <w:t xml:space="preserve">Efeito marginal médio de cada atributo</w:t>
-            </w:r>
-          </w:p>
-        </w:tc>
-        <w:tc>
-          <w:tcPr/>
-          <w:p>
-            <w:pPr>
-              <w:pStyle w:val="Compact"/>
-              <w:spacing w:after="0" w:before="0"/>
-              <w:jc w:val="left"/>
-            </w:pPr>
-            <w:r>
-              <w:rPr>
-                <w:sz w:val="20"/>
-              </w:rPr>
-              <w:t xml:space="preserve">Visibilidade e valor público andam juntos: confundimento</w:t>
+              <w:t xml:space="preserve">= inscreveu-se, foi habilitado, captou</w:t>
+            </w:r>
+          </w:p>
+        </w:tc>
+        <w:tc>
+          <w:tcPr/>
+          <w:p>
+            <w:pPr>
+              <w:pStyle w:val="Compact"/>
+              <w:spacing w:after="0" w:before="0"/>
+              <w:jc w:val="left"/>
+            </w:pPr>
+            <w:r>
+              <w:rPr>
+                <w:sz w:val="20"/>
+              </w:rPr>
+              <w:t xml:space="preserve">Efeito da oferta (intenção de tratar) e efeito local</w:t>
+            </w:r>
+          </w:p>
+        </w:tc>
+        <w:tc>
+          <w:tcPr/>
+          <w:p>
+            <w:pPr>
+              <w:pStyle w:val="Compact"/>
+              <w:spacing w:after="0" w:before="0"/>
+              <w:jc w:val="left"/>
+            </w:pPr>
+            <w:r>
+              <w:rPr>
+                <w:sz w:val="20"/>
+              </w:rPr>
+              <w:t xml:space="preserve">A oferta aumenta a entrada no interior</w:t>
             </w:r>
           </w:p>
         </w:tc>
@@ -3190,39 +3411,39 @@
               <w:rPr>
                 <w:sz w:val="20"/>
               </w:rPr>
-              <w:t xml:space="preserve">H4</w:t>
-            </w:r>
-          </w:p>
-        </w:tc>
-        <w:tc>
-          <w:tcPr/>
-          <w:p>
-            <w:pPr>
-              <w:pStyle w:val="Compact"/>
-              <w:spacing w:after="0" w:before="0"/>
-              <w:jc w:val="left"/>
-            </w:pPr>
-            <w:r>
-              <w:rPr>
-                <w:sz w:val="20"/>
-              </w:rPr>
-              <w:t xml:space="preserve">Reduzir o custo de entrada muda quem entra?</w:t>
-            </w:r>
-          </w:p>
-        </w:tc>
-        <w:tc>
-          <w:tcPr/>
-          <w:p>
-            <w:pPr>
-              <w:pStyle w:val="Compact"/>
-              <w:spacing w:after="0" w:before="0"/>
-              <w:jc w:val="left"/>
-            </w:pPr>
-            <w:r>
-              <w:rPr>
-                <w:sz w:val="20"/>
-              </w:rPr>
-              <w:t xml:space="preserve">Agente sem inscrição prévia;</w:t>
+              <w:t xml:space="preserve">H5</w:t>
+            </w:r>
+          </w:p>
+        </w:tc>
+        <w:tc>
+          <w:tcPr/>
+          <w:p>
+            <w:pPr>
+              <w:pStyle w:val="Compact"/>
+              <w:spacing w:after="0" w:before="0"/>
+              <w:jc w:val="left"/>
+            </w:pPr>
+            <w:r>
+              <w:rPr>
+                <w:sz w:val="20"/>
+              </w:rPr>
+              <w:t xml:space="preserve">Receber pela LICC muda a realização e o alcance do projeto?</w:t>
+            </w:r>
+          </w:p>
+        </w:tc>
+        <w:tc>
+          <w:tcPr/>
+          <w:p>
+            <w:pPr>
+              <w:pStyle w:val="Compact"/>
+              <w:spacing w:after="0" w:before="0"/>
+              <w:jc w:val="left"/>
+            </w:pPr>
+            <w:r>
+              <w:rPr>
+                <w:sz w:val="20"/>
+              </w:rPr>
+              <w:t xml:space="preserve">Termo na margem do esgotamento da cota;</w:t>
             </w:r>
             <w:r>
               <w:rPr>
@@ -3248,7 +3469,7 @@
               <w:rPr>
                 <w:sz w:val="20"/>
               </w:rPr>
-              <w:t xml:space="preserve">= oferta de apoio à inscrição e à busca de patrocínio;</w:t>
+              <w:t xml:space="preserve">= termo validado;</w:t>
             </w:r>
             <w:r>
               <w:rPr>
@@ -3274,173 +3495,39 @@
               <w:rPr>
                 <w:sz w:val="20"/>
               </w:rPr>
-              <w:t xml:space="preserve">= inscreveu-se, foi habilitado, captou</w:t>
-            </w:r>
-          </w:p>
-        </w:tc>
-        <w:tc>
-          <w:tcPr/>
-          <w:p>
-            <w:pPr>
-              <w:pStyle w:val="Compact"/>
-              <w:spacing w:after="0" w:before="0"/>
-              <w:jc w:val="left"/>
-            </w:pPr>
-            <w:r>
-              <w:rPr>
-                <w:sz w:val="20"/>
-              </w:rPr>
-              <w:t xml:space="preserve">Efeito da oferta (intenção de tratar) e efeito local para quem responde a ela</w:t>
-            </w:r>
-          </w:p>
-        </w:tc>
-        <w:tc>
-          <w:tcPr/>
-          <w:p>
-            <w:pPr>
-              <w:pStyle w:val="Compact"/>
-              <w:spacing w:after="0" w:before="0"/>
-              <w:jc w:val="left"/>
-            </w:pPr>
-            <w:r>
-              <w:rPr>
-                <w:sz w:val="20"/>
-              </w:rPr>
-              <w:t xml:space="preserve">Quem se inscreve por conta própria tem mais capacidade: viés de seleção</w:t>
-            </w:r>
-          </w:p>
-        </w:tc>
-      </w:tr>
-      <w:tr>
-        <w:tc>
-          <w:tcPr/>
-          <w:p>
-            <w:pPr>
-              <w:pStyle w:val="Compact"/>
-              <w:spacing w:after="0" w:before="0"/>
-              <w:jc w:val="left"/>
-            </w:pPr>
-            <w:r>
-              <w:rPr>
-                <w:sz w:val="20"/>
-              </w:rPr>
-              <w:t xml:space="preserve">H2</w:t>
-            </w:r>
-          </w:p>
-        </w:tc>
-        <w:tc>
-          <w:tcPr/>
-          <w:p>
-            <w:pPr>
-              <w:pStyle w:val="Compact"/>
-              <w:spacing w:after="0" w:before="0"/>
-              <w:jc w:val="left"/>
-            </w:pPr>
-            <w:r>
-              <w:rPr>
-                <w:sz w:val="20"/>
-              </w:rPr>
-              <w:t xml:space="preserve">O parecer favorável muda o destino do projeto?</w:t>
-            </w:r>
-          </w:p>
-        </w:tc>
-        <w:tc>
-          <w:tcPr/>
-          <w:p>
-            <w:pPr>
-              <w:pStyle w:val="Compact"/>
-              <w:spacing w:after="0" w:before="0"/>
-              <w:jc w:val="left"/>
-            </w:pPr>
-            <w:r>
-              <w:rPr>
-                <w:sz w:val="20"/>
-              </w:rPr>
-              <w:t xml:space="preserve">Projeto inscrito;</w:t>
-            </w:r>
-            <w:r>
-              <w:rPr>
-                <w:sz w:val="20"/>
-              </w:rPr>
-              <w:t xml:space="preserve"> </w:t>
-            </w:r>
-            <w:r>
-              <w:rPr>
-                <w:i/>
-                <w:iCs/>
-                <w:sz w:val="20"/>
-              </w:rPr>
-              <w:t xml:space="preserve">T</w:t>
-            </w:r>
-            <w:r>
-              <w:rPr>
-                <w:sz w:val="20"/>
-              </w:rPr>
-              <w:t xml:space="preserve"> </w:t>
-            </w:r>
-            <w:r>
-              <w:rPr>
-                <w:sz w:val="20"/>
-              </w:rPr>
-              <w:t xml:space="preserve">= parecer favorável;</w:t>
-            </w:r>
-            <w:r>
-              <w:rPr>
-                <w:sz w:val="20"/>
-              </w:rPr>
-              <w:t xml:space="preserve"> </w:t>
-            </w:r>
-            <w:r>
-              <w:rPr>
-                <w:i/>
-                <w:iCs/>
-                <w:sz w:val="20"/>
-              </w:rPr>
-              <w:t xml:space="preserve">Y</w:t>
-            </w:r>
-            <w:r>
-              <w:rPr>
-                <w:sz w:val="20"/>
-              </w:rPr>
-              <w:t xml:space="preserve"> </w:t>
-            </w:r>
-            <w:r>
-              <w:rPr>
-                <w:sz w:val="20"/>
-              </w:rPr>
-              <w:t xml:space="preserve">= captou, realizou</w:t>
-            </w:r>
-          </w:p>
-        </w:tc>
-        <w:tc>
-          <w:tcPr/>
-          <w:p>
-            <w:pPr>
-              <w:pStyle w:val="Compact"/>
-              <w:spacing w:after="0" w:before="0"/>
-              <w:jc w:val="left"/>
-            </w:pPr>
-            <w:r>
-              <w:rPr>
-                <w:sz w:val="20"/>
-              </w:rPr>
-              <w:t xml:space="preserve">Efeito local, se a designação do parecerista for como sorteio; senão, descritivo</w:t>
-            </w:r>
-          </w:p>
-        </w:tc>
-        <w:tc>
-          <w:tcPr/>
-          <w:p>
-            <w:pPr>
-              <w:pStyle w:val="Compact"/>
-              <w:spacing w:after="0" w:before="0"/>
-              <w:jc w:val="left"/>
-            </w:pPr>
-            <w:r>
-              <w:rPr>
-                <w:sz w:val="20"/>
-              </w:rPr>
-              <w:t xml:space="preserve">Sem nota não há corte; a designação por ordem e área é a variação candidata</w:t>
+              <w:t xml:space="preserve">= realizado em janela fixa após o protocolo; público</w:t>
+            </w:r>
+          </w:p>
+        </w:tc>
+        <w:tc>
+          <w:tcPr/>
+          <w:p>
+            <w:pPr>
+              <w:pStyle w:val="Compact"/>
+              <w:spacing w:after="0" w:before="0"/>
+              <w:jc w:val="left"/>
+            </w:pPr>
+            <w:r>
+              <w:rPr>
+                <w:sz w:val="20"/>
+              </w:rPr>
+              <w:t xml:space="preserve">Efeito de receber agora, na margem; fora dela, EMPT</w:t>
+            </w:r>
+          </w:p>
+        </w:tc>
+        <w:tc>
+          <w:tcPr/>
+          <w:p>
+            <w:pPr>
+              <w:pStyle w:val="Compact"/>
+              <w:spacing w:after="0" w:before="0"/>
+              <w:jc w:val="left"/>
+            </w:pPr>
+            <w:r>
+              <w:rPr>
+                <w:sz w:val="20"/>
+              </w:rPr>
+              <w:t xml:space="preserve">Os recusados realizam o projeto na mesma proporção que os validados</w:t>
             </w:r>
           </w:p>
         </w:tc>
@@ -3491,13 +3578,13 @@
       </w:r>
     </w:p>
     <w:bookmarkEnd w:id="25"/>
-    <w:bookmarkStart w:id="26" w:name="estratégias-de-identificação-candidatas"/>
+    <w:bookmarkStart w:id="26" w:name="estratégias-de-identificação"/>
     <w:p>
       <w:pPr>
         <w:pStyle w:val="Heading2"/>
       </w:pPr>
       <w:r>
-        <w:t xml:space="preserve">5.2 Estratégias de identificação candidatas</w:t>
+        <w:t xml:space="preserve">5.2 Estratégias de identificação</w:t>
       </w:r>
     </w:p>
     <w:p>
@@ -3518,7 +3605,7 @@
         <w:t xml:space="preserve">et al.</w:t>
       </w:r>
       <w:r>
-        <w:t xml:space="preserve">, 2018). Com excesso de demanda, ciclos anuais e nenhum índice publicado com ponto de corte, cabem promoção aleatória, experimento com decisores, variáveis instrumentais e diferenças em diferenças. O sorteio mudaria a regra de alocação e fica fora do escopo.</w:t>
+        <w:t xml:space="preserve">, 2018). Com excesso de demanda, ciclos anuais e nenhum índice publicado com ponto de corte, cabem experimentos de escolha, avaliação cega, promoção aleatória, regressão descontínua no tempo e variáveis instrumentais. O sorteio mudaria a regra de alocação e fica fora do escopo.</w:t>
       </w:r>
     </w:p>
     <w:p>
@@ -3534,13 +3621,13 @@
           <w:b/>
           <w:bCs/>
         </w:rPr>
-        <w:t xml:space="preserve">H5.</w:t>
-      </w:r>
-      <w:r>
-        <w:t xml:space="preserve"> </w:t>
-      </w:r>
-      <w:r>
-        <w:t xml:space="preserve">Os termos validados pouco antes do esgotamento do teto e os de 32 projetos recusados em 2023 e 2024 tinham, todos, patrocinador disposto. Mas 6 dos 11 recusados em 2023 e 12 dos 21 recusados em 2024 captaram no ano seguinte: com resultado datado (realização em janela fixa após o protocolo), a comparação estima o efeito de receber agora; para o de receber em algum momento, o indeferimento serve de instrumento, com primeiro estágio de 41% (13 dos 32 recusados não captaram depois). As duas leituras valem se a ordem de validação não se ligar ao projeto, o que as datas de protocolo permitem testar.</w:t>
+        <w:t xml:space="preserve">H1.</w:t>
+      </w:r>
+      <w:r>
+        <w:t xml:space="preserve"> </w:t>
+      </w:r>
+      <w:r>
+        <w:t xml:space="preserve">Um experimento conjunto separa marca e valor público: decisores de empresas contribuintes escolhem entre pares de perfis de projeto com atributos sorteados (escala, visibilidade, local, gratuidade, público estimado), e o sorteio identifica o efeito marginal médio de cada atributo sobre a escolha (HAINMUELLER; HOPKINS; YAMAMOTO, 2014). Os mesmos perfis vão a uma amostra de residentes do estado, e os grupos se comparam pelas médias marginais de escolha de cada atributo; aplicados aos projetos habilitados, os dois conjuntos de pesos indicam o que cada um financiaria, e a diferença, o bem público que a escolha privada deixa de fora.</w:t>
       </w:r>
     </w:p>
     <w:p>
@@ -3556,13 +3643,13 @@
           <w:b/>
           <w:bCs/>
         </w:rPr>
-        <w:t xml:space="preserve">H1.</w:t>
-      </w:r>
-      <w:r>
-        <w:t xml:space="preserve"> </w:t>
-      </w:r>
-      <w:r>
-        <w:t xml:space="preserve">Um experimento conjunto separa marca e valor público: decisores de empresas contribuintes escolhem entre pares de perfis de projeto com atributos sorteados (escala, visibilidade, local, gratuidade, público estimado), e o sorteio identifica o efeito marginal médio de cada atributo sobre a escolha (HAINMUELLER; HOPKINS; YAMAMOTO, 2014). É uma pergunta de mecanismo: aplicados aos habilitados, os pesos estimados indicam o que fica sem patrocínio (o pequeno, o gratuito, o do interior), a confrontar com H4 e H5.</w:t>
+        <w:t xml:space="preserve">H2.</w:t>
+      </w:r>
+      <w:r>
+        <w:t xml:space="preserve"> </w:t>
+      </w:r>
+      <w:r>
+        <w:t xml:space="preserve">Sem nota, não há corte para regressão descontínua. O teste, descritivo, é uma avaliação cega da regra de decisão: avaliadores independentes dão nota, nos critérios de interesse público do decreto, a uma amostra de inscritos, habilitados e inabilitados, sem saber o destino de cada projeto. Se a decisão segue critério público, a nota separa habilitados de inabilitados e, entre os habilitados, quem capta. A severidade do parecerista, designado por ordem de inscrição e área (SECULT, 2025c), seria instrumento para o efeito do parecer, como em Maestas, Mullen e Strand (2013), mas é fraca com 41 pareceristas e fica como extensão.</w:t>
       </w:r>
     </w:p>
     <w:p>
@@ -3578,26 +3665,13 @@
           <w:b/>
           <w:bCs/>
         </w:rPr>
-        <w:t xml:space="preserve">H4.</w:t>
-      </w:r>
-      <w:r>
-        <w:t xml:space="preserve"> </w:t>
-      </w:r>
-      <w:r>
-        <w:t xml:space="preserve">Uma promoção aleatória de apoio à inscrição e à busca de patrocínio, sorteada entre os 71 municípios do interior, não altera nenhuma regra de alocação; nos municípios sorteados, dois braços, sorteados entre os agentes, separam o atrito documental do de patrocínio. A promoção estima o efeito da oferta e, para quem responde a ela, o efeito local (ANGRIST; IMBENS; RUBIN, 1996). Como o teto é fixo, sortear também a intensidade da oferta mede o deslocamento de outros proponentes (BAIRD</w:t>
-      </w:r>
-      <w:r>
-        <w:t xml:space="preserve"> </w:t>
-      </w:r>
-      <w:r>
-        <w:rPr>
-          <w:i/>
-          <w:iCs/>
-        </w:rPr>
-        <w:t xml:space="preserve">et al.</w:t>
-      </w:r>
-      <w:r>
-        <w:t xml:space="preserve">, 2018), mas, com 71 municípios, só em caráter exploratório.</w:t>
+        <w:t xml:space="preserve">H3.</w:t>
+      </w:r>
+      <w:r>
+        <w:t xml:space="preserve"> </w:t>
+      </w:r>
+      <w:r>
+        <w:t xml:space="preserve">As planilhas de custos, pedidas pela Lei de Acesso à Informação (LAI), dão a parcela de captação e elaboração de cada projeto. Se as taxas se acumulam no teto de 10%, o preço é fixado pela regra, e não pelo custo do serviço; a regra de 2026, que permite pagá-las ao proponente, compara-se à de 2025 por diferenças em diferenças, entre projetos que contratavam captador e os demais.</w:t>
       </w:r>
     </w:p>
     <w:p>
@@ -3613,31 +3687,48 @@
           <w:b/>
           <w:bCs/>
         </w:rPr>
-        <w:t xml:space="preserve">H2.</w:t>
-      </w:r>
-      <w:r>
-        <w:t xml:space="preserve"> </w:t>
-      </w:r>
-      <w:r>
-        <w:t xml:space="preserve">Sem nota, não há corte para regressão descontínua, mas os projetos são distribuídos aos pareceristas por ordem de inscrição e área (SECULT, 2025c). Se essa designação se comportar como sorteio dentro de área e período, a severidade do parecerista (a parcela de pareceres favoráveis nos seus outros projetos) é instrumento para o parecer, como o examinador designado em Maestas, Mullen e Strand (2013), sob exclusão e monotonicidade testáveis e com o parecerista de cada inscrição obtido pela Lei de Acesso à Informação (LAI). Como são 41 pareceristas credenciados, de 4 a 20 por área, o instrumento por área é fraco, e o desenho fica exploratório, com áreas afins agrupadas.</w:t>
-      </w:r>
-    </w:p>
-    <w:p>
-      <w:pPr>
-        <w:pStyle w:val="FirstParagraph"/>
+        <w:t xml:space="preserve">H4.</w:t>
+      </w:r>
+      <w:r>
+        <w:t xml:space="preserve"> </w:t>
+      </w:r>
+      <w:r>
+        <w:t xml:space="preserve">Uma promoção aleatória de apoio à inscrição e à busca de patrocínio, sorteada entre os 71 municípios do interior, não altera nenhuma regra de alocação; nos municípios sorteados, dois braços, sorteados entre os agentes, separam o atrito documental do de patrocínio. A promoção estima o efeito da oferta e, para quem responde a ela, o efeito local (ANGRIST; IMBENS; RUBIN, 1996). Como o teto é fixo, sortear também a intensidade da oferta mede o deslocamento de outros proponentes (BAIRD</w:t>
+      </w:r>
+      <w:r>
+        <w:t xml:space="preserve"> </w:t>
+      </w:r>
+      <w:r>
+        <w:rPr>
+          <w:i/>
+          <w:iCs/>
+        </w:rPr>
+        <w:t xml:space="preserve">et al.</w:t>
+      </w:r>
+      <w:r>
+        <w:t xml:space="preserve">, 2018), mas, com 71 municípios, só em caráter exploratório.</w:t>
+      </w:r>
+    </w:p>
+    <w:p>
+      <w:pPr>
+        <w:pStyle w:val="Compact"/>
+        <w:numPr>
+          <w:ilvl w:val="0"/>
+          <w:numId w:val="1001"/>
+        </w:numPr>
       </w:pPr>
       <w:r>
         <w:rPr>
           <w:b/>
           <w:bCs/>
         </w:rPr>
-        <w:t xml:space="preserve">O que fica aberto.</w:t>
-      </w:r>
-      <w:r>
-        <w:t xml:space="preserve"> </w:t>
-      </w:r>
-      <w:r>
-        <w:t xml:space="preserve">Regressão descontínua no tempo (protocolo em torno do esgotamento de cada cota), variáveis instrumentais (recusa pelo teto; severidade do parecerista) e, para H3, diferenças em diferenças com as regras de custo de 2025 e 2026.</w:t>
+        <w:t xml:space="preserve">H5.</w:t>
+      </w:r>
+      <w:r>
+        <w:t xml:space="preserve"> </w:t>
+      </w:r>
+      <w:r>
+        <w:t xml:space="preserve">Os termos validados pouco antes do esgotamento do teto e os de 32 projetos recusados em 2023 e 2024 tinham, todos, patrocinador disposto. Mas 6 dos 11 recusados em 2023 e 12 dos 21 recusados em 2024 captaram no ano seguinte: com resultado datado, a comparação estima o efeito de receber agora; para o de receber em algum momento, o indeferimento serve de instrumento, com primeiro estágio de 41% (13 dos 32 recusados não captaram depois). Em 2024, das 47 recusas registradas nas versões sucessivas do anexo, 27 viraram validação em versão posterior, no ano em que o teto passou de R$ 15 para R$ 25 milhões: a comparação com as 20 que não viraram mede o efeito de receber mais tarde. Para decidir, o desenho precisa ser prospectivo: a SEFAZ registra a hora de protocolo e a recusa de cada termo, a SECULT padroniza no relatório de execução a realização e o público, e a comparação vira regressão descontínua no tempo em torno do esgotamento de cada cota, acumulada ano a ano. Como o momento do esgotamento não é conhecido de antemão, é difícil manipular a posição na fila, e a ordem de validação não deve se ligar ao projeto, o que as datas de protocolo permitem testar.</w:t>
       </w:r>
     </w:p>
     <w:bookmarkEnd w:id="26"/>
@@ -3655,7 +3746,7 @@
         <w:pStyle w:val="FirstParagraph"/>
       </w:pPr>
       <w:r>
-        <w:t xml:space="preserve">Para H5 e H2, trabalha-se com o universo, e a listagem vem dos anexos oficiais: 293 projetos habilitados em 2022-2024 com situação resolvida, de 172 proponentes, e os termos de 2023 e 2024 na margem do racionamento. Para H1, a população principal é quem decide o patrocínio (marketing, diretoria ou relações institucionais): a listagem parte das 26 patrocinadoras de 2025, e os maiores contribuintes fora do Simples Nacional, listados com a SEFAZ, formam uma extensão, com parâmetro possivelmente diferente. Para H4, a listagem é o cadastro de agentes do Mapa Cultural, em que 79% dos coletivos e 78% dos individuais não informam município; com município no interior, há 257 coletivos em 52 municípios e 2.389 agentes, somados os individuais, nos 71. A oferta é sorteada entre municípios do interior e chega a todos os agentes cadastrados sem inscrição anterior; quem não está no Mapa fica de fora, um viés de cobertura. A chave de ligação é o CNPJ do proponente: o Portal da Transparência o traz para quem captou (ESPÍRITO SANTO, 2026), e os avisos de habilitação no Diário Oficial, para a maior parte dos demais (DIO-ES, 2026); juntas, cobrem 385 dos 463 habilitados (83%), e o restante e os inabilitados ficam para a LAI (Quadro 4).</w:t>
+        <w:t xml:space="preserve">Para H5, a listagem são os termos de 2023 e 2024 na margem do racionamento e, no desenho prospectivo, todos os protocolados a partir de 2027. Para H2, o universo são os 293 projetos habilitados em 2022-2024 com situação resolvida, de 172 proponentes, e os 86 inabilitados das atas da CAP, de onde se sorteia a amostra da avaliação cega; para H3, as planilhas de 2025 e 2026. Para H1, a população principal é quem decide o patrocínio (marketing, diretoria ou relações institucionais): a listagem parte das 26 patrocinadoras de 2025, e os maiores contribuintes fora do Simples Nacional, listados com a SEFAZ, formam uma extensão; o braço da população é uma amostra de residentes por cotas de região. Para H4, a listagem é o cadastro de agentes do Mapa Cultural, em que 79% dos coletivos e 78% dos individuais não informam município; com município no interior, há 257 coletivos em 52 municípios e 2.389 agentes, somados os individuais, nos 71. A oferta é sorteada entre municípios do interior e chega a todos os agentes cadastrados sem inscrição anterior; quem não está no Mapa fica de fora, um viés de cobertura. O Mapa serve, assim, de retrato da demanda: agentes e eventos que nunca aparecem nos anexos da LICC são os projetos pequenos que a escolha concentrada não alcança. A chave de ligação é o CNPJ do proponente: o Portal da Transparência o traz para quem captou (ESPÍRITO SANTO, 2026), e os avisos de habilitação no Diário Oficial, para a maior parte dos demais (DIO-ES, 2026); juntas, cobrem 385 dos 463 habilitados (83%), e o restante e os inabilitados ficam para a LAI (Quadro 4).</w:t>
       </w:r>
     </w:p>
     <w:p>
@@ -4093,7 +4184,7 @@
               <w:rPr>
                 <w:sz w:val="20"/>
               </w:rPr>
-              <w:t xml:space="preserve">H5 (racionamento)</w:t>
+              <w:t xml:space="preserve">H5 (margem; desenho prospectivo)</w:t>
             </w:r>
           </w:p>
         </w:tc>
@@ -4127,6 +4218,72 @@
               <w:rPr>
                 <w:sz w:val="20"/>
               </w:rPr>
+              <w:t xml:space="preserve">Pesquisa própria</w:t>
+            </w:r>
+          </w:p>
+        </w:tc>
+        <w:tc>
+          <w:tcPr/>
+          <w:p>
+            <w:pPr>
+              <w:pStyle w:val="Compact"/>
+              <w:spacing w:after="0" w:before="0"/>
+              <w:jc w:val="left"/>
+            </w:pPr>
+            <w:r>
+              <w:rPr>
+                <w:sz w:val="20"/>
+              </w:rPr>
+              <w:t xml:space="preserve">Escolhas de decisores e residentes entre perfis de projeto; nota cega dos projetos inscritos</w:t>
+            </w:r>
+          </w:p>
+        </w:tc>
+        <w:tc>
+          <w:tcPr/>
+          <w:p>
+            <w:pPr>
+              <w:pStyle w:val="Compact"/>
+              <w:spacing w:after="0" w:before="0"/>
+              <w:jc w:val="left"/>
+            </w:pPr>
+            <w:r>
+              <w:rPr>
+                <w:sz w:val="20"/>
+              </w:rPr>
+              <w:t xml:space="preserve">H1, H2</w:t>
+            </w:r>
+          </w:p>
+        </w:tc>
+        <w:tc>
+          <w:tcPr/>
+          <w:p>
+            <w:pPr>
+              <w:pStyle w:val="Compact"/>
+              <w:spacing w:after="0" w:before="0"/>
+              <w:jc w:val="left"/>
+            </w:pPr>
+            <w:r>
+              <w:rPr>
+                <w:sz w:val="20"/>
+              </w:rPr>
+              <w:t xml:space="preserve">Coleta</w:t>
+            </w:r>
+          </w:p>
+        </w:tc>
+      </w:tr>
+      <w:tr>
+        <w:tc>
+          <w:tcPr/>
+          <w:p>
+            <w:pPr>
+              <w:pStyle w:val="Compact"/>
+              <w:spacing w:after="0" w:before="0"/>
+              <w:jc w:val="left"/>
+            </w:pPr>
+            <w:r>
+              <w:rPr>
+                <w:sz w:val="20"/>
+              </w:rPr>
               <w:t xml:space="preserve">Relatórios de execução</w:t>
             </w:r>
           </w:p>
@@ -4173,7 +4330,7 @@
               <w:rPr>
                 <w:sz w:val="20"/>
               </w:rPr>
-              <w:t xml:space="preserve">de H5</w:t>
+              <w:t xml:space="preserve">de H5 (a padronizar)</w:t>
             </w:r>
           </w:p>
         </w:tc>
@@ -4766,7 +4923,7 @@
         <w:rPr>
           <w:b w:val="0"/>
         </w:rPr>
-        <w:t xml:space="preserve"> – Efeito mínimo detectável por pergunta (pontos percentuais)</w:t>
+        <w:t xml:space="preserve"> – Efeito mínimo detectável por pergunta (pontos percentuais, salvo indicação)</w:t>
       </w:r>
     </w:p>
     <w:tbl>
@@ -4985,6 +5142,216 @@
               <w:rPr>
                 <w:sz w:val="20"/>
               </w:rPr>
+              <w:t xml:space="preserve">H1: diferença empresas − população</w:t>
+            </w:r>
+          </w:p>
+        </w:tc>
+        <w:tc>
+          <w:tcPr/>
+          <w:p>
+            <w:pPr>
+              <w:pStyle w:val="Compact"/>
+              <w:keepNext/>
+              <w:spacing w:after="0" w:before="0"/>
+              <w:jc w:val="left"/>
+            </w:pPr>
+            <w:r>
+              <w:rPr>
+                <w:sz w:val="20"/>
+              </w:rPr>
+              <w:t xml:space="preserve">e 500 residentes × 6 tarefas</w:t>
+            </w:r>
+          </w:p>
+        </w:tc>
+        <w:tc>
+          <w:tcPr/>
+          <w:p>
+            <w:pPr>
+              <w:pStyle w:val="Compact"/>
+              <w:keepNext/>
+              <w:spacing w:after="0" w:before="0"/>
+              <w:jc w:val="left"/>
+            </w:pPr>
+            <w:r>
+              <w:rPr>
+                <w:sz w:val="20"/>
+              </w:rPr>
+              <w:t xml:space="preserve">idem</w:t>
+            </w:r>
+          </w:p>
+        </w:tc>
+        <w:tc>
+          <w:tcPr/>
+          <w:p>
+            <w:pPr>
+              <w:pStyle w:val="Compact"/>
+              <w:keepNext/>
+              <w:spacing w:after="0" w:before="0"/>
+              <w:jc w:val="left"/>
+            </w:pPr>
+            <w:r>
+              <w:rPr>
+                <w:sz w:val="20"/>
+              </w:rPr>
+              <w:t xml:space="preserve">8,2 a 19,7</w:t>
+            </w:r>
+          </w:p>
+        </w:tc>
+      </w:tr>
+      <w:tr>
+        <w:tc>
+          <w:tcPr/>
+          <w:p>
+            <w:pPr>
+              <w:pStyle w:val="Compact"/>
+              <w:keepNext/>
+              <w:spacing w:after="0" w:before="0"/>
+              <w:jc w:val="left"/>
+            </w:pPr>
+            <w:r>
+              <w:rPr>
+                <w:sz w:val="20"/>
+              </w:rPr>
+              <w:t xml:space="preserve">H2: nota cega, habilitados × inabilitados</w:t>
+            </w:r>
+          </w:p>
+        </w:tc>
+        <w:tc>
+          <w:tcPr/>
+          <w:p>
+            <w:pPr>
+              <w:pStyle w:val="Compact"/>
+              <w:keepNext/>
+              <w:spacing w:after="0" w:before="0"/>
+              <w:jc w:val="left"/>
+            </w:pPr>
+            <w:r>
+              <w:rPr>
+                <w:sz w:val="20"/>
+              </w:rPr>
+              <w:t xml:space="preserve">86 × 86 projetos</w:t>
+            </w:r>
+          </w:p>
+        </w:tc>
+        <w:tc>
+          <w:tcPr/>
+          <w:p>
+            <w:pPr>
+              <w:pStyle w:val="Compact"/>
+              <w:keepNext/>
+              <w:spacing w:after="0" w:before="0"/>
+              <w:jc w:val="left"/>
+            </w:pPr>
+            <w:r>
+              <w:rPr>
+                <w:sz w:val="20"/>
+              </w:rPr>
+              <w:t xml:space="preserve">nota padronizada</w:t>
+            </w:r>
+          </w:p>
+        </w:tc>
+        <w:tc>
+          <w:tcPr/>
+          <w:p>
+            <w:pPr>
+              <w:pStyle w:val="Compact"/>
+              <w:keepNext/>
+              <w:spacing w:after="0" w:before="0"/>
+              <w:jc w:val="left"/>
+            </w:pPr>
+            <w:r>
+              <w:rPr>
+                <w:sz w:val="20"/>
+              </w:rPr>
+              <w:t xml:space="preserve">0,43 DP</w:t>
+            </w:r>
+          </w:p>
+        </w:tc>
+      </w:tr>
+      <w:tr>
+        <w:tc>
+          <w:tcPr/>
+          <w:p>
+            <w:pPr>
+              <w:pStyle w:val="Compact"/>
+              <w:keepNext/>
+              <w:spacing w:after="0" w:before="0"/>
+              <w:jc w:val="left"/>
+            </w:pPr>
+            <w:r>
+              <w:rPr>
+                <w:sz w:val="20"/>
+              </w:rPr>
+              <w:t xml:space="preserve">H2: nota cega, captou × não captou</w:t>
+            </w:r>
+          </w:p>
+        </w:tc>
+        <w:tc>
+          <w:tcPr/>
+          <w:p>
+            <w:pPr>
+              <w:pStyle w:val="Compact"/>
+              <w:keepNext/>
+              <w:spacing w:after="0" w:before="0"/>
+              <w:jc w:val="left"/>
+            </w:pPr>
+            <w:r>
+              <w:rPr>
+                <w:sz w:val="20"/>
+              </w:rPr>
+              <w:t xml:space="preserve">198 × 95 habilitados</w:t>
+            </w:r>
+          </w:p>
+        </w:tc>
+        <w:tc>
+          <w:tcPr/>
+          <w:p>
+            <w:pPr>
+              <w:pStyle w:val="Compact"/>
+              <w:keepNext/>
+              <w:spacing w:after="0" w:before="0"/>
+              <w:jc w:val="left"/>
+            </w:pPr>
+            <w:r>
+              <w:rPr>
+                <w:sz w:val="20"/>
+              </w:rPr>
+              <w:t xml:space="preserve">nota padronizada</w:t>
+            </w:r>
+          </w:p>
+        </w:tc>
+        <w:tc>
+          <w:tcPr/>
+          <w:p>
+            <w:pPr>
+              <w:pStyle w:val="Compact"/>
+              <w:keepNext/>
+              <w:spacing w:after="0" w:before="0"/>
+              <w:jc w:val="left"/>
+            </w:pPr>
+            <w:r>
+              <w:rPr>
+                <w:sz w:val="20"/>
+              </w:rPr>
+              <w:t xml:space="preserve">0,35 DP</w:t>
+            </w:r>
+          </w:p>
+        </w:tc>
+      </w:tr>
+      <w:tr>
+        <w:tc>
+          <w:tcPr/>
+          <w:p>
+            <w:pPr>
+              <w:pStyle w:val="Compact"/>
+              <w:keepNext/>
+              <w:spacing w:after="0" w:before="0"/>
+              <w:jc w:val="left"/>
+            </w:pPr>
+            <w:r>
+              <w:rPr>
+                <w:sz w:val="20"/>
+              </w:rPr>
               <w:t xml:space="preserve">H5: margem do racionamento, 2023-2024</w:t>
             </w:r>
           </w:p>
@@ -5519,7 +5886,7 @@
         <w:pStyle w:val="BodyText"/>
       </w:pPr>
       <w:r>
-        <w:t xml:space="preserve">A comparação na margem do racionamento só detecta efeitos muito grandes e serve como verificação de robustez; para o efeito de receber em algum momento, o EMD divide-se pelo primeiro estágio (0,41) e vai a 69 a 84 pontos. Com os recusados de 2025 e 2026 (LAI), se dobrarem a margem, o EMD de receber agora cai para 20 a 24 pontos. O experimento conjunto detecta diferenças de 7 a 13 pontos na probabilidade de escolha com 60 decisores, e de 10 a 19 com 30. O desenho de H4 detecta efeitos de poucos pontos se incluir os agentes individuais, que precisariam de CNPJ (MEI) para se inscrever, e só assim atende à regra de 30 a 50 conglomerados por grupo (GERTLER</w:t>
+        <w:t xml:space="preserve">A comparação na margem do racionamento só detecta efeitos muito grandes; para o efeito de receber em algum momento, o EMD divide-se pelo primeiro estágio (0,41) e vai a 69 a 84 pontos. Para detectar 15 pontos, o desenho prospectivo precisa de 112 a 168 recusados por braço: no ritmo de 2023 e 2024, de 11 a 21 projetos recusados por ano, são de 6 a 16 ciclos, e H5 só decide no longo prazo ou com esgotamentos mais frequentes. O experimento conjunto detecta diferenças de 7 a 13 pontos na probabilidade de escolha com 60 decisores, e de 10 a 19 com 30; o braço da população pouco acrescenta ao erro, e a diferença entre empresas e população fica entre 8 e 20 pontos. A avaliação cega detecta diferença de nota de 0,43 desvio-padrão (DP) entre habilitados e inabilitados. O desenho de H4 detecta efeitos de poucos pontos se incluir os agentes individuais, que precisariam de CNPJ (MEI) para se inscrever, e só assim atende à regra de 30 a 50 conglomerados por grupo (GERTLER</w:t>
       </w:r>
       <w:r>
         <w:t xml:space="preserve"> </w:t>
@@ -5562,7 +5929,7 @@
         <w:pStyle w:val="FirstParagraph"/>
       </w:pPr>
       <w:r>
-        <w:t xml:space="preserve">A primeira ameaça à validade interna é a violação da hipótese de ausência de interferência entre unidades (SUTVA): com o teto fixo, o que um projeto capta falta a outro. Seguem-se a substituição de fonte (a captação pela Lei Rouanet entra como resultado), os eventos externos do período (Lei Paulo Gustavo e Política Nacional Aldir Blanc) e o atrito dos dados. No experimento conjunto, a escolha declarada pode pender para o socialmente desejável; a escolha forçada entre perfis reduz o viés, e os patrocínios observados servem de validação. A validade externa é limitada: as comparações de H5 valem para o regime de 2022-2024, em que a habilitação precedia a busca por patrocinador, e desde 2025 os expirados quase desapareceram (3 em 56 resolvidos no ciclo 2025). No plano ético, nenhum desenho nega acesso a elegíveis: o apoio chega aos controles ao fim, e o deslocamento pelo teto é medido pela saturação. Dados identificados exigem anonimização (LGPD), e pesquisas com pessoas, aprovação de comitê de ética.</w:t>
+        <w:t xml:space="preserve">A primeira ameaça à validade interna é a violação da hipótese de ausência de interferência entre unidades (SUTVA): com o teto fixo, o que um projeto capta falta a outro. Seguem-se a substituição de fonte (a captação pela Lei Rouanet entra como resultado), os eventos externos do período (Lei Paulo Gustavo e Política Nacional Aldir Blanc) e o atrito dos dados. No experimento conjunto, a escolha declarada pode pender para o socialmente desejável; a escolha forçada entre perfis reduz o viés, e os patrocínios observados servem de validação. Na avaliação cega, dois avaliadores por projeto medem a confiabilidade da nota. A validade externa é limitada: as comparações retrospectivas de H5 valem para o regime de 2022-2024, em que a habilitação precedia a busca por patrocinador, e desde 2025 os expirados quase desapareceram (3 em 56 resolvidos no ciclo 2025). No plano ético, nenhum desenho nega acesso a elegíveis: o apoio chega aos controles ao fim, e o deslocamento pelo teto é medido pela saturação. Dados identificados exigem anonimização (LGPD), e pesquisas com pessoas, aprovação de comitê de ética.</w:t>
       </w:r>
     </w:p>
     <w:bookmarkEnd w:id="36"/>
@@ -5597,7 +5964,7 @@
         <w:pStyle w:val="BodyText"/>
       </w:pPr>
       <w:r>
-        <w:t xml:space="preserve">Das quatro perguntas, a da entrega (H5) é a mais importante e a mais difícil: mais da metade dos recusados por falta de teto captou no ano seguinte, e comparar quem recebe com quem não recebe exige resultado datado e a fila de termos com as datas. Se a adicionalidade na margem for baixa, ampliar o teto financia sobretudo o que ocorreria de todo modo, e as decisões que importam passam a ser quem entra e o que se entrega. Limitações dos dados: a situação publicada aproxima a captação, a estreia é medida por nome de proponente, e o retrato territorial cobre 74% do valor.</w:t>
+        <w:t xml:space="preserve">Das cinco perguntas, a da entrega (H5) é a mais importante e a mais difícil: mais da metade dos recusados por falta de teto captou no ano seguinte, e comparar quem recebe com quem não recebe exige resultado datado e a fila de termos com as datas. Se a adicionalidade na margem for baixa, ampliar o teto financia sobretudo o que ocorreria de todo modo, e as decisões que importam passam a ser quem entra e o que se entrega. Limitações dos dados: a situação publicada aproxima a captação, a estreia é medida por nome de proponente, e o retrato territorial cobre 74% do valor.</w:t>
       </w:r>
     </w:p>
     <w:bookmarkEnd w:id="38"/>

</xml_diff>